<commit_message>
V18.0: ratio-based candle classifier (Doji -> Pin Bar -> Marubozu -> Normal)
- Doji: body <= 20%, both shadows >= 20%, open/close within 30% of centre
- Pin Bar: body <= 35%, dominant shadow >= 45% and >= 2x body, opposite <= 35%;
  direction from the dominant shadow; 3-candle patterns need same colour AND
  same-direction pin
- Marubozu: body >= 70% and total shadows <= 30%; Normal: 35% <= body < 70%
- Big / Ref fall back to the last 5 Marubozus of any colour when the
  same-colour history is too short
- Optional 'Color Candles by Type'; docs and simulator replica updated

Co-Authored-By: Claude Opus 5.5 <noreply@anthropic.com>
Claude-Session: https://claude.ai/code/session_012ax4L7tKx6fogZS3qmV3Ae
</commit_message>
<xml_diff>
--- a/Code_Rules_As_Implemented_FA.docx
+++ b/Code_Rules_As_Implemented_FA.docx
@@ -16,7 +16,7 @@
           <w:szCs w:val="24"/>
           <w:rtl/>
         </w:rPr>
-        <w:t xml:space="preserve">SMC Follow Trend [Rohi] — نسخه‌ی V17.9</w:t>
+        <w:t xml:space="preserve">SMC Follow Trend [Rohi] — نسخه‌ی V18.0</w:t>
       </w:r>
     </w:p>
     <w:p>
@@ -358,7 +358,54 @@
           <w:szCs w:val="22"/>
           <w:rtl/>
         </w:rPr>
-        <w:t xml:space="preserve">همه‌ی الگوها از این چند تعریف ساخته می‌شوند. اگر یکی از این تعریف‌ها با منظور شما فرق دارد، همه‌ی الگوهای بعدی هم به تبع آن فرق می‌کنند؛ پس این بخش را با دقت بخوانید.</w:t>
+        <w:t xml:space="preserve">همه‌ی الگوها از این چند تعریف ساخته می‌شوند. از نسخه‌ی V18.0 هر تعریف </w:t>
+      </w:r>
+      <w:r>
+        <w:rPr>
+          <w:rFonts w:ascii="Tahoma" w:cs="Tahoma" w:hAnsi="Tahoma"/>
+          <w:b/>
+          <w:bCs/>
+          <w:sz w:val="22"/>
+          <w:szCs w:val="22"/>
+          <w:rtl/>
+        </w:rPr>
+        <w:t xml:space="preserve">نسبت یک جزء کندل به دامنه‌ی همان کندل</w:t>
+      </w:r>
+      <w:r>
+        <w:rPr>
+          <w:rFonts w:ascii="Tahoma" w:cs="Tahoma" w:hAnsi="Tahoma"/>
+          <w:sz w:val="22"/>
+          <w:szCs w:val="22"/>
+          <w:rtl/>
+        </w:rPr>
+        <w:t xml:space="preserve"> (High − Low) است، نه اندازه‌ی مطلق قیمت.</w:t>
+      </w:r>
+    </w:p>
+    <w:p>
+      <w:pPr>
+        <w:bidi/>
+        <w:spacing w:after="120" w:line="320"/>
+        <w:jc w:val="both"/>
+      </w:pPr>
+      <w:r>
+        <w:rPr>
+          <w:rFonts w:ascii="Tahoma" w:cs="Tahoma" w:hAnsi="Tahoma"/>
+          <w:b/>
+          <w:bCs/>
+          <w:sz w:val="22"/>
+          <w:szCs w:val="22"/>
+          <w:rtl/>
+        </w:rPr>
+        <w:t xml:space="preserve">ترتیب بررسی:</w:t>
+      </w:r>
+      <w:r>
+        <w:rPr>
+          <w:rFonts w:ascii="Tahoma" w:cs="Tahoma" w:hAnsi="Tahoma"/>
+          <w:sz w:val="22"/>
+          <w:szCs w:val="22"/>
+          <w:rtl/>
+        </w:rPr>
+        <w:t xml:space="preserve"> دوجی ← پین‌بار ← ماروبوزو ← نرمال. اگر کندلی هم‌زمان چند تعریف را داشته باشد، اولین نوع در این ترتیب برنده است. کندلی که High و Low آن برابر است هیچ نوعی ندارد.</w:t>
       </w:r>
     </w:p>
     <w:tbl>
@@ -414,7 +461,7 @@
                 <w:szCs w:val="20"/>
                 <w:rtl/>
               </w:rPr>
-              <w:t xml:space="preserve">مفهوم</w:t>
+              <w:t xml:space="preserve">نوع کندل</w:t>
             </w:r>
           </w:p>
         </w:tc>
@@ -450,7 +497,7 @@
                 <w:szCs w:val="20"/>
                 <w:rtl/>
               </w:rPr>
-              <w:t xml:space="preserve">تعریف دقیق در کد</w:t>
+              <w:t xml:space="preserve">شرط‌ها (همه با هم)</w:t>
             </w:r>
           </w:p>
         </w:tc>
@@ -489,7 +536,7 @@
                 <w:szCs w:val="20"/>
                 <w:rtl/>
               </w:rPr>
-              <w:t xml:space="preserve">کندل صعودی / نزولی</w:t>
+              <w:t xml:space="preserve">دوجی</w:t>
             </w:r>
           </w:p>
         </w:tc>
@@ -523,7 +570,7 @@
                 <w:szCs w:val="20"/>
                 <w:rtl/>
               </w:rPr>
-              <w:t xml:space="preserve">صعودی: Close بالاتر از Open. نزولی: Close پایین‌تر از Open. کندلی که Close و Open آن برابر است </w:t>
+              <w:t xml:space="preserve">بدنه </w:t>
             </w:r>
             <w:r>
               <w:rPr>
@@ -534,17 +581,114 @@
                 <w:szCs w:val="20"/>
                 <w:rtl/>
               </w:rPr>
-              <w:t xml:space="preserve">هیچ رنگی ندارد</w:t>
-            </w:r>
-            <w:r>
-              <w:rPr>
-                <w:rFonts w:ascii="Tahoma" w:cs="Tahoma" w:hAnsi="Tahoma"/>
-                <w:b w:val="false"/>
-                <w:sz w:val="20"/>
-                <w:szCs w:val="20"/>
-                <w:rtl/>
-              </w:rPr>
-              <w:t xml:space="preserve"> و در هیچ الگویی که رنگ کندل در آن مهم است شرکت نمی‌کند.</w:t>
+              <w:t xml:space="preserve">حداکثر ۲۰٪</w:t>
+            </w:r>
+            <w:r>
+              <w:rPr>
+                <w:rFonts w:ascii="Tahoma" w:cs="Tahoma" w:hAnsi="Tahoma"/>
+                <w:b w:val="false"/>
+                <w:sz w:val="20"/>
+                <w:szCs w:val="20"/>
+                <w:rtl/>
+              </w:rPr>
+              <w:t xml:space="preserve"> دامنه.</w:t>
+            </w:r>
+          </w:p>
+          <w:p>
+            <w:pPr>
+              <w:bidi/>
+              <w:spacing w:after="40" w:line="280"/>
+              <w:jc w:val="right"/>
+            </w:pPr>
+            <w:r>
+              <w:rPr>
+                <w:rFonts w:ascii="Tahoma" w:cs="Tahoma" w:hAnsi="Tahoma"/>
+                <w:b w:val="false"/>
+                <w:sz w:val="20"/>
+                <w:szCs w:val="20"/>
+                <w:rtl/>
+              </w:rPr>
+              <w:t xml:space="preserve">سایه‌ی بالا </w:t>
+            </w:r>
+            <w:r>
+              <w:rPr>
+                <w:rFonts w:ascii="Tahoma" w:cs="Tahoma" w:hAnsi="Tahoma"/>
+                <w:b/>
+                <w:bCs/>
+                <w:sz w:val="20"/>
+                <w:szCs w:val="20"/>
+                <w:rtl/>
+              </w:rPr>
+              <w:t xml:space="preserve">و</w:t>
+            </w:r>
+            <w:r>
+              <w:rPr>
+                <w:rFonts w:ascii="Tahoma" w:cs="Tahoma" w:hAnsi="Tahoma"/>
+                <w:b w:val="false"/>
+                <w:sz w:val="20"/>
+                <w:szCs w:val="20"/>
+                <w:rtl/>
+              </w:rPr>
+              <w:t xml:space="preserve"> سایه‌ی پایین هر کدام </w:t>
+            </w:r>
+            <w:r>
+              <w:rPr>
+                <w:rFonts w:ascii="Tahoma" w:cs="Tahoma" w:hAnsi="Tahoma"/>
+                <w:b/>
+                <w:bCs/>
+                <w:sz w:val="20"/>
+                <w:szCs w:val="20"/>
+                <w:rtl/>
+              </w:rPr>
+              <w:t xml:space="preserve">دست‌کم ۲۰٪</w:t>
+            </w:r>
+            <w:r>
+              <w:rPr>
+                <w:rFonts w:ascii="Tahoma" w:cs="Tahoma" w:hAnsi="Tahoma"/>
+                <w:b w:val="false"/>
+                <w:sz w:val="20"/>
+                <w:szCs w:val="20"/>
+                <w:rtl/>
+              </w:rPr>
+              <w:t xml:space="preserve"> دامنه.</w:t>
+            </w:r>
+          </w:p>
+          <w:p>
+            <w:pPr>
+              <w:bidi/>
+              <w:spacing w:after="40" w:line="280"/>
+              <w:jc w:val="right"/>
+            </w:pPr>
+            <w:r>
+              <w:rPr>
+                <w:rFonts w:ascii="Tahoma" w:cs="Tahoma" w:hAnsi="Tahoma"/>
+                <w:b w:val="false"/>
+                <w:sz w:val="20"/>
+                <w:szCs w:val="20"/>
+                <w:rtl/>
+              </w:rPr>
+              <w:t xml:space="preserve">Open و Close هر دو </w:t>
+            </w:r>
+            <w:r>
+              <w:rPr>
+                <w:rFonts w:ascii="Tahoma" w:cs="Tahoma" w:hAnsi="Tahoma"/>
+                <w:b/>
+                <w:bCs/>
+                <w:sz w:val="20"/>
+                <w:szCs w:val="20"/>
+                <w:rtl/>
+              </w:rPr>
+              <w:t xml:space="preserve">حداکثر ۳۰٪</w:t>
+            </w:r>
+            <w:r>
+              <w:rPr>
+                <w:rFonts w:ascii="Tahoma" w:cs="Tahoma" w:hAnsi="Tahoma"/>
+                <w:b w:val="false"/>
+                <w:sz w:val="20"/>
+                <w:szCs w:val="20"/>
+                <w:rtl/>
+              </w:rPr>
+              <w:t xml:space="preserve"> دامنه از وسط کندل فاصله داشته باشند.</w:t>
             </w:r>
           </w:p>
         </w:tc>
@@ -583,7 +727,7 @@
                 <w:szCs w:val="20"/>
                 <w:rtl/>
               </w:rPr>
-              <w:t xml:space="preserve">ماروبوزو</w:t>
+              <w:t xml:space="preserve">پین‌بار صعودی</w:t>
             </w:r>
           </w:p>
         </w:tc>
@@ -617,7 +761,7 @@
                 <w:szCs w:val="20"/>
                 <w:rtl/>
               </w:rPr>
-              <w:t xml:space="preserve">کندلی که بدنه‌اش </w:t>
+              <w:t xml:space="preserve">دوجی نباشد؛ بدنه </w:t>
             </w:r>
             <w:r>
               <w:rPr>
@@ -628,17 +772,135 @@
                 <w:szCs w:val="20"/>
                 <w:rtl/>
               </w:rPr>
-              <w:t xml:space="preserve">دست‌کم ۷۰٪</w:t>
-            </w:r>
-            <w:r>
-              <w:rPr>
-                <w:rFonts w:ascii="Tahoma" w:cs="Tahoma" w:hAnsi="Tahoma"/>
-                <w:b w:val="false"/>
-                <w:sz w:val="20"/>
-                <w:szCs w:val="20"/>
-                <w:rtl/>
-              </w:rPr>
-              <w:t xml:space="preserve"> طول کل کندل باشد.</w:t>
+              <w:t xml:space="preserve">حداکثر ۳۵٪</w:t>
+            </w:r>
+            <w:r>
+              <w:rPr>
+                <w:rFonts w:ascii="Tahoma" w:cs="Tahoma" w:hAnsi="Tahoma"/>
+                <w:b w:val="false"/>
+                <w:sz w:val="20"/>
+                <w:szCs w:val="20"/>
+                <w:rtl/>
+              </w:rPr>
+              <w:t xml:space="preserve">.</w:t>
+            </w:r>
+          </w:p>
+          <w:p>
+            <w:pPr>
+              <w:bidi/>
+              <w:spacing w:after="40" w:line="280"/>
+              <w:jc w:val="right"/>
+            </w:pPr>
+            <w:r>
+              <w:rPr>
+                <w:rFonts w:ascii="Tahoma" w:cs="Tahoma" w:hAnsi="Tahoma"/>
+                <w:b w:val="false"/>
+                <w:sz w:val="20"/>
+                <w:szCs w:val="20"/>
+                <w:rtl/>
+              </w:rPr>
+              <w:t xml:space="preserve">سایه‌ی </w:t>
+            </w:r>
+            <w:r>
+              <w:rPr>
+                <w:rFonts w:ascii="Tahoma" w:cs="Tahoma" w:hAnsi="Tahoma"/>
+                <w:b/>
+                <w:bCs/>
+                <w:sz w:val="20"/>
+                <w:szCs w:val="20"/>
+                <w:rtl/>
+              </w:rPr>
+              <w:t xml:space="preserve">پایین</w:t>
+            </w:r>
+            <w:r>
+              <w:rPr>
+                <w:rFonts w:ascii="Tahoma" w:cs="Tahoma" w:hAnsi="Tahoma"/>
+                <w:b w:val="false"/>
+                <w:sz w:val="20"/>
+                <w:szCs w:val="20"/>
+                <w:rtl/>
+              </w:rPr>
+              <w:t xml:space="preserve"> دست‌کم </w:t>
+            </w:r>
+            <w:r>
+              <w:rPr>
+                <w:rFonts w:ascii="Tahoma" w:cs="Tahoma" w:hAnsi="Tahoma"/>
+                <w:b/>
+                <w:bCs/>
+                <w:sz w:val="20"/>
+                <w:szCs w:val="20"/>
+                <w:rtl/>
+              </w:rPr>
+              <w:t xml:space="preserve">۴۵٪</w:t>
+            </w:r>
+            <w:r>
+              <w:rPr>
+                <w:rFonts w:ascii="Tahoma" w:cs="Tahoma" w:hAnsi="Tahoma"/>
+                <w:b w:val="false"/>
+                <w:sz w:val="20"/>
+                <w:szCs w:val="20"/>
+                <w:rtl/>
+              </w:rPr>
+              <w:t xml:space="preserve"> دامنه و دست‌کم </w:t>
+            </w:r>
+            <w:r>
+              <w:rPr>
+                <w:rFonts w:ascii="Tahoma" w:cs="Tahoma" w:hAnsi="Tahoma"/>
+                <w:b/>
+                <w:bCs/>
+                <w:sz w:val="20"/>
+                <w:szCs w:val="20"/>
+                <w:rtl/>
+              </w:rPr>
+              <w:t xml:space="preserve">۲ برابر بدنه</w:t>
+            </w:r>
+            <w:r>
+              <w:rPr>
+                <w:rFonts w:ascii="Tahoma" w:cs="Tahoma" w:hAnsi="Tahoma"/>
+                <w:b w:val="false"/>
+                <w:sz w:val="20"/>
+                <w:szCs w:val="20"/>
+                <w:rtl/>
+              </w:rPr>
+              <w:t xml:space="preserve">.</w:t>
+            </w:r>
+          </w:p>
+          <w:p>
+            <w:pPr>
+              <w:bidi/>
+              <w:spacing w:after="40" w:line="280"/>
+              <w:jc w:val="right"/>
+            </w:pPr>
+            <w:r>
+              <w:rPr>
+                <w:rFonts w:ascii="Tahoma" w:cs="Tahoma" w:hAnsi="Tahoma"/>
+                <w:b w:val="false"/>
+                <w:sz w:val="20"/>
+                <w:szCs w:val="20"/>
+                <w:rtl/>
+              </w:rPr>
+              <w:t xml:space="preserve">سایه‌ی بالا </w:t>
+            </w:r>
+            <w:r>
+              <w:rPr>
+                <w:rFonts w:ascii="Tahoma" w:cs="Tahoma" w:hAnsi="Tahoma"/>
+                <w:b/>
+                <w:bCs/>
+                <w:sz w:val="20"/>
+                <w:szCs w:val="20"/>
+                <w:rtl/>
+              </w:rPr>
+              <w:t xml:space="preserve">حداکثر ۳۵٪</w:t>
+            </w:r>
+            <w:r>
+              <w:rPr>
+                <w:rFonts w:ascii="Tahoma" w:cs="Tahoma" w:hAnsi="Tahoma"/>
+                <w:b w:val="false"/>
+                <w:sz w:val="20"/>
+                <w:szCs w:val="20"/>
+                <w:rtl/>
+              </w:rPr>
+              <w:t xml:space="preserve">.</w:t>
             </w:r>
           </w:p>
         </w:tc>
@@ -677,7 +939,7 @@
                 <w:szCs w:val="20"/>
                 <w:rtl/>
               </w:rPr>
-              <w:t xml:space="preserve">ماروبوزوی بزرگ (Big)</w:t>
+              <w:t xml:space="preserve">پین‌بار نزولی</w:t>
             </w:r>
           </w:p>
         </w:tc>
@@ -711,7 +973,7 @@
                 <w:szCs w:val="20"/>
                 <w:rtl/>
               </w:rPr>
-              <w:t xml:space="preserve">ماروبوزویی که طولش از </w:t>
+              <w:t xml:space="preserve">قرینه‌ی پین‌بار صعودی: سایه‌ی </w:t>
             </w:r>
             <w:r>
               <w:rPr>
@@ -722,55 +984,17 @@
                 <w:szCs w:val="20"/>
                 <w:rtl/>
               </w:rPr>
-              <w:t xml:space="preserve">دست‌کم ۳ تا</w:t>
-            </w:r>
-            <w:r>
-              <w:rPr>
-                <w:rFonts w:ascii="Tahoma" w:cs="Tahoma" w:hAnsi="Tahoma"/>
-                <w:b w:val="false"/>
-                <w:sz w:val="20"/>
-                <w:szCs w:val="20"/>
-                <w:rtl/>
-              </w:rPr>
-              <w:t xml:space="preserve"> از </w:t>
-            </w:r>
-            <w:r>
-              <w:rPr>
-                <w:rFonts w:ascii="Tahoma" w:cs="Tahoma" w:hAnsi="Tahoma"/>
-                <w:b/>
-                <w:bCs/>
-                <w:sz w:val="20"/>
-                <w:szCs w:val="20"/>
-                <w:rtl/>
-              </w:rPr>
-              <w:t xml:space="preserve">۵ ماروبوزوی هم‌رنگِ قبلی</w:t>
-            </w:r>
-            <w:r>
-              <w:rPr>
-                <w:rFonts w:ascii="Tahoma" w:cs="Tahoma" w:hAnsi="Tahoma"/>
-                <w:b w:val="false"/>
-                <w:sz w:val="20"/>
-                <w:szCs w:val="20"/>
-                <w:rtl/>
-              </w:rPr>
-              <w:t xml:space="preserve"> بیشتر باشد.</w:t>
-            </w:r>
-          </w:p>
-          <w:p>
-            <w:pPr>
-              <w:bidi/>
-              <w:spacing w:after="40" w:line="280"/>
-              <w:jc w:val="right"/>
-            </w:pPr>
-            <w:r>
-              <w:rPr>
-                <w:rFonts w:ascii="Tahoma" w:cs="Tahoma" w:hAnsi="Tahoma"/>
-                <w:b w:val="false"/>
-                <w:sz w:val="20"/>
-                <w:szCs w:val="20"/>
-                <w:rtl/>
-              </w:rPr>
-              <w:t xml:space="preserve">اگر هنوز ۳ ماروبوزوی هم‌رنگ قبلی روی چارت نباشد، هیچ کندلی Big حساب نمی‌شود.</w:t>
+              <w:t xml:space="preserve">بالا</w:t>
+            </w:r>
+            <w:r>
+              <w:rPr>
+                <w:rFonts w:ascii="Tahoma" w:cs="Tahoma" w:hAnsi="Tahoma"/>
+                <w:b w:val="false"/>
+                <w:sz w:val="20"/>
+                <w:szCs w:val="20"/>
+                <w:rtl/>
+              </w:rPr>
+              <w:t xml:space="preserve"> غالب (دست‌کم ۴۵٪ و ۲ برابر بدنه)، سایه‌ی پایین حداکثر ۳۵٪.</w:t>
             </w:r>
           </w:p>
         </w:tc>
@@ -809,7 +1033,7 @@
                 <w:szCs w:val="20"/>
                 <w:rtl/>
               </w:rPr>
-              <w:t xml:space="preserve">Ref (کندل مرجع اندازه)</w:t>
+              <w:t xml:space="preserve">ماروبوزو</w:t>
             </w:r>
           </w:p>
         </w:tc>
@@ -843,7 +1067,7 @@
                 <w:szCs w:val="20"/>
                 <w:rtl/>
               </w:rPr>
-              <w:t xml:space="preserve">فقط در الگوهای سه‌کندلی استفاده می‌شود: </w:t>
+              <w:t xml:space="preserve">دوجی و پین‌بار نباشد؛ بدنه </w:t>
             </w:r>
             <w:r>
               <w:rPr>
@@ -854,17 +1078,17 @@
                 <w:szCs w:val="20"/>
                 <w:rtl/>
               </w:rPr>
-              <w:t xml:space="preserve">بلندترین</w:t>
-            </w:r>
-            <w:r>
-              <w:rPr>
-                <w:rFonts w:ascii="Tahoma" w:cs="Tahoma" w:hAnsi="Tahoma"/>
-                <w:b w:val="false"/>
-                <w:sz w:val="20"/>
-                <w:szCs w:val="20"/>
-                <w:rtl/>
-              </w:rPr>
-              <w:t xml:space="preserve"> کندل در بین </w:t>
+              <w:t xml:space="preserve">دست‌کم ۷۰٪</w:t>
+            </w:r>
+            <w:r>
+              <w:rPr>
+                <w:rFonts w:ascii="Tahoma" w:cs="Tahoma" w:hAnsi="Tahoma"/>
+                <w:b w:val="false"/>
+                <w:sz w:val="20"/>
+                <w:szCs w:val="20"/>
+                <w:rtl/>
+              </w:rPr>
+              <w:t xml:space="preserve">؛ مجموع دو سایه </w:t>
             </w:r>
             <w:r>
               <w:rPr>
@@ -875,7 +1099,7 @@
                 <w:szCs w:val="20"/>
                 <w:rtl/>
               </w:rPr>
-              <w:t xml:space="preserve">۵ ماروبوزوی هم‌رنگِ قبل از C1</w:t>
+              <w:t xml:space="preserve">حداکثر ۳۰٪</w:t>
             </w:r>
             <w:r>
               <w:rPr>
@@ -886,23 +1110,6 @@
                 <w:rtl/>
               </w:rPr>
               <w:t xml:space="preserve">.</w:t>
-            </w:r>
-          </w:p>
-          <w:p>
-            <w:pPr>
-              <w:bidi/>
-              <w:spacing w:after="40" w:line="280"/>
-              <w:jc w:val="right"/>
-            </w:pPr>
-            <w:r>
-              <w:rPr>
-                <w:rFonts w:ascii="Tahoma" w:cs="Tahoma" w:hAnsi="Tahoma"/>
-                <w:b w:val="false"/>
-                <w:sz w:val="20"/>
-                <w:szCs w:val="20"/>
-                <w:rtl/>
-              </w:rPr>
-              <w:t xml:space="preserve">اگر قبلاً هیچ ماروبوزوی هم‌رنگی نبوده، Ref وجود ندارد و الگوی سه‌کندلی شکل نمی‌گیرد.</w:t>
             </w:r>
           </w:p>
         </w:tc>
@@ -941,7 +1148,7 @@
                 <w:szCs w:val="20"/>
                 <w:rtl/>
               </w:rPr>
-              <w:t xml:space="preserve">پین‌بار</w:t>
+              <w:t xml:space="preserve">نرمال</w:t>
             </w:r>
           </w:p>
         </w:tc>
@@ -975,7 +1182,7 @@
                 <w:szCs w:val="20"/>
                 <w:rtl/>
               </w:rPr>
-              <w:t xml:space="preserve">بدنه بزرگ‌تر از یک تیک باشد، </w:t>
+              <w:t xml:space="preserve">هیچ‌کدام از بالا نباشد؛ بدنه </w:t>
             </w:r>
             <w:r>
               <w:rPr>
@@ -986,17 +1193,17 @@
                 <w:szCs w:val="20"/>
                 <w:rtl/>
               </w:rPr>
-              <w:t xml:space="preserve">بلندترین سایه دست‌کم ۲ برابر بدنه</w:t>
-            </w:r>
-            <w:r>
-              <w:rPr>
-                <w:rFonts w:ascii="Tahoma" w:cs="Tahoma" w:hAnsi="Tahoma"/>
-                <w:b w:val="false"/>
-                <w:sz w:val="20"/>
-                <w:szCs w:val="20"/>
-                <w:rtl/>
-              </w:rPr>
-              <w:t xml:space="preserve"> باشد و از سایه‌ی دیگر هم بلندتر باشد.</w:t>
+              <w:t xml:space="preserve">از ۳۵٪ تا کمتر از ۷۰٪</w:t>
+            </w:r>
+            <w:r>
+              <w:rPr>
+                <w:rFonts w:ascii="Tahoma" w:cs="Tahoma" w:hAnsi="Tahoma"/>
+                <w:b w:val="false"/>
+                <w:sz w:val="20"/>
+                <w:szCs w:val="20"/>
+                <w:rtl/>
+              </w:rPr>
+              <w:t xml:space="preserve">.</w:t>
             </w:r>
           </w:p>
         </w:tc>
@@ -1035,7 +1242,7 @@
                 <w:szCs w:val="20"/>
                 <w:rtl/>
               </w:rPr>
-              <w:t xml:space="preserve">کندل نرمال</w:t>
+              <w:t xml:space="preserve">رنگ کندل</w:t>
             </w:r>
           </w:p>
         </w:tc>
@@ -1069,7 +1276,7 @@
                 <w:szCs w:val="20"/>
                 <w:rtl/>
               </w:rPr>
-              <w:t xml:space="preserve">بدنه </w:t>
+              <w:t xml:space="preserve">صعودی: Close بالاتر از Open. نزولی: Close پایین‌تر از Open. کندلی که Close و Open آن برابر است </w:t>
             </w:r>
             <w:r>
               <w:rPr>
@@ -1080,22 +1287,503 @@
                 <w:szCs w:val="20"/>
                 <w:rtl/>
               </w:rPr>
-              <w:t xml:space="preserve">بین ۵۰٪ و ۷۰٪</w:t>
-            </w:r>
-            <w:r>
-              <w:rPr>
-                <w:rFonts w:ascii="Tahoma" w:cs="Tahoma" w:hAnsi="Tahoma"/>
-                <w:b w:val="false"/>
-                <w:sz w:val="20"/>
-                <w:szCs w:val="20"/>
-                <w:rtl/>
-              </w:rPr>
-              <w:t xml:space="preserve"> طول کل کندل (فقط در الگوی ج).</w:t>
+              <w:t xml:space="preserve">رنگ ندارد</w:t>
+            </w:r>
+            <w:r>
+              <w:rPr>
+                <w:rFonts w:ascii="Tahoma" w:cs="Tahoma" w:hAnsi="Tahoma"/>
+                <w:b w:val="false"/>
+                <w:sz w:val="20"/>
+                <w:szCs w:val="20"/>
+                <w:rtl/>
+              </w:rPr>
+              <w:t xml:space="preserve"> و در هیچ الگوی رنگ‌دار شرکت نمی‌کند.</w:t>
+            </w:r>
+          </w:p>
+        </w:tc>
+      </w:tr>
+      <w:tr>
+        <w:trPr>
+          <w:tblHeader w:val="off"/>
+        </w:trPr>
+        <w:tc>
+          <w:tcPr>
+            <w:tcW w:type="dxa" w:w="2200"/>
+            <w:tcBorders>
+              <w:top w:val="single" w:color="A6A6A6" w:sz="4"/>
+              <w:left w:val="single" w:color="A6A6A6" w:sz="4"/>
+              <w:bottom w:val="single" w:color="A6A6A6" w:sz="4"/>
+              <w:right w:val="single" w:color="A6A6A6" w:sz="4"/>
+            </w:tcBorders>
+            <w:tcMar>
+              <w:top w:type="dxa" w:w="60"/>
+              <w:left w:type="dxa" w:w="100"/>
+              <w:bottom w:type="dxa" w:w="60"/>
+              <w:right w:type="dxa" w:w="100"/>
+            </w:tcMar>
+          </w:tcPr>
+          <w:p>
+            <w:pPr>
+              <w:bidi/>
+              <w:spacing w:after="40" w:line="280"/>
+              <w:jc w:val="right"/>
+            </w:pPr>
+            <w:r>
+              <w:rPr>
+                <w:rFonts w:ascii="Tahoma" w:cs="Tahoma" w:hAnsi="Tahoma"/>
+                <w:b w:val="false"/>
+                <w:sz w:val="20"/>
+                <w:szCs w:val="20"/>
+                <w:rtl/>
+              </w:rPr>
+              <w:t xml:space="preserve">ماروبوزوی بزرگ (Big)</w:t>
+            </w:r>
+          </w:p>
+        </w:tc>
+        <w:tc>
+          <w:tcPr>
+            <w:tcW w:type="dxa" w:w="6826"/>
+            <w:tcBorders>
+              <w:top w:val="single" w:color="A6A6A6" w:sz="4"/>
+              <w:left w:val="single" w:color="A6A6A6" w:sz="4"/>
+              <w:bottom w:val="single" w:color="A6A6A6" w:sz="4"/>
+              <w:right w:val="single" w:color="A6A6A6" w:sz="4"/>
+            </w:tcBorders>
+            <w:tcMar>
+              <w:top w:type="dxa" w:w="60"/>
+              <w:left w:type="dxa" w:w="100"/>
+              <w:bottom w:type="dxa" w:w="60"/>
+              <w:right w:type="dxa" w:w="100"/>
+            </w:tcMar>
+          </w:tcPr>
+          <w:p>
+            <w:pPr>
+              <w:bidi/>
+              <w:spacing w:after="40" w:line="280"/>
+              <w:jc w:val="right"/>
+            </w:pPr>
+            <w:r>
+              <w:rPr>
+                <w:rFonts w:ascii="Tahoma" w:cs="Tahoma" w:hAnsi="Tahoma"/>
+                <w:b w:val="false"/>
+                <w:sz w:val="20"/>
+                <w:szCs w:val="20"/>
+                <w:rtl/>
+              </w:rPr>
+              <w:t xml:space="preserve">ماروبوزویی که طولش از </w:t>
+            </w:r>
+            <w:r>
+              <w:rPr>
+                <w:rFonts w:ascii="Tahoma" w:cs="Tahoma" w:hAnsi="Tahoma"/>
+                <w:b/>
+                <w:bCs/>
+                <w:sz w:val="20"/>
+                <w:szCs w:val="20"/>
+                <w:rtl/>
+              </w:rPr>
+              <w:t xml:space="preserve">دست‌کم ۳ تا</w:t>
+            </w:r>
+            <w:r>
+              <w:rPr>
+                <w:rFonts w:ascii="Tahoma" w:cs="Tahoma" w:hAnsi="Tahoma"/>
+                <w:b w:val="false"/>
+                <w:sz w:val="20"/>
+                <w:szCs w:val="20"/>
+                <w:rtl/>
+              </w:rPr>
+              <w:t xml:space="preserve"> از </w:t>
+            </w:r>
+            <w:r>
+              <w:rPr>
+                <w:rFonts w:ascii="Tahoma" w:cs="Tahoma" w:hAnsi="Tahoma"/>
+                <w:b/>
+                <w:bCs/>
+                <w:sz w:val="20"/>
+                <w:szCs w:val="20"/>
+                <w:rtl/>
+              </w:rPr>
+              <w:t xml:space="preserve">۵ ماروبوزوی هم‌رنگِ قبلی</w:t>
+            </w:r>
+            <w:r>
+              <w:rPr>
+                <w:rFonts w:ascii="Tahoma" w:cs="Tahoma" w:hAnsi="Tahoma"/>
+                <w:b w:val="false"/>
+                <w:sz w:val="20"/>
+                <w:szCs w:val="20"/>
+                <w:rtl/>
+              </w:rPr>
+              <w:t xml:space="preserve"> بیشتر باشد.</w:t>
+            </w:r>
+          </w:p>
+          <w:p>
+            <w:pPr>
+              <w:bidi/>
+              <w:spacing w:after="40" w:line="280"/>
+              <w:jc w:val="right"/>
+            </w:pPr>
+            <w:r>
+              <w:rPr>
+                <w:rFonts w:ascii="Tahoma" w:cs="Tahoma" w:hAnsi="Tahoma"/>
+                <w:b w:val="false"/>
+                <w:sz w:val="20"/>
+                <w:szCs w:val="20"/>
+                <w:rtl/>
+              </w:rPr>
+              <w:t xml:space="preserve">اگر هنوز ۳ ماروبوزوی هم‌رنگ قبلی نباشد، با </w:t>
+            </w:r>
+            <w:r>
+              <w:rPr>
+                <w:rFonts w:ascii="Tahoma" w:cs="Tahoma" w:hAnsi="Tahoma"/>
+                <w:b/>
+                <w:bCs/>
+                <w:sz w:val="20"/>
+                <w:szCs w:val="20"/>
+                <w:rtl/>
+              </w:rPr>
+              <w:t xml:space="preserve">۵ ماروبوزوی آخر از هر رنگی</w:t>
+            </w:r>
+            <w:r>
+              <w:rPr>
+                <w:rFonts w:ascii="Tahoma" w:cs="Tahoma" w:hAnsi="Tahoma"/>
+                <w:b w:val="false"/>
+                <w:sz w:val="20"/>
+                <w:szCs w:val="20"/>
+                <w:rtl/>
+              </w:rPr>
+              <w:t xml:space="preserve"> مقایسه می‌شود.</w:t>
+            </w:r>
+          </w:p>
+        </w:tc>
+      </w:tr>
+      <w:tr>
+        <w:trPr>
+          <w:tblHeader w:val="off"/>
+        </w:trPr>
+        <w:tc>
+          <w:tcPr>
+            <w:tcW w:type="dxa" w:w="2200"/>
+            <w:tcBorders>
+              <w:top w:val="single" w:color="A6A6A6" w:sz="4"/>
+              <w:left w:val="single" w:color="A6A6A6" w:sz="4"/>
+              <w:bottom w:val="single" w:color="A6A6A6" w:sz="4"/>
+              <w:right w:val="single" w:color="A6A6A6" w:sz="4"/>
+            </w:tcBorders>
+            <w:tcMar>
+              <w:top w:type="dxa" w:w="60"/>
+              <w:left w:type="dxa" w:w="100"/>
+              <w:bottom w:type="dxa" w:w="60"/>
+              <w:right w:type="dxa" w:w="100"/>
+            </w:tcMar>
+          </w:tcPr>
+          <w:p>
+            <w:pPr>
+              <w:bidi/>
+              <w:spacing w:after="40" w:line="280"/>
+              <w:jc w:val="right"/>
+            </w:pPr>
+            <w:r>
+              <w:rPr>
+                <w:rFonts w:ascii="Tahoma" w:cs="Tahoma" w:hAnsi="Tahoma"/>
+                <w:b w:val="false"/>
+                <w:sz w:val="20"/>
+                <w:szCs w:val="20"/>
+                <w:rtl/>
+              </w:rPr>
+              <w:t xml:space="preserve">Ref (کندل مرجع اندازه)</w:t>
+            </w:r>
+          </w:p>
+        </w:tc>
+        <w:tc>
+          <w:tcPr>
+            <w:tcW w:type="dxa" w:w="6826"/>
+            <w:tcBorders>
+              <w:top w:val="single" w:color="A6A6A6" w:sz="4"/>
+              <w:left w:val="single" w:color="A6A6A6" w:sz="4"/>
+              <w:bottom w:val="single" w:color="A6A6A6" w:sz="4"/>
+              <w:right w:val="single" w:color="A6A6A6" w:sz="4"/>
+            </w:tcBorders>
+            <w:tcMar>
+              <w:top w:type="dxa" w:w="60"/>
+              <w:left w:type="dxa" w:w="100"/>
+              <w:bottom w:type="dxa" w:w="60"/>
+              <w:right w:type="dxa" w:w="100"/>
+            </w:tcMar>
+          </w:tcPr>
+          <w:p>
+            <w:pPr>
+              <w:bidi/>
+              <w:spacing w:after="40" w:line="280"/>
+              <w:jc w:val="right"/>
+            </w:pPr>
+            <w:r>
+              <w:rPr>
+                <w:rFonts w:ascii="Tahoma" w:cs="Tahoma" w:hAnsi="Tahoma"/>
+                <w:b w:val="false"/>
+                <w:sz w:val="20"/>
+                <w:szCs w:val="20"/>
+                <w:rtl/>
+              </w:rPr>
+              <w:t xml:space="preserve">فقط در الگوهای سه‌کندلی: </w:t>
+            </w:r>
+            <w:r>
+              <w:rPr>
+                <w:rFonts w:ascii="Tahoma" w:cs="Tahoma" w:hAnsi="Tahoma"/>
+                <w:b/>
+                <w:bCs/>
+                <w:sz w:val="20"/>
+                <w:szCs w:val="20"/>
+                <w:rtl/>
+              </w:rPr>
+              <w:t xml:space="preserve">بلندترین</w:t>
+            </w:r>
+            <w:r>
+              <w:rPr>
+                <w:rFonts w:ascii="Tahoma" w:cs="Tahoma" w:hAnsi="Tahoma"/>
+                <w:b w:val="false"/>
+                <w:sz w:val="20"/>
+                <w:szCs w:val="20"/>
+                <w:rtl/>
+              </w:rPr>
+              <w:t xml:space="preserve"> کندل در بین </w:t>
+            </w:r>
+            <w:r>
+              <w:rPr>
+                <w:rFonts w:ascii="Tahoma" w:cs="Tahoma" w:hAnsi="Tahoma"/>
+                <w:b/>
+                <w:bCs/>
+                <w:sz w:val="20"/>
+                <w:szCs w:val="20"/>
+                <w:rtl/>
+              </w:rPr>
+              <w:t xml:space="preserve">۵ ماروبوزوی هم‌رنگِ قبل از C1</w:t>
+            </w:r>
+            <w:r>
+              <w:rPr>
+                <w:rFonts w:ascii="Tahoma" w:cs="Tahoma" w:hAnsi="Tahoma"/>
+                <w:b w:val="false"/>
+                <w:sz w:val="20"/>
+                <w:szCs w:val="20"/>
+                <w:rtl/>
+              </w:rPr>
+              <w:t xml:space="preserve">.</w:t>
+            </w:r>
+          </w:p>
+          <w:p>
+            <w:pPr>
+              <w:bidi/>
+              <w:spacing w:after="40" w:line="280"/>
+              <w:jc w:val="right"/>
+            </w:pPr>
+            <w:r>
+              <w:rPr>
+                <w:rFonts w:ascii="Tahoma" w:cs="Tahoma" w:hAnsi="Tahoma"/>
+                <w:b w:val="false"/>
+                <w:sz w:val="20"/>
+                <w:szCs w:val="20"/>
+                <w:rtl/>
+              </w:rPr>
+              <w:t xml:space="preserve">اگر قبلاً هیچ ماروبوزوی هم‌رنگی نبوده، بلندترین کندل از </w:t>
+            </w:r>
+            <w:r>
+              <w:rPr>
+                <w:rFonts w:ascii="Tahoma" w:cs="Tahoma" w:hAnsi="Tahoma"/>
+                <w:b/>
+                <w:bCs/>
+                <w:sz w:val="20"/>
+                <w:szCs w:val="20"/>
+                <w:rtl/>
+              </w:rPr>
+              <w:t xml:space="preserve">۵ ماروبوزوی آخر از هر رنگی</w:t>
+            </w:r>
+            <w:r>
+              <w:rPr>
+                <w:rFonts w:ascii="Tahoma" w:cs="Tahoma" w:hAnsi="Tahoma"/>
+                <w:b w:val="false"/>
+                <w:sz w:val="20"/>
+                <w:szCs w:val="20"/>
+                <w:rtl/>
+              </w:rPr>
+              <w:t xml:space="preserve">.</w:t>
             </w:r>
           </w:p>
         </w:tc>
       </w:tr>
     </w:tbl>
+    <w:p>
+      <w:pPr>
+        <w:pStyle w:val="ListParagraph"/>
+        <w:numPr>
+          <w:ilvl w:val="0"/>
+          <w:numId w:val="2"/>
+        </w:numPr>
+        <w:bidi/>
+        <w:spacing w:after="80" w:line="300"/>
+        <w:jc w:val="both"/>
+      </w:pPr>
+      <w:r>
+        <w:rPr>
+          <w:rFonts w:ascii="Tahoma" w:cs="Tahoma" w:hAnsi="Tahoma"/>
+          <w:b/>
+          <w:bCs/>
+          <w:sz w:val="22"/>
+          <w:szCs w:val="22"/>
+          <w:rtl/>
+        </w:rPr>
+        <w:t xml:space="preserve">جهت پین‌بار</w:t>
+      </w:r>
+      <w:r>
+        <w:rPr>
+          <w:rFonts w:ascii="Tahoma" w:cs="Tahoma" w:hAnsi="Tahoma"/>
+          <w:sz w:val="22"/>
+          <w:szCs w:val="22"/>
+          <w:rtl/>
+        </w:rPr>
+        <w:t xml:space="preserve"> از محل سایه‌ی غالب تعیین می‌شود، نه از رنگ: سایه‌ی پایین غالب = صعودی، سایه‌ی بالا غالب = نزولی.</w:t>
+      </w:r>
+    </w:p>
+    <w:p>
+      <w:pPr>
+        <w:pStyle w:val="ListParagraph"/>
+        <w:numPr>
+          <w:ilvl w:val="0"/>
+          <w:numId w:val="2"/>
+        </w:numPr>
+        <w:bidi/>
+        <w:spacing w:after="80" w:line="300"/>
+        <w:jc w:val="both"/>
+      </w:pPr>
+      <w:r>
+        <w:rPr>
+          <w:rFonts w:ascii="Tahoma" w:cs="Tahoma" w:hAnsi="Tahoma"/>
+          <w:sz w:val="22"/>
+          <w:szCs w:val="22"/>
+          <w:rtl/>
+        </w:rPr>
+        <w:t xml:space="preserve">در الگوی سه‌کندلی صعودی، پین‌بار باید </w:t>
+      </w:r>
+      <w:r>
+        <w:rPr>
+          <w:rFonts w:ascii="Tahoma" w:cs="Tahoma" w:hAnsi="Tahoma"/>
+          <w:b/>
+          <w:bCs/>
+          <w:sz w:val="22"/>
+          <w:szCs w:val="22"/>
+          <w:rtl/>
+        </w:rPr>
+        <w:t xml:space="preserve">هم سبز باشد و هم پین‌بار صعودی</w:t>
+      </w:r>
+      <w:r>
+        <w:rPr>
+          <w:rFonts w:ascii="Tahoma" w:cs="Tahoma" w:hAnsi="Tahoma"/>
+          <w:sz w:val="22"/>
+          <w:szCs w:val="22"/>
+          <w:rtl/>
+        </w:rPr>
+        <w:t xml:space="preserve">؛ در الگوی نزولی، </w:t>
+      </w:r>
+      <w:r>
+        <w:rPr>
+          <w:rFonts w:ascii="Tahoma" w:cs="Tahoma" w:hAnsi="Tahoma"/>
+          <w:b/>
+          <w:bCs/>
+          <w:sz w:val="22"/>
+          <w:szCs w:val="22"/>
+          <w:rtl/>
+        </w:rPr>
+        <w:t xml:space="preserve">هم قرمز و هم پین‌بار نزولی</w:t>
+      </w:r>
+      <w:r>
+        <w:rPr>
+          <w:rFonts w:ascii="Tahoma" w:cs="Tahoma" w:hAnsi="Tahoma"/>
+          <w:sz w:val="22"/>
+          <w:szCs w:val="22"/>
+          <w:rtl/>
+        </w:rPr>
+        <w:t xml:space="preserve">.</w:t>
+      </w:r>
+    </w:p>
+    <w:p>
+      <w:pPr>
+        <w:pStyle w:val="ListParagraph"/>
+        <w:numPr>
+          <w:ilvl w:val="0"/>
+          <w:numId w:val="2"/>
+        </w:numPr>
+        <w:bidi/>
+        <w:spacing w:after="80" w:line="300"/>
+        <w:jc w:val="both"/>
+      </w:pPr>
+      <w:r>
+        <w:rPr>
+          <w:rFonts w:ascii="Tahoma" w:cs="Tahoma" w:hAnsi="Tahoma"/>
+          <w:sz w:val="22"/>
+          <w:szCs w:val="22"/>
+          <w:rtl/>
+        </w:rPr>
+        <w:t xml:space="preserve">کندلی که بدنه‌اش کمتر از ۳۵٪ است ولی دوجی یا پین‌بار نیست (مثلاً بدنه ۳۰٪، سایه‌ها ۴۰٪ و ۳۰٪) </w:t>
+      </w:r>
+      <w:r>
+        <w:rPr>
+          <w:rFonts w:ascii="Tahoma" w:cs="Tahoma" w:hAnsi="Tahoma"/>
+          <w:b/>
+          <w:bCs/>
+          <w:sz w:val="22"/>
+          <w:szCs w:val="22"/>
+          <w:rtl/>
+        </w:rPr>
+        <w:t xml:space="preserve">هیچ نوعی ندارد</w:t>
+      </w:r>
+      <w:r>
+        <w:rPr>
+          <w:rFonts w:ascii="Tahoma" w:cs="Tahoma" w:hAnsi="Tahoma"/>
+          <w:sz w:val="22"/>
+          <w:szCs w:val="22"/>
+          <w:rtl/>
+        </w:rPr>
+        <w:t xml:space="preserve">.</w:t>
+      </w:r>
+    </w:p>
+    <w:p>
+      <w:pPr>
+        <w:pStyle w:val="ListParagraph"/>
+        <w:numPr>
+          <w:ilvl w:val="0"/>
+          <w:numId w:val="2"/>
+        </w:numPr>
+        <w:bidi/>
+        <w:spacing w:after="80" w:line="300"/>
+        <w:jc w:val="both"/>
+      </w:pPr>
+      <w:r>
+        <w:rPr>
+          <w:rFonts w:ascii="Tahoma" w:cs="Tahoma" w:hAnsi="Tahoma"/>
+          <w:sz w:val="22"/>
+          <w:szCs w:val="22"/>
+          <w:rtl/>
+        </w:rPr>
+        <w:t xml:space="preserve">گزینه‌ی </w:t>
+      </w:r>
+      <w:r>
+        <w:rPr>
+          <w:rFonts w:ascii="Tahoma" w:cs="Tahoma" w:hAnsi="Tahoma"/>
+          <w:b/>
+          <w:bCs/>
+          <w:sz w:val="22"/>
+          <w:szCs w:val="22"/>
+          <w:rtl/>
+        </w:rPr>
+        <w:t xml:space="preserve">Color Candles by Type</w:t>
+      </w:r>
+      <w:r>
+        <w:rPr>
+          <w:rFonts w:ascii="Tahoma" w:cs="Tahoma" w:hAnsi="Tahoma"/>
+          <w:sz w:val="22"/>
+          <w:szCs w:val="22"/>
+          <w:rtl/>
+        </w:rPr>
+        <w:t xml:space="preserve"> (پیش‌فرض خاموش) کندل‌ها را بر اساس نوع رنگ می‌کند تا تشخیص را روی چارت ببینید.</w:t>
+      </w:r>
+    </w:p>
     <w:p>
       <w:pPr>
         <w:pStyle w:val="Heading1"/>
@@ -2205,17 +2893,17 @@
                 <w:szCs w:val="20"/>
                 <w:rtl/>
               </w:rPr>
-              <w:t xml:space="preserve">پین‌بار</w:t>
-            </w:r>
-            <w:r>
-              <w:rPr>
-                <w:rFonts w:ascii="Tahoma" w:cs="Tahoma" w:hAnsi="Tahoma"/>
-                <w:b w:val="false"/>
-                <w:sz w:val="20"/>
-                <w:szCs w:val="20"/>
-                <w:rtl/>
-              </w:rPr>
-              <w:t xml:space="preserve">.</w:t>
+              <w:t xml:space="preserve">پین‌بار صعودی</w:t>
+            </w:r>
+            <w:r>
+              <w:rPr>
+                <w:rFonts w:ascii="Tahoma" w:cs="Tahoma" w:hAnsi="Tahoma"/>
+                <w:b w:val="false"/>
+                <w:sz w:val="20"/>
+                <w:szCs w:val="20"/>
+                <w:rtl/>
+              </w:rPr>
+              <w:t xml:space="preserve"> (سایه‌ی پایین غالب).</w:t>
             </w:r>
           </w:p>
           <w:p>
@@ -2361,17 +3049,17 @@
                 <w:szCs w:val="20"/>
                 <w:rtl/>
               </w:rPr>
-              <w:t xml:space="preserve">پین‌بار</w:t>
-            </w:r>
-            <w:r>
-              <w:rPr>
-                <w:rFonts w:ascii="Tahoma" w:cs="Tahoma" w:hAnsi="Tahoma"/>
-                <w:b w:val="false"/>
-                <w:sz w:val="20"/>
-                <w:szCs w:val="20"/>
-                <w:rtl/>
-              </w:rPr>
-              <w:t xml:space="preserve">.</w:t>
+              <w:t xml:space="preserve">پین‌بار صعودی</w:t>
+            </w:r>
+            <w:r>
+              <w:rPr>
+                <w:rFonts w:ascii="Tahoma" w:cs="Tahoma" w:hAnsi="Tahoma"/>
+                <w:b w:val="false"/>
+                <w:sz w:val="20"/>
+                <w:szCs w:val="20"/>
+                <w:rtl/>
+              </w:rPr>
+              <w:t xml:space="preserve"> (سایه‌ی پایین غالب).</w:t>
             </w:r>
           </w:p>
           <w:p>
@@ -6725,7 +7413,7 @@
           <w:szCs w:val="22"/>
           <w:rtl/>
         </w:rPr>
-        <w:t xml:space="preserve"> کد فقط یک تعریف دارد (سایه دست‌کم ۲ برابر بدنه، برای الگوهای سه‌کندلی). تعریف «بدنه کمتر از ۵۰٪» در پرامپت رنج، در کد استفاده نمی‌شود.</w:t>
+        <w:t xml:space="preserve"> از V18.0 یک تعریف واحد دارد (بخش ۱). تعریف «بدنه کمتر از ۵۰٪» در پرامپت رنج، در کد استفاده نمی‌شود.</w:t>
       </w:r>
     </w:p>
     <w:p>
@@ -6957,7 +7645,7 @@
           <w:szCs w:val="22"/>
           <w:rtl/>
         </w:rPr>
-        <w:t xml:space="preserve"> ۷۰٪ برای همه‌ی الگوها. آستانه‌ی ۶۰٪ نوع ۱ رنج در کد استفاده نمی‌شود (به بند ۱ برمی‌گردد).</w:t>
+        <w:t xml:space="preserve"> بدنه ۷۰٪ و مجموع سایه‌ها حداکثر ۳۰٪، برای همه‌ی الگوها. آستانه‌ی ۶۰٪ نوع ۱ رنج در کد استفاده نمی‌شود (به بند ۱ برمی‌گردد).</w:t>
       </w:r>
     </w:p>
     <w:sectPr>

</xml_diff>

<commit_message>
V18.1: Real Breakout rules per user spec (section 2)
- Rule 1: C2 length (High-Low) >= 70% of C1 length
- Rule 2/3: low volume on C2 (default: C2 volume < C1 volume; selectable,
  skipped when the symbol has no volume); Rule 3: C2 <= 30% of C1
- Pattern A line test: C1 and C3 close beyond the line
- Pattern B: C2 Marubozu or Normal (no size test); line test on C3 close
- Pattern C: Normals >= 50% of Ref; line test on C3 close
- Docs, Word file and simulator replica updated

Co-Authored-By: Claude Opus 5.5 <noreply@anthropic.com>
Claude-Session: https://claude.ai/code/session_012ax4L7tKx6fogZS3qmV3Ae
</commit_message>
<xml_diff>
--- a/Code_Rules_As_Implemented_FA.docx
+++ b/Code_Rules_As_Implemented_FA.docx
@@ -16,7 +16,7 @@
           <w:szCs w:val="24"/>
           <w:rtl/>
         </w:rPr>
-        <w:t xml:space="preserve">SMC Follow Trend [Rohi] — نسخه‌ی V18.0</w:t>
+        <w:t xml:space="preserve">SMC Follow Trend [Rohi] — نسخه‌ی V18.1</w:t>
       </w:r>
     </w:p>
     <w:p>
@@ -1895,8 +1895,8 @@
       </w:tblPr>
       <w:tblGrid>
         <w:gridCol w:w="1500"/>
-        <w:gridCol w:w="4026"/>
-        <w:gridCol w:w="3500"/>
+        <w:gridCol w:w="4526"/>
+        <w:gridCol w:w="3000"/>
       </w:tblGrid>
       <w:tr>
         <w:trPr>
@@ -1940,7 +1940,7 @@
         </w:tc>
         <w:tc>
           <w:tcPr>
-            <w:tcW w:type="dxa" w:w="4026"/>
+            <w:tcW w:type="dxa" w:w="4526"/>
             <w:tcBorders>
               <w:top w:val="single" w:color="A6A6A6" w:sz="4"/>
               <w:left w:val="single" w:color="A6A6A6" w:sz="4"/>
@@ -1976,7 +1976,7 @@
         </w:tc>
         <w:tc>
           <w:tcPr>
-            <w:tcW w:type="dxa" w:w="3500"/>
+            <w:tcW w:type="dxa" w:w="3000"/>
             <w:tcBorders>
               <w:top w:val="single" w:color="A6A6A6" w:sz="4"/>
               <w:left w:val="single" w:color="A6A6A6" w:sz="4"/>
@@ -2051,7 +2051,7 @@
         </w:tc>
         <w:tc>
           <w:tcPr>
-            <w:tcW w:type="dxa" w:w="4026"/>
+            <w:tcW w:type="dxa" w:w="4526"/>
             <w:tcBorders>
               <w:top w:val="single" w:color="A6A6A6" w:sz="4"/>
               <w:left w:val="single" w:color="A6A6A6" w:sz="4"/>
@@ -2121,10 +2121,38 @@
               <w:t xml:space="preserve">Close C2 بالاتر از High C1.</w:t>
             </w:r>
           </w:p>
+          <w:p>
+            <w:pPr>
+              <w:bidi/>
+              <w:spacing w:after="40" w:line="280"/>
+              <w:jc w:val="right"/>
+            </w:pPr>
+            <w:r>
+              <w:rPr>
+                <w:rFonts w:ascii="Tahoma" w:cs="Tahoma" w:hAnsi="Tahoma"/>
+                <w:b/>
+                <w:bCs/>
+                <w:sz w:val="20"/>
+                <w:szCs w:val="20"/>
+                <w:rtl/>
+              </w:rPr>
+              <w:t xml:space="preserve">طول کل C2 (High تا Low) دست‌کم ۷۰٪ طول کل C1</w:t>
+            </w:r>
+            <w:r>
+              <w:rPr>
+                <w:rFonts w:ascii="Tahoma" w:cs="Tahoma" w:hAnsi="Tahoma"/>
+                <w:b w:val="false"/>
+                <w:sz w:val="20"/>
+                <w:szCs w:val="20"/>
+                <w:rtl/>
+              </w:rPr>
+              <w:t xml:space="preserve"> (هم بدنه و هم سایه).</w:t>
+            </w:r>
+          </w:p>
         </w:tc>
         <w:tc>
           <w:tcPr>
-            <w:tcW w:type="dxa" w:w="3500"/>
+            <w:tcW w:type="dxa" w:w="3000"/>
             <w:tcBorders>
               <w:top w:val="single" w:color="A6A6A6" w:sz="4"/>
               <w:left w:val="single" w:color="A6A6A6" w:sz="4"/>
@@ -2208,7 +2236,7 @@
         </w:tc>
         <w:tc>
           <w:tcPr>
-            <w:tcW w:type="dxa" w:w="4026"/>
+            <w:tcW w:type="dxa" w:w="4526"/>
             <w:tcBorders>
               <w:top w:val="single" w:color="A6A6A6" w:sz="4"/>
               <w:left w:val="single" w:color="A6A6A6" w:sz="4"/>
@@ -2326,10 +2354,38 @@
               <w:t xml:space="preserve"> (C2 به نیمه‌ی پایینی C1 برنگردد).</w:t>
             </w:r>
           </w:p>
+          <w:p>
+            <w:pPr>
+              <w:bidi/>
+              <w:spacing w:after="40" w:line="280"/>
+              <w:jc w:val="right"/>
+            </w:pPr>
+            <w:r>
+              <w:rPr>
+                <w:rFonts w:ascii="Tahoma" w:cs="Tahoma" w:hAnsi="Tahoma"/>
+                <w:b/>
+                <w:bCs/>
+                <w:sz w:val="20"/>
+                <w:szCs w:val="20"/>
+                <w:rtl/>
+              </w:rPr>
+              <w:t xml:space="preserve">حجم کندل C2 کم باشد</w:t>
+            </w:r>
+            <w:r>
+              <w:rPr>
+                <w:rFonts w:ascii="Tahoma" w:cs="Tahoma" w:hAnsi="Tahoma"/>
+                <w:b w:val="false"/>
+                <w:sz w:val="20"/>
+                <w:szCs w:val="20"/>
+                <w:rtl/>
+              </w:rPr>
+              <w:t xml:space="preserve"> (پیش‌فرض: حجم C2 کمتر از حجم C1).</w:t>
+            </w:r>
+          </w:p>
         </w:tc>
         <w:tc>
           <w:tcPr>
-            <w:tcW w:type="dxa" w:w="3500"/>
+            <w:tcW w:type="dxa" w:w="3000"/>
             <w:tcBorders>
               <w:top w:val="single" w:color="A6A6A6" w:sz="4"/>
               <w:left w:val="single" w:color="A6A6A6" w:sz="4"/>
@@ -2413,7 +2469,7 @@
         </w:tc>
         <w:tc>
           <w:tcPr>
-            <w:tcW w:type="dxa" w:w="4026"/>
+            <w:tcW w:type="dxa" w:w="4526"/>
             <w:tcBorders>
               <w:top w:val="single" w:color="A6A6A6" w:sz="4"/>
               <w:left w:val="single" w:color="A6A6A6" w:sz="4"/>
@@ -2500,7 +2556,7 @@
                 <w:szCs w:val="20"/>
                 <w:rtl/>
               </w:rPr>
-              <w:t xml:space="preserve"> و طولش </w:t>
+              <w:t xml:space="preserve"> و طولش (High تا Low) </w:t>
             </w:r>
             <w:r>
               <w:rPr>
@@ -2511,7 +2567,7 @@
                 <w:szCs w:val="20"/>
                 <w:rtl/>
               </w:rPr>
-              <w:t xml:space="preserve">کمتر از ۳۰٪</w:t>
+              <w:t xml:space="preserve">کمتر یا مساوی ۳۰٪</w:t>
             </w:r>
             <w:r>
               <w:rPr>
@@ -2540,12 +2596,30 @@
                 <w:rtl/>
               </w:rPr>
               <w:t xml:space="preserve">Low C2 بالاتر از M(C1).</w:t>
+            </w:r>
+          </w:p>
+          <w:p>
+            <w:pPr>
+              <w:bidi/>
+              <w:spacing w:after="40" w:line="280"/>
+              <w:jc w:val="right"/>
+            </w:pPr>
+            <w:r>
+              <w:rPr>
+                <w:rFonts w:ascii="Tahoma" w:cs="Tahoma" w:hAnsi="Tahoma"/>
+                <w:b/>
+                <w:bCs/>
+                <w:sz w:val="20"/>
+                <w:szCs w:val="20"/>
+                <w:rtl/>
+              </w:rPr>
+              <w:t xml:space="preserve">حجم کندل C2 کم باشد.</w:t>
             </w:r>
           </w:p>
         </w:tc>
         <w:tc>
           <w:tcPr>
-            <w:tcW w:type="dxa" w:w="3500"/>
+            <w:tcW w:type="dxa" w:w="3000"/>
             <w:tcBorders>
               <w:top w:val="single" w:color="A6A6A6" w:sz="4"/>
               <w:left w:val="single" w:color="A6A6A6" w:sz="4"/>
@@ -2584,7 +2658,7 @@
                 <w:szCs w:val="20"/>
                 <w:rtl/>
               </w:rPr>
-              <w:t xml:space="preserve"> بالای خط باشد.</w:t>
+              <w:t xml:space="preserve"> (با سایه) بالای خط باشد.</w:t>
             </w:r>
           </w:p>
         </w:tc>
@@ -2634,7 +2708,7 @@
           <w:szCs w:val="22"/>
           <w:rtl/>
         </w:rPr>
-        <w:t xml:space="preserve">هر سه کندل هم‌رنگ‌اند</w:t>
+        <w:t xml:space="preserve">هر سه کندل هم‌رنگ و در جهت روند‌اند</w:t>
       </w:r>
       <w:r>
         <w:rPr>
@@ -2663,7 +2737,7 @@
           <w:szCs w:val="22"/>
           <w:rtl/>
         </w:rPr>
-        <w:t xml:space="preserve">.</w:t>
+        <w:t xml:space="preserve">. Ref = بلندترین کندل از ۵ ماروبوزوی هم‌رنگِ قبل از C1 (اگر نبود، از هر رنگی).</w:t>
       </w:r>
     </w:p>
     <w:tbl>
@@ -2893,17 +2967,17 @@
                 <w:szCs w:val="20"/>
                 <w:rtl/>
               </w:rPr>
-              <w:t xml:space="preserve">پین‌بار صعودی</w:t>
-            </w:r>
-            <w:r>
-              <w:rPr>
-                <w:rFonts w:ascii="Tahoma" w:cs="Tahoma" w:hAnsi="Tahoma"/>
-                <w:b w:val="false"/>
-                <w:sz w:val="20"/>
-                <w:szCs w:val="20"/>
-                <w:rtl/>
-              </w:rPr>
-              <w:t xml:space="preserve"> (سایه‌ی پایین غالب).</w:t>
+              <w:t xml:space="preserve">پین‌بار در جهت روند</w:t>
+            </w:r>
+            <w:r>
+              <w:rPr>
+                <w:rFonts w:ascii="Tahoma" w:cs="Tahoma" w:hAnsi="Tahoma"/>
+                <w:b w:val="false"/>
+                <w:sz w:val="20"/>
+                <w:szCs w:val="20"/>
+                <w:rtl/>
+              </w:rPr>
+              <w:t xml:space="preserve"> (در شکست صعودی: پین‌بار صعودی).</w:t>
             </w:r>
           </w:p>
           <w:p>
@@ -2955,17 +3029,17 @@
                 <w:szCs w:val="20"/>
                 <w:rtl/>
               </w:rPr>
-              <w:t xml:space="preserve">بیش از ۳۰٪ بدنه‌ی C1</w:t>
-            </w:r>
-            <w:r>
-              <w:rPr>
-                <w:rFonts w:ascii="Tahoma" w:cs="Tahoma" w:hAnsi="Tahoma"/>
-                <w:b w:val="false"/>
-                <w:sz w:val="20"/>
-                <w:szCs w:val="20"/>
-                <w:rtl/>
-              </w:rPr>
-              <w:t xml:space="preserve"> بالای خط باشد.</w:t>
+              <w:t xml:space="preserve">Close C1 و Close C3</w:t>
+            </w:r>
+            <w:r>
+              <w:rPr>
+                <w:rFonts w:ascii="Tahoma" w:cs="Tahoma" w:hAnsi="Tahoma"/>
+                <w:b w:val="false"/>
+                <w:sz w:val="20"/>
+                <w:szCs w:val="20"/>
+                <w:rtl/>
+              </w:rPr>
+              <w:t xml:space="preserve"> هر دو بالای خط باشند.</w:t>
             </w:r>
           </w:p>
         </w:tc>
@@ -3049,34 +3123,55 @@
                 <w:szCs w:val="20"/>
                 <w:rtl/>
               </w:rPr>
-              <w:t xml:space="preserve">پین‌بار صعودی</w:t>
-            </w:r>
-            <w:r>
-              <w:rPr>
-                <w:rFonts w:ascii="Tahoma" w:cs="Tahoma" w:hAnsi="Tahoma"/>
-                <w:b w:val="false"/>
-                <w:sz w:val="20"/>
-                <w:szCs w:val="20"/>
-                <w:rtl/>
-              </w:rPr>
-              <w:t xml:space="preserve"> (سایه‌ی پایین غالب).</w:t>
-            </w:r>
-          </w:p>
-          <w:p>
-            <w:pPr>
-              <w:bidi/>
-              <w:spacing w:after="40" w:line="280"/>
-              <w:jc w:val="right"/>
-            </w:pPr>
-            <w:r>
-              <w:rPr>
-                <w:rFonts w:ascii="Tahoma" w:cs="Tahoma" w:hAnsi="Tahoma"/>
-                <w:b w:val="false"/>
-                <w:sz w:val="20"/>
-                <w:szCs w:val="20"/>
-                <w:rtl/>
-              </w:rPr>
-              <w:t xml:space="preserve">C2: ماروبوزو با طول دست‌کم ۵۰٪ Ref، و یکی از این دو: یا کاملاً داخل C1 باشد (اینساید بار)، یا Close آن به سقف C1 نزدیک باشد (حداکثر ۵٪ طول C1 پایین‌تر از High C1) یا بالاتر از آن.</w:t>
+              <w:t xml:space="preserve">پین‌بار در جهت روند</w:t>
+            </w:r>
+            <w:r>
+              <w:rPr>
+                <w:rFonts w:ascii="Tahoma" w:cs="Tahoma" w:hAnsi="Tahoma"/>
+                <w:b w:val="false"/>
+                <w:sz w:val="20"/>
+                <w:szCs w:val="20"/>
+                <w:rtl/>
+              </w:rPr>
+              <w:t xml:space="preserve">.</w:t>
+            </w:r>
+          </w:p>
+          <w:p>
+            <w:pPr>
+              <w:bidi/>
+              <w:spacing w:after="40" w:line="280"/>
+              <w:jc w:val="right"/>
+            </w:pPr>
+            <w:r>
+              <w:rPr>
+                <w:rFonts w:ascii="Tahoma" w:cs="Tahoma" w:hAnsi="Tahoma"/>
+                <w:b w:val="false"/>
+                <w:sz w:val="20"/>
+                <w:szCs w:val="20"/>
+                <w:rtl/>
+              </w:rPr>
+              <w:t xml:space="preserve">C2: </w:t>
+            </w:r>
+            <w:r>
+              <w:rPr>
+                <w:rFonts w:ascii="Tahoma" w:cs="Tahoma" w:hAnsi="Tahoma"/>
+                <w:b/>
+                <w:bCs/>
+                <w:sz w:val="20"/>
+                <w:szCs w:val="20"/>
+                <w:rtl/>
+              </w:rPr>
+              <w:t xml:space="preserve">ماروبوزو یا نرمال</w:t>
+            </w:r>
+            <w:r>
+              <w:rPr>
+                <w:rFonts w:ascii="Tahoma" w:cs="Tahoma" w:hAnsi="Tahoma"/>
+                <w:b w:val="false"/>
+                <w:sz w:val="20"/>
+                <w:szCs w:val="20"/>
+                <w:rtl/>
+              </w:rPr>
+              <w:t xml:space="preserve"> (بدون شرط اندازه)، و یکی از این دو: کاملاً داخل C1 باشد (اینساید بار)، یا Close آن نزدیک سقف C1 باشد (حداکثر ۵٪ طول C1 پایین‌تر از High C1) یا بالاتر.</w:t>
             </w:r>
           </w:p>
           <w:p>
@@ -3128,7 +3223,7 @@
                 <w:szCs w:val="20"/>
                 <w:rtl/>
               </w:rPr>
-              <w:t xml:space="preserve">Close C1</w:t>
+              <w:t xml:space="preserve">Close C3</w:t>
             </w:r>
             <w:r>
               <w:rPr>
@@ -3243,7 +3338,7 @@
                 <w:szCs w:val="20"/>
                 <w:rtl/>
               </w:rPr>
-              <w:t xml:space="preserve">۴۰٪</w:t>
+              <w:t xml:space="preserve">۵۰٪</w:t>
             </w:r>
             <w:r>
               <w:rPr>
@@ -3326,7 +3421,7 @@
                 <w:szCs w:val="20"/>
                 <w:rtl/>
               </w:rPr>
-              <w:t xml:space="preserve">Close C1</w:t>
+              <w:t xml:space="preserve">Close C3</w:t>
             </w:r>
             <w:r>
               <w:rPr>

</xml_diff>

<commit_message>
V18.2: candles, Real Breakout and Real Pullback per user spec (sections 1-3)
- Low volume on C2 (breakout and pullback rules 2/3): default test is
  'C2 is not an opposite Pin Bar'; volume options kept as alternatives
- Patterns A/B: the Pin Bar slot also accepts a Doji; pattern C Normals
  back to 40% of Ref
- Pullback rule 1: Close C2 beyond C1's low (bearish) / high (bullish)
- Range-exit pullback: 2 candles out of the box, Marubozu C1 with >= 50%
  of its length outside, C2 any candle closing beyond C1; it is the only
  way a type 1-3 box closes against its leg
- Docs, Word file and simulator replica updated

Co-Authored-By: Claude Opus 5.5 <noreply@anthropic.com>
Claude-Session: https://claude.ai/code/session_012ax4L7tKx6fogZS3qmV3Ae
</commit_message>
<xml_diff>
--- a/Code_Rules_As_Implemented_FA.docx
+++ b/Code_Rules_As_Implemented_FA.docx
@@ -16,7 +16,7 @@
           <w:szCs w:val="24"/>
           <w:rtl/>
         </w:rPr>
-        <w:t xml:space="preserve">SMC Follow Trend [Rohi] — نسخه‌ی V18.1</w:t>
+        <w:t xml:space="preserve">SMC Follow Trend [Rohi] — نسخه‌ی V18.2</w:t>
       </w:r>
     </w:p>
     <w:p>
@@ -2146,7 +2146,7 @@
                 <w:szCs w:val="20"/>
                 <w:rtl/>
               </w:rPr>
-              <w:t xml:space="preserve"> (هم بدنه و هم سایه).</w:t>
+              <w:t xml:space="preserve"> (هم بدنه و هم سایه). مثلاً اگر C1 صد پیپ باشد، C2 هفتاد پیپ یا بیشتر.</w:t>
             </w:r>
           </w:p>
         </w:tc>
@@ -2369,17 +2369,87 @@
                 <w:szCs w:val="20"/>
                 <w:rtl/>
               </w:rPr>
-              <w:t xml:space="preserve">حجم کندل C2 کم باشد</w:t>
-            </w:r>
-            <w:r>
-              <w:rPr>
-                <w:rFonts w:ascii="Tahoma" w:cs="Tahoma" w:hAnsi="Tahoma"/>
-                <w:b w:val="false"/>
-                <w:sz w:val="20"/>
-                <w:szCs w:val="20"/>
-                <w:rtl/>
-              </w:rPr>
-              <w:t xml:space="preserve"> (پیش‌فرض: حجم C2 کمتر از حجم C1).</w:t>
+              <w:t xml:space="preserve">حجم فروش C2 کم باشد</w:t>
+            </w:r>
+            <w:r>
+              <w:rPr>
+                <w:rFonts w:ascii="Tahoma" w:cs="Tahoma" w:hAnsi="Tahoma"/>
+                <w:b w:val="false"/>
+                <w:sz w:val="20"/>
+                <w:szCs w:val="20"/>
+                <w:rtl/>
+              </w:rPr>
+              <w:t xml:space="preserve"> (روند صعودی). پیش‌فرض: C2 </w:t>
+            </w:r>
+            <w:r>
+              <w:rPr>
+                <w:rFonts w:ascii="Tahoma" w:cs="Tahoma" w:hAnsi="Tahoma"/>
+                <w:b/>
+                <w:bCs/>
+                <w:sz w:val="20"/>
+                <w:szCs w:val="20"/>
+                <w:rtl/>
+              </w:rPr>
+              <w:t xml:space="preserve">پین‌بار نزولی نباشد</w:t>
+            </w:r>
+            <w:r>
+              <w:rPr>
+                <w:rFonts w:ascii="Tahoma" w:cs="Tahoma" w:hAnsi="Tahoma"/>
+                <w:b w:val="false"/>
+                <w:sz w:val="20"/>
+                <w:szCs w:val="20"/>
+                <w:rtl/>
+              </w:rPr>
+              <w:t xml:space="preserve"> (سایه‌ی بلند بالا، بدنه در قسمت پایین).</w:t>
+            </w:r>
+          </w:p>
+          <w:p>
+            <w:pPr>
+              <w:bidi/>
+              <w:spacing w:after="40" w:line="280"/>
+              <w:jc w:val="right"/>
+            </w:pPr>
+            <w:r>
+              <w:rPr>
+                <w:rFonts w:ascii="Tahoma" w:cs="Tahoma" w:hAnsi="Tahoma"/>
+                <w:b/>
+                <w:bCs/>
+                <w:sz w:val="20"/>
+                <w:szCs w:val="20"/>
+                <w:rtl/>
+              </w:rPr>
+              <w:t xml:space="preserve">حجم خرید C2 کم باشد</w:t>
+            </w:r>
+            <w:r>
+              <w:rPr>
+                <w:rFonts w:ascii="Tahoma" w:cs="Tahoma" w:hAnsi="Tahoma"/>
+                <w:b w:val="false"/>
+                <w:sz w:val="20"/>
+                <w:szCs w:val="20"/>
+                <w:rtl/>
+              </w:rPr>
+              <w:t xml:space="preserve"> (روند نزولی). پیش‌فرض: C2 </w:t>
+            </w:r>
+            <w:r>
+              <w:rPr>
+                <w:rFonts w:ascii="Tahoma" w:cs="Tahoma" w:hAnsi="Tahoma"/>
+                <w:b/>
+                <w:bCs/>
+                <w:sz w:val="20"/>
+                <w:szCs w:val="20"/>
+                <w:rtl/>
+              </w:rPr>
+              <w:t xml:space="preserve">پین‌بار صعودی نباشد</w:t>
+            </w:r>
+            <w:r>
+              <w:rPr>
+                <w:rFonts w:ascii="Tahoma" w:cs="Tahoma" w:hAnsi="Tahoma"/>
+                <w:b w:val="false"/>
+                <w:sz w:val="20"/>
+                <w:szCs w:val="20"/>
+                <w:rtl/>
+              </w:rPr>
+              <w:t xml:space="preserve"> (سایه‌ی بلند پایین، بدنه در قسمت بالا).</w:t>
             </w:r>
           </w:p>
         </w:tc>
@@ -2577,7 +2647,7 @@
                 <w:szCs w:val="20"/>
                 <w:rtl/>
               </w:rPr>
-              <w:t xml:space="preserve"> طول C1.</w:t>
+              <w:t xml:space="preserve"> طول C1. مثلاً اگر C1 صد پیپ باشد، C2 سی پیپ یا کمتر.</w:t>
             </w:r>
           </w:p>
           <w:p>
@@ -2607,13 +2677,12 @@
             <w:r>
               <w:rPr>
                 <w:rFonts w:ascii="Tahoma" w:cs="Tahoma" w:hAnsi="Tahoma"/>
-                <w:b/>
-                <w:bCs/>
-                <w:sz w:val="20"/>
-                <w:szCs w:val="20"/>
-                <w:rtl/>
-              </w:rPr>
-              <w:t xml:space="preserve">حجم کندل C2 کم باشد.</w:t>
+                <w:b w:val="false"/>
+                <w:sz w:val="20"/>
+                <w:szCs w:val="20"/>
+                <w:rtl/>
+              </w:rPr>
+              <w:t xml:space="preserve">حجم فروش C2 کم (روند صعودی) / حجم خرید C2 کم (روند نزولی)، با همان پیش‌فرض شرط ۲.</w:t>
             </w:r>
           </w:p>
         </w:tc>
@@ -2666,6 +2735,22 @@
     </w:tbl>
     <w:p>
       <w:pPr>
+        <w:bidi/>
+        <w:spacing w:after="120" w:line="320"/>
+        <w:jc w:val="both"/>
+      </w:pPr>
+      <w:r>
+        <w:rPr>
+          <w:rFonts w:ascii="Tahoma" w:cs="Tahoma" w:hAnsi="Tahoma"/>
+          <w:sz w:val="22"/>
+          <w:szCs w:val="22"/>
+          <w:rtl/>
+        </w:rPr>
+        <w:t xml:space="preserve">تنظیم «Low Volume on C2»: پیش‌فرض همین تست پین‌بار است. گزینه‌های «حجم C2 کمتر از C1»، «حجم C2 کمتر از میانگین» و «خاموش» هم وجود دارد.</w:t>
+      </w:r>
+    </w:p>
+    <w:p>
+      <w:pPr>
         <w:pStyle w:val="Heading2"/>
         <w:bidi/>
         <w:spacing w:after="120" w:before="240"/>
@@ -2717,7 +2802,7 @@
           <w:szCs w:val="22"/>
           <w:rtl/>
         </w:rPr>
-        <w:t xml:space="preserve"> (در شکست صعودی: هر سه صعودی) و </w:t>
+        <w:t xml:space="preserve"> (شکست صعودی: هر سه صعودی). در روند صعودی </w:t>
       </w:r>
       <w:r>
         <w:rPr>
@@ -2737,7 +2822,7 @@
           <w:szCs w:val="22"/>
           <w:rtl/>
         </w:rPr>
-        <w:t xml:space="preserve">. Ref = بلندترین کندل از ۵ ماروبوزوی هم‌رنگِ قبل از C1 (اگر نبود، از هر رنگی).</w:t>
+        <w:t xml:space="preserve"> و در روند نزولی برعکس. همین شرط، «Close C3 بالای C1 و Close C2» را هم پوشش می‌دهد. Ref = بلندترین کندل از ۵ ماروبوزوی هم‌رنگِ قبل از C1 (اگر نبود، از هر رنگی).</w:t>
       </w:r>
     </w:p>
     <w:tbl>
@@ -2967,17 +3052,17 @@
                 <w:szCs w:val="20"/>
                 <w:rtl/>
               </w:rPr>
-              <w:t xml:space="preserve">پین‌بار در جهت روند</w:t>
-            </w:r>
-            <w:r>
-              <w:rPr>
-                <w:rFonts w:ascii="Tahoma" w:cs="Tahoma" w:hAnsi="Tahoma"/>
-                <w:b w:val="false"/>
-                <w:sz w:val="20"/>
-                <w:szCs w:val="20"/>
-                <w:rtl/>
-              </w:rPr>
-              <w:t xml:space="preserve"> (در شکست صعودی: پین‌بار صعودی).</w:t>
+              <w:t xml:space="preserve">پین‌بار یا دوجی در جهت روند</w:t>
+            </w:r>
+            <w:r>
+              <w:rPr>
+                <w:rFonts w:ascii="Tahoma" w:cs="Tahoma" w:hAnsi="Tahoma"/>
+                <w:b w:val="false"/>
+                <w:sz w:val="20"/>
+                <w:szCs w:val="20"/>
+                <w:rtl/>
+              </w:rPr>
+              <w:t xml:space="preserve"> (شکست صعودی: پین‌بار صعودی یا دوجی، سبز).</w:t>
             </w:r>
           </w:p>
           <w:p>
@@ -3040,6 +3125,23 @@
                 <w:rtl/>
               </w:rPr>
               <w:t xml:space="preserve"> هر دو بالای خط باشند.</w:t>
+            </w:r>
+          </w:p>
+          <w:p>
+            <w:pPr>
+              <w:bidi/>
+              <w:spacing w:after="40" w:line="280"/>
+              <w:jc w:val="right"/>
+            </w:pPr>
+            <w:r>
+              <w:rPr>
+                <w:rFonts w:ascii="Tahoma" w:cs="Tahoma" w:hAnsi="Tahoma"/>
+                <w:b w:val="false"/>
+                <w:sz w:val="20"/>
+                <w:szCs w:val="20"/>
+                <w:rtl/>
+              </w:rPr>
+              <w:t xml:space="preserve">Close C3 بالای C1 و Close C2 باشد.</w:t>
             </w:r>
           </w:p>
         </w:tc>
@@ -3123,7 +3225,7 @@
                 <w:szCs w:val="20"/>
                 <w:rtl/>
               </w:rPr>
-              <w:t xml:space="preserve">پین‌بار در جهت روند</w:t>
+              <w:t xml:space="preserve">پین‌بار یا دوجی در جهت روند</w:t>
             </w:r>
             <w:r>
               <w:rPr>
@@ -3171,7 +3273,7 @@
                 <w:szCs w:val="20"/>
                 <w:rtl/>
               </w:rPr>
-              <w:t xml:space="preserve"> (بدون شرط اندازه)، و یکی از این دو: کاملاً داخل C1 باشد (اینساید بار)، یا Close آن نزدیک سقف C1 باشد (حداکثر ۵٪ طول C1 پایین‌تر از High C1) یا بالاتر.</w:t>
+              <w:t xml:space="preserve"> طبق تعاریف کندل‌ها: کاملاً داخل C1 باشد (اینساید بار)، یا Close آن نزدیک سقف C1 باشد (حداکثر ۵٪ طول C1 پایین‌تر از High C1) یا بالاتر.</w:t>
             </w:r>
           </w:p>
           <w:p>
@@ -3234,6 +3336,23 @@
                 <w:rtl/>
               </w:rPr>
               <w:t xml:space="preserve"> بالای خط باشد.</w:t>
+            </w:r>
+          </w:p>
+          <w:p>
+            <w:pPr>
+              <w:bidi/>
+              <w:spacing w:after="40" w:line="280"/>
+              <w:jc w:val="right"/>
+            </w:pPr>
+            <w:r>
+              <w:rPr>
+                <w:rFonts w:ascii="Tahoma" w:cs="Tahoma" w:hAnsi="Tahoma"/>
+                <w:b w:val="false"/>
+                <w:sz w:val="20"/>
+                <w:szCs w:val="20"/>
+                <w:rtl/>
+              </w:rPr>
+              <w:t xml:space="preserve">C3 بالای C1 و Close C2 باشد.</w:t>
             </w:r>
           </w:p>
         </w:tc>
@@ -3338,7 +3457,7 @@
                 <w:szCs w:val="20"/>
                 <w:rtl/>
               </w:rPr>
-              <w:t xml:space="preserve">۵۰٪</w:t>
+              <w:t xml:space="preserve">۴۰٪</w:t>
             </w:r>
             <w:r>
               <w:rPr>
@@ -3432,6 +3551,23 @@
                 <w:rtl/>
               </w:rPr>
               <w:t xml:space="preserve"> بالای خط باشد.</w:t>
+            </w:r>
+          </w:p>
+          <w:p>
+            <w:pPr>
+              <w:bidi/>
+              <w:spacing w:after="40" w:line="280"/>
+              <w:jc w:val="right"/>
+            </w:pPr>
+            <w:r>
+              <w:rPr>
+                <w:rFonts w:ascii="Tahoma" w:cs="Tahoma" w:hAnsi="Tahoma"/>
+                <w:b w:val="false"/>
+                <w:sz w:val="20"/>
+                <w:szCs w:val="20"/>
+                <w:rtl/>
+              </w:rPr>
+              <w:t xml:space="preserve">C3 بالای C1 و Close C2 باشد.</w:t>
             </w:r>
           </w:p>
         </w:tc>
@@ -3489,7 +3625,7 @@
                 <w:szCs w:val="22"/>
                 <w:rtl/>
               </w:rPr>
-              <w:t xml:space="preserve"> ثبت CTS (شکست سقف موج)، تغییر روند (شکست BOS)، و بستن رنج باکس (شکست سقف یا کف باکس). در همه‌ی این موارد، همین شش الگو با همان شرط‌ها بررسی می‌شوند؛ فقط «خط» عوض می‌شود.</w:t>
+              <w:t xml:space="preserve"> ثبت CTS (شکست سقف موج)، تغییر روند (شکست BOS)، و بستن رنج باکس در جهت حرکت (شکست سقف باکس). در همه‌ی این موارد، همین شش الگو با همان شرط‌ها بررسی می‌شوند؛ فقط «خط» عوض می‌شود.</w:t>
             </w:r>
           </w:p>
         </w:tc>
@@ -3568,27 +3704,7 @@
           <w:szCs w:val="22"/>
           <w:rtl/>
         </w:rPr>
-        <w:t xml:space="preserve">؛ فقط شکل کندل‌ها مهم است. اگر یکی از شش الگوی زیر کامل شود، کد می‌گوید «الگوی پولبک رخ داد». اینکه این الگو در ساختار </w:t>
-      </w:r>
-      <w:r>
-        <w:rPr>
-          <w:rFonts w:ascii="Tahoma" w:cs="Tahoma" w:hAnsi="Tahoma"/>
-          <w:b/>
-          <w:bCs/>
-          <w:sz w:val="22"/>
-          <w:szCs w:val="22"/>
-          <w:rtl/>
-        </w:rPr>
-        <w:t xml:space="preserve">حساب شود یا نه</w:t>
-      </w:r>
-      <w:r>
-        <w:rPr>
-          <w:rFonts w:ascii="Tahoma" w:cs="Tahoma" w:hAnsi="Tahoma"/>
-          <w:sz w:val="22"/>
-          <w:szCs w:val="22"/>
-          <w:rtl/>
-        </w:rPr>
-        <w:t xml:space="preserve">، در بخش ۳-۳ آمده است.</w:t>
+        <w:t xml:space="preserve">؛ فقط شکل کندل‌ها مهم است. اگر یکی از شش الگوی زیر کامل شود، کد می‌گوید «الگوی پولبک رخ داد». اینکه این الگو در ساختار حساب شود یا نه، در بخش ۳-۳ آمده است.</w:t>
       </w:r>
     </w:p>
     <w:p>
@@ -3832,7 +3948,7 @@
                 <w:szCs w:val="20"/>
                 <w:rtl/>
               </w:rPr>
-              <w:t xml:space="preserve"> طول C1.</w:t>
+              <w:t xml:space="preserve"> طول C1. مثلاً اگر C1 صد پیپ باشد، C2 هفتاد پیپ یا بیشتر.</w:t>
             </w:r>
           </w:p>
           <w:p>
@@ -3850,7 +3966,17 @@
                 <w:szCs w:val="20"/>
                 <w:rtl/>
               </w:rPr>
-              <w:t xml:space="preserve">Close C2 پایین‌تر از Close C1.</w:t>
+              <w:t xml:space="preserve">Close C2 پایین‌تر از Low C1</w:t>
+            </w:r>
+            <w:r>
+              <w:rPr>
+                <w:rFonts w:ascii="Tahoma" w:cs="Tahoma" w:hAnsi="Tahoma"/>
+                <w:b w:val="false"/>
+                <w:sz w:val="20"/>
+                <w:szCs w:val="20"/>
+                <w:rtl/>
+              </w:rPr>
+              <w:t xml:space="preserve"> در روند صعودی، و برعکس در روند نزولی (Close C2 بالاتر از High C1).</w:t>
             </w:r>
           </w:p>
         </w:tc>
@@ -4013,6 +4139,104 @@
               <w:t xml:space="preserve"> (C2 به نیمه‌ی بالایی C1 برنگردد).</w:t>
             </w:r>
           </w:p>
+          <w:p>
+            <w:pPr>
+              <w:bidi/>
+              <w:spacing w:after="40" w:line="280"/>
+              <w:jc w:val="right"/>
+            </w:pPr>
+            <w:r>
+              <w:rPr>
+                <w:rFonts w:ascii="Tahoma" w:cs="Tahoma" w:hAnsi="Tahoma"/>
+                <w:b/>
+                <w:bCs/>
+                <w:sz w:val="20"/>
+                <w:szCs w:val="20"/>
+                <w:rtl/>
+              </w:rPr>
+              <w:t xml:space="preserve">حجم خرید C2 کم باشد</w:t>
+            </w:r>
+            <w:r>
+              <w:rPr>
+                <w:rFonts w:ascii="Tahoma" w:cs="Tahoma" w:hAnsi="Tahoma"/>
+                <w:b w:val="false"/>
+                <w:sz w:val="20"/>
+                <w:szCs w:val="20"/>
+                <w:rtl/>
+              </w:rPr>
+              <w:t xml:space="preserve"> (روند صعودی). پیش‌فرض: C2 </w:t>
+            </w:r>
+            <w:r>
+              <w:rPr>
+                <w:rFonts w:ascii="Tahoma" w:cs="Tahoma" w:hAnsi="Tahoma"/>
+                <w:b/>
+                <w:bCs/>
+                <w:sz w:val="20"/>
+                <w:szCs w:val="20"/>
+                <w:rtl/>
+              </w:rPr>
+              <w:t xml:space="preserve">پین‌بار صعودی نباشد</w:t>
+            </w:r>
+            <w:r>
+              <w:rPr>
+                <w:rFonts w:ascii="Tahoma" w:cs="Tahoma" w:hAnsi="Tahoma"/>
+                <w:b w:val="false"/>
+                <w:sz w:val="20"/>
+                <w:szCs w:val="20"/>
+                <w:rtl/>
+              </w:rPr>
+              <w:t xml:space="preserve"> (سایه‌ی بلند پایین، بدنه در قسمت بالا).</w:t>
+            </w:r>
+          </w:p>
+          <w:p>
+            <w:pPr>
+              <w:bidi/>
+              <w:spacing w:after="40" w:line="280"/>
+              <w:jc w:val="right"/>
+            </w:pPr>
+            <w:r>
+              <w:rPr>
+                <w:rFonts w:ascii="Tahoma" w:cs="Tahoma" w:hAnsi="Tahoma"/>
+                <w:b/>
+                <w:bCs/>
+                <w:sz w:val="20"/>
+                <w:szCs w:val="20"/>
+                <w:rtl/>
+              </w:rPr>
+              <w:t xml:space="preserve">حجم فروش C2 کم باشد</w:t>
+            </w:r>
+            <w:r>
+              <w:rPr>
+                <w:rFonts w:ascii="Tahoma" w:cs="Tahoma" w:hAnsi="Tahoma"/>
+                <w:b w:val="false"/>
+                <w:sz w:val="20"/>
+                <w:szCs w:val="20"/>
+                <w:rtl/>
+              </w:rPr>
+              <w:t xml:space="preserve"> (روند نزولی). پیش‌فرض: C2 </w:t>
+            </w:r>
+            <w:r>
+              <w:rPr>
+                <w:rFonts w:ascii="Tahoma" w:cs="Tahoma" w:hAnsi="Tahoma"/>
+                <w:b/>
+                <w:bCs/>
+                <w:sz w:val="20"/>
+                <w:szCs w:val="20"/>
+                <w:rtl/>
+              </w:rPr>
+              <w:t xml:space="preserve">پین‌بار نزولی نباشد</w:t>
+            </w:r>
+            <w:r>
+              <w:rPr>
+                <w:rFonts w:ascii="Tahoma" w:cs="Tahoma" w:hAnsi="Tahoma"/>
+                <w:b w:val="false"/>
+                <w:sz w:val="20"/>
+                <w:szCs w:val="20"/>
+                <w:rtl/>
+              </w:rPr>
+              <w:t xml:space="preserve"> (سایه‌ی بلند بالا، بدنه در قسمت پایین).</w:t>
+            </w:r>
+          </w:p>
         </w:tc>
       </w:tr>
       <w:tr>
@@ -4163,7 +4387,7 @@
                 <w:szCs w:val="20"/>
                 <w:rtl/>
               </w:rPr>
-              <w:t xml:space="preserve"> طول C1.</w:t>
+              <w:t xml:space="preserve"> طول C1. مثلاً اگر C1 صد پیپ باشد، C2 سی پیپ یا کمتر.</w:t>
             </w:r>
           </w:p>
           <w:p>
@@ -4181,7 +4405,34 @@
                 <w:szCs w:val="20"/>
                 <w:rtl/>
               </w:rPr>
-              <w:t xml:space="preserve">High C2 پایین‌تر از M(C1).</w:t>
+              <w:t xml:space="preserve">High C2 پایین‌تر از M(C1)</w:t>
+            </w:r>
+            <w:r>
+              <w:rPr>
+                <w:rFonts w:ascii="Tahoma" w:cs="Tahoma" w:hAnsi="Tahoma"/>
+                <w:b w:val="false"/>
+                <w:sz w:val="20"/>
+                <w:szCs w:val="20"/>
+                <w:rtl/>
+              </w:rPr>
+              <w:t xml:space="preserve"> در روند صعودی، و برعکس در روند نزولی.</w:t>
+            </w:r>
+          </w:p>
+          <w:p>
+            <w:pPr>
+              <w:bidi/>
+              <w:spacing w:after="40" w:line="280"/>
+              <w:jc w:val="right"/>
+            </w:pPr>
+            <w:r>
+              <w:rPr>
+                <w:rFonts w:ascii="Tahoma" w:cs="Tahoma" w:hAnsi="Tahoma"/>
+                <w:b w:val="false"/>
+                <w:sz w:val="20"/>
+                <w:szCs w:val="20"/>
+                <w:rtl/>
+              </w:rPr>
+              <w:t xml:space="preserve">حجم خرید C2 کم (روند صعودی) / حجم فروش C2 کم (روند نزولی)، با همان پیش‌فرض شرط ۲.</w:t>
             </w:r>
           </w:p>
         </w:tc>
@@ -4333,22 +4584,31 @@
       <w:r>
         <w:rPr>
           <w:rFonts w:ascii="Tahoma" w:cs="Tahoma" w:hAnsi="Tahoma"/>
-          <w:b/>
-          <w:bCs/>
-          <w:sz w:val="22"/>
-          <w:szCs w:val="22"/>
-          <w:rtl/>
-        </w:rPr>
-        <w:t xml:space="preserve">بیرون از رنج باکس:</w:t>
-      </w:r>
-      <w:r>
-        <w:rPr>
-          <w:rFonts w:ascii="Tahoma" w:cs="Tahoma" w:hAnsi="Tahoma"/>
-          <w:sz w:val="22"/>
-          <w:szCs w:val="22"/>
-          <w:rtl/>
-        </w:rPr>
-        <w:t xml:space="preserve"> هر الگوی پولبک، پولبک حساب می‌شود.</w:t>
+          <w:sz w:val="22"/>
+          <w:szCs w:val="22"/>
+          <w:rtl/>
+        </w:rPr>
+        <w:t xml:space="preserve">اگر بعد از شکل‌گیری سقف موج (H*) یکی از سه شرط اصلی یا سه الگوی سه‌کندلی پولبک واقعی رخ دهد، </w:t>
+      </w:r>
+      <w:r>
+        <w:rPr>
+          <w:rFonts w:ascii="Tahoma" w:cs="Tahoma" w:hAnsi="Tahoma"/>
+          <w:b/>
+          <w:bCs/>
+          <w:sz w:val="22"/>
+          <w:szCs w:val="22"/>
+          <w:rtl/>
+        </w:rPr>
+        <w:t xml:space="preserve">پولبک واقعی</w:t>
+      </w:r>
+      <w:r>
+        <w:rPr>
+          <w:rFonts w:ascii="Tahoma" w:cs="Tahoma" w:hAnsi="Tahoma"/>
+          <w:sz w:val="22"/>
+          <w:szCs w:val="22"/>
+          <w:rtl/>
+        </w:rPr>
+        <w:t xml:space="preserve"> رخ می‌دهد. اگر بعد از پولبک واقعی باکس رنج شکل بگیرد یا نه، تأثیری در شناخت پولبک واقعی ندارد.</w:t>
       </w:r>
     </w:p>
     <w:p>
@@ -4365,42 +4625,51 @@
       <w:r>
         <w:rPr>
           <w:rFonts w:ascii="Tahoma" w:cs="Tahoma" w:hAnsi="Tahoma"/>
-          <w:b/>
-          <w:bCs/>
-          <w:sz w:val="22"/>
-          <w:szCs w:val="22"/>
-          <w:rtl/>
-        </w:rPr>
-        <w:t xml:space="preserve">داخل رنجی که از قبل فعال بوده:</w:t>
-      </w:r>
-      <w:r>
-        <w:rPr>
-          <w:rFonts w:ascii="Tahoma" w:cs="Tahoma" w:hAnsi="Tahoma"/>
-          <w:sz w:val="22"/>
-          <w:szCs w:val="22"/>
-          <w:rtl/>
-        </w:rPr>
-        <w:t xml:space="preserve"> فقط وقتی حساب می‌شود که الگو </w:t>
-      </w:r>
-      <w:r>
-        <w:rPr>
-          <w:rFonts w:ascii="Tahoma" w:cs="Tahoma" w:hAnsi="Tahoma"/>
-          <w:b/>
-          <w:bCs/>
-          <w:sz w:val="22"/>
-          <w:szCs w:val="22"/>
-          <w:rtl/>
-        </w:rPr>
-        <w:t xml:space="preserve">کف رنج را بشکند</w:t>
-      </w:r>
-      <w:r>
-        <w:rPr>
-          <w:rFonts w:ascii="Tahoma" w:cs="Tahoma" w:hAnsi="Tahoma"/>
-          <w:sz w:val="22"/>
-          <w:szCs w:val="22"/>
-          <w:rtl/>
-        </w:rPr>
-        <w:t xml:space="preserve">؛ وگرنه نویز داخل رنج است و نادیده گرفته می‌شود. «شکستن کف» یعنی:</w:t>
+          <w:sz w:val="22"/>
+          <w:szCs w:val="22"/>
+          <w:rtl/>
+        </w:rPr>
+        <w:t xml:space="preserve">اگر بعد از شکل‌گیری سقف موج (H*) هیچ‌کدام از سه شرط اصلی یا سه الگوی سه‌کندلی پولبک واقعی رخ ندهد، باکس رنج شکل می‌گیرد، و </w:t>
+      </w:r>
+      <w:r>
+        <w:rPr>
+          <w:rFonts w:ascii="Tahoma" w:cs="Tahoma" w:hAnsi="Tahoma"/>
+          <w:b/>
+          <w:bCs/>
+          <w:sz w:val="22"/>
+          <w:szCs w:val="22"/>
+          <w:rtl/>
+        </w:rPr>
+        <w:t xml:space="preserve">فقط وقتی پولبک واقعی حساب می‌شود که کف رنج شکسته شود</w:t>
+      </w:r>
+      <w:r>
+        <w:rPr>
+          <w:rFonts w:ascii="Tahoma" w:cs="Tahoma" w:hAnsi="Tahoma"/>
+          <w:sz w:val="22"/>
+          <w:szCs w:val="22"/>
+          <w:rtl/>
+        </w:rPr>
+        <w:t xml:space="preserve">؛ وگرنه نویز داخل رنج است، نادیده گرفته می‌شود و باکس رنج گسترش می‌یابد. «شکستن کف و پولبک واقعی» زمانی است که </w:t>
+      </w:r>
+      <w:r>
+        <w:rPr>
+          <w:rFonts w:ascii="Tahoma" w:cs="Tahoma" w:hAnsi="Tahoma"/>
+          <w:b/>
+          <w:bCs/>
+          <w:sz w:val="22"/>
+          <w:szCs w:val="22"/>
+          <w:rtl/>
+        </w:rPr>
+        <w:t xml:space="preserve">هر سه مورد زیر دقیقاً با هم</w:t>
+      </w:r>
+      <w:r>
+        <w:rPr>
+          <w:rFonts w:ascii="Tahoma" w:cs="Tahoma" w:hAnsi="Tahoma"/>
+          <w:sz w:val="22"/>
+          <w:szCs w:val="22"/>
+          <w:rtl/>
+        </w:rPr>
+        <w:t xml:space="preserve"> اتفاق بیفتند:</w:t>
       </w:r>
     </w:p>
     <w:p>
@@ -4417,31 +4686,22 @@
       <w:r>
         <w:rPr>
           <w:rFonts w:ascii="Tahoma" w:cs="Tahoma" w:hAnsi="Tahoma"/>
-          <w:sz w:val="22"/>
-          <w:szCs w:val="22"/>
-          <w:rtl/>
-        </w:rPr>
-        <w:t xml:space="preserve">شرط ۱: </w:t>
-      </w:r>
-      <w:r>
-        <w:rPr>
-          <w:rFonts w:ascii="Tahoma" w:cs="Tahoma" w:hAnsi="Tahoma"/>
-          <w:b/>
-          <w:bCs/>
-          <w:sz w:val="22"/>
-          <w:szCs w:val="22"/>
-          <w:rtl/>
-        </w:rPr>
-        <w:t xml:space="preserve">Close هر دو کندل</w:t>
-      </w:r>
-      <w:r>
-        <w:rPr>
-          <w:rFonts w:ascii="Tahoma" w:cs="Tahoma" w:hAnsi="Tahoma"/>
-          <w:sz w:val="22"/>
-          <w:szCs w:val="22"/>
-          <w:rtl/>
-        </w:rPr>
-        <w:t xml:space="preserve"> زیر کف رنج.</w:t>
+          <w:b/>
+          <w:bCs/>
+          <w:sz w:val="22"/>
+          <w:szCs w:val="22"/>
+          <w:rtl/>
+        </w:rPr>
+        <w:t xml:space="preserve">۲ کندل</w:t>
+      </w:r>
+      <w:r>
+        <w:rPr>
+          <w:rFonts w:ascii="Tahoma" w:cs="Tahoma" w:hAnsi="Tahoma"/>
+          <w:sz w:val="22"/>
+          <w:szCs w:val="22"/>
+          <w:rtl/>
+        </w:rPr>
+        <w:t xml:space="preserve"> باید از باکس رنج خارج شده باشند (Close هر دو بیرون از باکس).</w:t>
       </w:r>
     </w:p>
     <w:p>
@@ -4462,27 +4722,47 @@
           <w:szCs w:val="22"/>
           <w:rtl/>
         </w:rPr>
-        <w:t xml:space="preserve">شرط ۲ و شرط ۳: </w:t>
-      </w:r>
-      <w:r>
-        <w:rPr>
-          <w:rFonts w:ascii="Tahoma" w:cs="Tahoma" w:hAnsi="Tahoma"/>
-          <w:b/>
-          <w:bCs/>
-          <w:sz w:val="22"/>
-          <w:szCs w:val="22"/>
-          <w:rtl/>
-        </w:rPr>
-        <w:t xml:space="preserve">Close C1</w:t>
-      </w:r>
-      <w:r>
-        <w:rPr>
-          <w:rFonts w:ascii="Tahoma" w:cs="Tahoma" w:hAnsi="Tahoma"/>
-          <w:sz w:val="22"/>
-          <w:szCs w:val="22"/>
-          <w:rtl/>
-        </w:rPr>
-        <w:t xml:space="preserve"> زیر کف رنج.</w:t>
+        <w:t xml:space="preserve">کندل اول </w:t>
+      </w:r>
+      <w:r>
+        <w:rPr>
+          <w:rFonts w:ascii="Tahoma" w:cs="Tahoma" w:hAnsi="Tahoma"/>
+          <w:b/>
+          <w:bCs/>
+          <w:sz w:val="22"/>
+          <w:szCs w:val="22"/>
+          <w:rtl/>
+        </w:rPr>
+        <w:t xml:space="preserve">ماروبوزوی خلاف جهت روند</w:t>
+      </w:r>
+      <w:r>
+        <w:rPr>
+          <w:rFonts w:ascii="Tahoma" w:cs="Tahoma" w:hAnsi="Tahoma"/>
+          <w:sz w:val="22"/>
+          <w:szCs w:val="22"/>
+          <w:rtl/>
+        </w:rPr>
+        <w:t xml:space="preserve"> و موافق پولبک باشد و </w:t>
+      </w:r>
+      <w:r>
+        <w:rPr>
+          <w:rFonts w:ascii="Tahoma" w:cs="Tahoma" w:hAnsi="Tahoma"/>
+          <w:b/>
+          <w:bCs/>
+          <w:sz w:val="22"/>
+          <w:szCs w:val="22"/>
+          <w:rtl/>
+        </w:rPr>
+        <w:t xml:space="preserve">دست‌کم ۵۰٪ طول</w:t>
+      </w:r>
+      <w:r>
+        <w:rPr>
+          <w:rFonts w:ascii="Tahoma" w:cs="Tahoma" w:hAnsi="Tahoma"/>
+          <w:sz w:val="22"/>
+          <w:szCs w:val="22"/>
+          <w:rtl/>
+        </w:rPr>
+        <w:t xml:space="preserve"> این ماروبوزو (High تا Low) از محدوده‌ی رنج خارج شود.</w:t>
       </w:r>
     </w:p>
     <w:p>
@@ -4503,47 +4783,47 @@
           <w:szCs w:val="22"/>
           <w:rtl/>
         </w:rPr>
-        <w:t xml:space="preserve">الگوی الف: </w:t>
-      </w:r>
-      <w:r>
-        <w:rPr>
-          <w:rFonts w:ascii="Tahoma" w:cs="Tahoma" w:hAnsi="Tahoma"/>
-          <w:b/>
-          <w:bCs/>
-          <w:sz w:val="22"/>
-          <w:szCs w:val="22"/>
-          <w:rtl/>
-        </w:rPr>
-        <w:t xml:space="preserve">بیش از ۳۰٪ بدنه‌ی C1</w:t>
-      </w:r>
-      <w:r>
-        <w:rPr>
-          <w:rFonts w:ascii="Tahoma" w:cs="Tahoma" w:hAnsi="Tahoma"/>
-          <w:sz w:val="22"/>
-          <w:szCs w:val="22"/>
-          <w:rtl/>
-        </w:rPr>
-        <w:t xml:space="preserve"> زیر کف. الگوهای ب و ج: </w:t>
-      </w:r>
-      <w:r>
-        <w:rPr>
-          <w:rFonts w:ascii="Tahoma" w:cs="Tahoma" w:hAnsi="Tahoma"/>
-          <w:b/>
-          <w:bCs/>
-          <w:sz w:val="22"/>
-          <w:szCs w:val="22"/>
-          <w:rtl/>
-        </w:rPr>
-        <w:t xml:space="preserve">Close C1</w:t>
-      </w:r>
-      <w:r>
-        <w:rPr>
-          <w:rFonts w:ascii="Tahoma" w:cs="Tahoma" w:hAnsi="Tahoma"/>
-          <w:sz w:val="22"/>
-          <w:szCs w:val="22"/>
-          <w:rtl/>
-        </w:rPr>
-        <w:t xml:space="preserve"> زیر کف.</w:t>
+        <w:t xml:space="preserve">کندل دوم </w:t>
+      </w:r>
+      <w:r>
+        <w:rPr>
+          <w:rFonts w:ascii="Tahoma" w:cs="Tahoma" w:hAnsi="Tahoma"/>
+          <w:b/>
+          <w:bCs/>
+          <w:sz w:val="22"/>
+          <w:szCs w:val="22"/>
+          <w:rtl/>
+        </w:rPr>
+        <w:t xml:space="preserve">هر کندلی</w:t>
+      </w:r>
+      <w:r>
+        <w:rPr>
+          <w:rFonts w:ascii="Tahoma" w:cs="Tahoma" w:hAnsi="Tahoma"/>
+          <w:sz w:val="22"/>
+          <w:szCs w:val="22"/>
+          <w:rtl/>
+        </w:rPr>
+        <w:t xml:space="preserve"> می‌تواند باشد (دوجی، پین‌بار، نرمال یا ماروبوزو) ولی باید پایین‌تر از کندل ماروبوزو بسته شود: </w:t>
+      </w:r>
+      <w:r>
+        <w:rPr>
+          <w:rFonts w:ascii="Tahoma" w:cs="Tahoma" w:hAnsi="Tahoma"/>
+          <w:b/>
+          <w:bCs/>
+          <w:sz w:val="22"/>
+          <w:szCs w:val="22"/>
+          <w:rtl/>
+        </w:rPr>
+        <w:t xml:space="preserve">Close C2 پایین‌تر از Low C1</w:t>
+      </w:r>
+      <w:r>
+        <w:rPr>
+          <w:rFonts w:ascii="Tahoma" w:cs="Tahoma" w:hAnsi="Tahoma"/>
+          <w:sz w:val="22"/>
+          <w:szCs w:val="22"/>
+          <w:rtl/>
+        </w:rPr>
+        <w:t xml:space="preserve"> در روند صعودی، و برعکس در روند نزولی.</w:t>
       </w:r>
     </w:p>
     <w:p>
@@ -5927,7 +6207,7 @@
                 <w:szCs w:val="20"/>
                 <w:rtl/>
               </w:rPr>
-              <w:t xml:space="preserve">پولبک یا شکست خلاف جهت</w:t>
+              <w:t xml:space="preserve">پولبک (خلاف جهت)</w:t>
             </w:r>
           </w:p>
         </w:tc>
@@ -5961,49 +6241,7 @@
                 <w:szCs w:val="20"/>
                 <w:rtl/>
               </w:rPr>
-              <w:t xml:space="preserve">یک الگوی پولبک که </w:t>
-            </w:r>
-            <w:r>
-              <w:rPr>
-                <w:rFonts w:ascii="Tahoma" w:cs="Tahoma" w:hAnsi="Tahoma"/>
-                <w:b/>
-                <w:bCs/>
-                <w:sz w:val="20"/>
-                <w:szCs w:val="20"/>
-                <w:rtl/>
-              </w:rPr>
-              <w:t xml:space="preserve">کف فعلی را بشکند</w:t>
-            </w:r>
-            <w:r>
-              <w:rPr>
-                <w:rFonts w:ascii="Tahoma" w:cs="Tahoma" w:hAnsi="Tahoma"/>
-                <w:b w:val="false"/>
-                <w:sz w:val="20"/>
-                <w:szCs w:val="20"/>
-                <w:rtl/>
-              </w:rPr>
-              <w:t xml:space="preserve"> (همان قاعده‌ی بخش ۳-۳)، یا شکست واقعی </w:t>
-            </w:r>
-            <w:r>
-              <w:rPr>
-                <w:rFonts w:ascii="Tahoma" w:cs="Tahoma" w:hAnsi="Tahoma"/>
-                <w:b/>
-                <w:bCs/>
-                <w:sz w:val="20"/>
-                <w:szCs w:val="20"/>
-                <w:rtl/>
-              </w:rPr>
-              <w:t xml:space="preserve">زیر کف فعلی</w:t>
-            </w:r>
-            <w:r>
-              <w:rPr>
-                <w:rFonts w:ascii="Tahoma" w:cs="Tahoma" w:hAnsi="Tahoma"/>
-                <w:b w:val="false"/>
-                <w:sz w:val="20"/>
-                <w:szCs w:val="20"/>
-                <w:rtl/>
-              </w:rPr>
-              <w:t xml:space="preserve">.</w:t>
+              <w:t xml:space="preserve">فقط پولبکِ شکست کف رنج (بخش ۳-۳، بند ۲): دو کندل بیرون از باکس، ماروبوزوی اول دست‌کم ۵۰٪ بیرون، Close C2 زیر Low C1. شکست واقعی کف به‌تنهایی رنج را نمی‌بندد.</w:t>
             </w:r>
           </w:p>
         </w:tc>

</xml_diff>

<commit_message>
V18.3: range closes as Real Pullback by any of the 6 pullback patterns
A type 1-3 box now also closes against its leg (and the pullback counts)
when one of the 6 Real Pullback patterns breaks its current, expanded
boundary: rule 1 both closes beyond, rules 2/3 C1 closes beyond, 3-candle
patterns with the Real Breakout line test. The V18.2 rule stays as a
second way. Docs, Word file and simulator replica updated.

Co-Authored-By: Claude Opus 5.5 <noreply@anthropic.com>
Claude-Session: https://claude.ai/code/session_012ax4L7tKx6fogZS3qmV3Ae
</commit_message>
<xml_diff>
--- a/Code_Rules_As_Implemented_FA.docx
+++ b/Code_Rules_As_Implemented_FA.docx
@@ -16,7 +16,7 @@
           <w:szCs w:val="24"/>
           <w:rtl/>
         </w:rPr>
-        <w:t xml:space="preserve">SMC Follow Trend [Rohi] — نسخه‌ی V18.2</w:t>
+        <w:t xml:space="preserve">SMC Follow Trend [Rohi] — نسخه‌ی V18.3</w:t>
       </w:r>
     </w:p>
     <w:p>
@@ -4640,36 +4640,36 @@
           <w:szCs w:val="22"/>
           <w:rtl/>
         </w:rPr>
-        <w:t xml:space="preserve">فقط وقتی پولبک واقعی حساب می‌شود که کف رنج شکسته شود</w:t>
-      </w:r>
-      <w:r>
-        <w:rPr>
-          <w:rFonts w:ascii="Tahoma" w:cs="Tahoma" w:hAnsi="Tahoma"/>
-          <w:sz w:val="22"/>
-          <w:szCs w:val="22"/>
-          <w:rtl/>
-        </w:rPr>
-        <w:t xml:space="preserve">؛ وگرنه نویز داخل رنج است، نادیده گرفته می‌شود و باکس رنج گسترش می‌یابد. «شکستن کف و پولبک واقعی» زمانی است که </w:t>
-      </w:r>
-      <w:r>
-        <w:rPr>
-          <w:rFonts w:ascii="Tahoma" w:cs="Tahoma" w:hAnsi="Tahoma"/>
-          <w:b/>
-          <w:bCs/>
-          <w:sz w:val="22"/>
-          <w:szCs w:val="22"/>
-          <w:rtl/>
-        </w:rPr>
-        <w:t xml:space="preserve">هر سه مورد زیر دقیقاً با هم</w:t>
-      </w:r>
-      <w:r>
-        <w:rPr>
-          <w:rFonts w:ascii="Tahoma" w:cs="Tahoma" w:hAnsi="Tahoma"/>
-          <w:sz w:val="22"/>
-          <w:szCs w:val="22"/>
-          <w:rtl/>
-        </w:rPr>
-        <w:t xml:space="preserve"> اتفاق بیفتند:</w:t>
+        <w:t xml:space="preserve">فقط وقتی پولبک واقعی حساب می‌شود که سقف یا کف فعلی رنج (بعد از همه‌ی گسترش‌ها) با پولبک واقعی شکسته شود</w:t>
+      </w:r>
+      <w:r>
+        <w:rPr>
+          <w:rFonts w:ascii="Tahoma" w:cs="Tahoma" w:hAnsi="Tahoma"/>
+          <w:sz w:val="22"/>
+          <w:szCs w:val="22"/>
+          <w:rtl/>
+        </w:rPr>
+        <w:t xml:space="preserve">؛ وگرنه نویز داخل رنج است، نادیده گرفته می‌شود و باکس رنج گسترش می‌یابد. شکستن کف (روند صعودی؛ در روند نزولی قرینه با سقف) با </w:t>
+      </w:r>
+      <w:r>
+        <w:rPr>
+          <w:rFonts w:ascii="Tahoma" w:cs="Tahoma" w:hAnsi="Tahoma"/>
+          <w:b/>
+          <w:bCs/>
+          <w:sz w:val="22"/>
+          <w:szCs w:val="22"/>
+          <w:rtl/>
+        </w:rPr>
+        <w:t xml:space="preserve">یکی از این دو راه</w:t>
+      </w:r>
+      <w:r>
+        <w:rPr>
+          <w:rFonts w:ascii="Tahoma" w:cs="Tahoma" w:hAnsi="Tahoma"/>
+          <w:sz w:val="22"/>
+          <w:szCs w:val="22"/>
+          <w:rtl/>
+        </w:rPr>
+        <w:t xml:space="preserve"> است:</w:t>
       </w:r>
     </w:p>
     <w:p>
@@ -4692,16 +4692,36 @@
           <w:szCs w:val="22"/>
           <w:rtl/>
         </w:rPr>
-        <w:t xml:space="preserve">۲ کندل</w:t>
-      </w:r>
-      <w:r>
-        <w:rPr>
-          <w:rFonts w:ascii="Tahoma" w:cs="Tahoma" w:hAnsi="Tahoma"/>
-          <w:sz w:val="22"/>
-          <w:szCs w:val="22"/>
-          <w:rtl/>
-        </w:rPr>
-        <w:t xml:space="preserve"> باید از باکس رنج خارج شده باشند (Close هر دو بیرون از باکس).</w:t>
+        <w:t xml:space="preserve">راه الف (V18.3):</w:t>
+      </w:r>
+      <w:r>
+        <w:rPr>
+          <w:rFonts w:ascii="Tahoma" w:cs="Tahoma" w:hAnsi="Tahoma"/>
+          <w:sz w:val="22"/>
+          <w:szCs w:val="22"/>
+          <w:rtl/>
+        </w:rPr>
+        <w:t xml:space="preserve"> یکی از </w:t>
+      </w:r>
+      <w:r>
+        <w:rPr>
+          <w:rFonts w:ascii="Tahoma" w:cs="Tahoma" w:hAnsi="Tahoma"/>
+          <w:b/>
+          <w:bCs/>
+          <w:sz w:val="22"/>
+          <w:szCs w:val="22"/>
+          <w:rtl/>
+        </w:rPr>
+        <w:t xml:space="preserve">۶ الگوی پولبک واقعی</w:t>
+      </w:r>
+      <w:r>
+        <w:rPr>
+          <w:rFonts w:ascii="Tahoma" w:cs="Tahoma" w:hAnsi="Tahoma"/>
+          <w:sz w:val="22"/>
+          <w:szCs w:val="22"/>
+          <w:rtl/>
+        </w:rPr>
+        <w:t xml:space="preserve"> (سه شرط اصلی یا سه الگوی سه‌کندلی) کف فعلی را بشکند: شرط ۱ = Close هر دو کندل زیر کف؛ شرط ۲ و ۳ = Close C1 زیر کف؛ الگوهای سه‌کندلی = همان شرط خط بخش ۲-۲ (الف: Close C1 و C3 زیر کف؛ ب و ج: Close C3 زیر کف).</w:t>
       </w:r>
     </w:p>
     <w:p>
@@ -4718,11 +4738,22 @@
       <w:r>
         <w:rPr>
           <w:rFonts w:ascii="Tahoma" w:cs="Tahoma" w:hAnsi="Tahoma"/>
-          <w:sz w:val="22"/>
-          <w:szCs w:val="22"/>
-          <w:rtl/>
-        </w:rPr>
-        <w:t xml:space="preserve">کندل اول </w:t>
+          <w:b/>
+          <w:bCs/>
+          <w:sz w:val="22"/>
+          <w:szCs w:val="22"/>
+          <w:rtl/>
+        </w:rPr>
+        <w:t xml:space="preserve">راه ب (V18.2)، هر سه با هم:</w:t>
+      </w:r>
+      <w:r>
+        <w:rPr>
+          <w:rFonts w:ascii="Tahoma" w:cs="Tahoma" w:hAnsi="Tahoma"/>
+          <w:sz w:val="22"/>
+          <w:szCs w:val="22"/>
+          <w:rtl/>
+        </w:rPr>
+        <w:t xml:space="preserve"> ۲ کندل از باکس خارج شده باشند (Close هر دو بیرون)؛ کندل اول </w:t>
       </w:r>
       <w:r>
         <w:rPr>
@@ -4753,16 +4784,56 @@
           <w:szCs w:val="22"/>
           <w:rtl/>
         </w:rPr>
-        <w:t xml:space="preserve">دست‌کم ۵۰٪ طول</w:t>
-      </w:r>
-      <w:r>
-        <w:rPr>
-          <w:rFonts w:ascii="Tahoma" w:cs="Tahoma" w:hAnsi="Tahoma"/>
-          <w:sz w:val="22"/>
-          <w:szCs w:val="22"/>
-          <w:rtl/>
-        </w:rPr>
-        <w:t xml:space="preserve"> این ماروبوزو (High تا Low) از محدوده‌ی رنج خارج شود.</w:t>
+        <w:t xml:space="preserve">دست‌کم ۵۰٪ طولش</w:t>
+      </w:r>
+      <w:r>
+        <w:rPr>
+          <w:rFonts w:ascii="Tahoma" w:cs="Tahoma" w:hAnsi="Tahoma"/>
+          <w:sz w:val="22"/>
+          <w:szCs w:val="22"/>
+          <w:rtl/>
+        </w:rPr>
+        <w:t xml:space="preserve"> (High تا Low) بیرون از رنج باشد؛ کندل دوم </w:t>
+      </w:r>
+      <w:r>
+        <w:rPr>
+          <w:rFonts w:ascii="Tahoma" w:cs="Tahoma" w:hAnsi="Tahoma"/>
+          <w:b/>
+          <w:bCs/>
+          <w:sz w:val="22"/>
+          <w:szCs w:val="22"/>
+          <w:rtl/>
+        </w:rPr>
+        <w:t xml:space="preserve">هر کندلی</w:t>
+      </w:r>
+      <w:r>
+        <w:rPr>
+          <w:rFonts w:ascii="Tahoma" w:cs="Tahoma" w:hAnsi="Tahoma"/>
+          <w:sz w:val="22"/>
+          <w:szCs w:val="22"/>
+          <w:rtl/>
+        </w:rPr>
+        <w:t xml:space="preserve"> (دوجی، پین‌بار، نرمال یا ماروبوزو) ولی </w:t>
+      </w:r>
+      <w:r>
+        <w:rPr>
+          <w:rFonts w:ascii="Tahoma" w:cs="Tahoma" w:hAnsi="Tahoma"/>
+          <w:b/>
+          <w:bCs/>
+          <w:sz w:val="22"/>
+          <w:szCs w:val="22"/>
+          <w:rtl/>
+        </w:rPr>
+        <w:t xml:space="preserve">Close C2 پایین‌تر از Low C1</w:t>
+      </w:r>
+      <w:r>
+        <w:rPr>
+          <w:rFonts w:ascii="Tahoma" w:cs="Tahoma" w:hAnsi="Tahoma"/>
+          <w:sz w:val="22"/>
+          <w:szCs w:val="22"/>
+          <w:rtl/>
+        </w:rPr>
+        <w:t xml:space="preserve"> در روند صعودی، و برعکس در روند نزولی.</w:t>
       </w:r>
     </w:p>
     <w:p>
@@ -4783,47 +4854,7 @@
           <w:szCs w:val="22"/>
           <w:rtl/>
         </w:rPr>
-        <w:t xml:space="preserve">کندل دوم </w:t>
-      </w:r>
-      <w:r>
-        <w:rPr>
-          <w:rFonts w:ascii="Tahoma" w:cs="Tahoma" w:hAnsi="Tahoma"/>
-          <w:b/>
-          <w:bCs/>
-          <w:sz w:val="22"/>
-          <w:szCs w:val="22"/>
-          <w:rtl/>
-        </w:rPr>
-        <w:t xml:space="preserve">هر کندلی</w:t>
-      </w:r>
-      <w:r>
-        <w:rPr>
-          <w:rFonts w:ascii="Tahoma" w:cs="Tahoma" w:hAnsi="Tahoma"/>
-          <w:sz w:val="22"/>
-          <w:szCs w:val="22"/>
-          <w:rtl/>
-        </w:rPr>
-        <w:t xml:space="preserve"> می‌تواند باشد (دوجی، پین‌بار، نرمال یا ماروبوزو) ولی باید پایین‌تر از کندل ماروبوزو بسته شود: </w:t>
-      </w:r>
-      <w:r>
-        <w:rPr>
-          <w:rFonts w:ascii="Tahoma" w:cs="Tahoma" w:hAnsi="Tahoma"/>
-          <w:b/>
-          <w:bCs/>
-          <w:sz w:val="22"/>
-          <w:szCs w:val="22"/>
-          <w:rtl/>
-        </w:rPr>
-        <w:t xml:space="preserve">Close C2 پایین‌تر از Low C1</w:t>
-      </w:r>
-      <w:r>
-        <w:rPr>
-          <w:rFonts w:ascii="Tahoma" w:cs="Tahoma" w:hAnsi="Tahoma"/>
-          <w:sz w:val="22"/>
-          <w:szCs w:val="22"/>
-          <w:rtl/>
-        </w:rPr>
-        <w:t xml:space="preserve"> در روند صعودی، و برعکس در روند نزولی.</w:t>
+        <w:t xml:space="preserve">این تنها راه بسته شدن رنج نوع ۱ تا ۳ در خلاف جهت است؛ شکست واقعی کف (بخش ۲) به‌تنهایی رنج را نمی‌بندد.</w:t>
       </w:r>
     </w:p>
     <w:p>
@@ -6241,7 +6272,7 @@
                 <w:szCs w:val="20"/>
                 <w:rtl/>
               </w:rPr>
-              <w:t xml:space="preserve">فقط پولبکِ شکست کف رنج (بخش ۳-۳، بند ۲): دو کندل بیرون از باکس، ماروبوزوی اول دست‌کم ۵۰٪ بیرون، Close C2 زیر Low C1. شکست واقعی کف به‌تنهایی رنج را نمی‌بندد.</w:t>
+              <w:t xml:space="preserve">فقط پولبکی که کف فعلی رنج (بعد از همه‌ی گسترش‌ها) را بشکند (بخش ۳-۳، بند ۲): یکی از ۶ الگوی پولبک واقعی، یا ماروبوزوی دست‌کم ۵۰٪ بیرون + Close C2 زیر Low C1. شکست واقعی کف به‌تنهایی رنج را نمی‌بندد.</w:t>
             </w:r>
           </w:p>
         </w:tc>

</xml_diff>

<commit_message>
Revert V18.3: back to V18.2 (user request)
Co-Authored-By: Claude Opus 5.5 <noreply@anthropic.com>
Claude-Session: https://claude.ai/code/session_012ax4L7tKx6fogZS3qmV3Ae
</commit_message>
<xml_diff>
--- a/Code_Rules_As_Implemented_FA.docx
+++ b/Code_Rules_As_Implemented_FA.docx
@@ -16,7 +16,7 @@
           <w:szCs w:val="24"/>
           <w:rtl/>
         </w:rPr>
-        <w:t xml:space="preserve">SMC Follow Trend [Rohi] — نسخه‌ی V18.3</w:t>
+        <w:t xml:space="preserve">SMC Follow Trend [Rohi] — نسخه‌ی V18.2</w:t>
       </w:r>
     </w:p>
     <w:p>
@@ -4640,36 +4640,36 @@
           <w:szCs w:val="22"/>
           <w:rtl/>
         </w:rPr>
-        <w:t xml:space="preserve">فقط وقتی پولبک واقعی حساب می‌شود که سقف یا کف فعلی رنج (بعد از همه‌ی گسترش‌ها) با پولبک واقعی شکسته شود</w:t>
-      </w:r>
-      <w:r>
-        <w:rPr>
-          <w:rFonts w:ascii="Tahoma" w:cs="Tahoma" w:hAnsi="Tahoma"/>
-          <w:sz w:val="22"/>
-          <w:szCs w:val="22"/>
-          <w:rtl/>
-        </w:rPr>
-        <w:t xml:space="preserve">؛ وگرنه نویز داخل رنج است، نادیده گرفته می‌شود و باکس رنج گسترش می‌یابد. شکستن کف (روند صعودی؛ در روند نزولی قرینه با سقف) با </w:t>
-      </w:r>
-      <w:r>
-        <w:rPr>
-          <w:rFonts w:ascii="Tahoma" w:cs="Tahoma" w:hAnsi="Tahoma"/>
-          <w:b/>
-          <w:bCs/>
-          <w:sz w:val="22"/>
-          <w:szCs w:val="22"/>
-          <w:rtl/>
-        </w:rPr>
-        <w:t xml:space="preserve">یکی از این دو راه</w:t>
-      </w:r>
-      <w:r>
-        <w:rPr>
-          <w:rFonts w:ascii="Tahoma" w:cs="Tahoma" w:hAnsi="Tahoma"/>
-          <w:sz w:val="22"/>
-          <w:szCs w:val="22"/>
-          <w:rtl/>
-        </w:rPr>
-        <w:t xml:space="preserve"> است:</w:t>
+        <w:t xml:space="preserve">فقط وقتی پولبک واقعی حساب می‌شود که کف رنج شکسته شود</w:t>
+      </w:r>
+      <w:r>
+        <w:rPr>
+          <w:rFonts w:ascii="Tahoma" w:cs="Tahoma" w:hAnsi="Tahoma"/>
+          <w:sz w:val="22"/>
+          <w:szCs w:val="22"/>
+          <w:rtl/>
+        </w:rPr>
+        <w:t xml:space="preserve">؛ وگرنه نویز داخل رنج است، نادیده گرفته می‌شود و باکس رنج گسترش می‌یابد. «شکستن کف و پولبک واقعی» زمانی است که </w:t>
+      </w:r>
+      <w:r>
+        <w:rPr>
+          <w:rFonts w:ascii="Tahoma" w:cs="Tahoma" w:hAnsi="Tahoma"/>
+          <w:b/>
+          <w:bCs/>
+          <w:sz w:val="22"/>
+          <w:szCs w:val="22"/>
+          <w:rtl/>
+        </w:rPr>
+        <w:t xml:space="preserve">هر سه مورد زیر دقیقاً با هم</w:t>
+      </w:r>
+      <w:r>
+        <w:rPr>
+          <w:rFonts w:ascii="Tahoma" w:cs="Tahoma" w:hAnsi="Tahoma"/>
+          <w:sz w:val="22"/>
+          <w:szCs w:val="22"/>
+          <w:rtl/>
+        </w:rPr>
+        <w:t xml:space="preserve"> اتفاق بیفتند:</w:t>
       </w:r>
     </w:p>
     <w:p>
@@ -4692,36 +4692,16 @@
           <w:szCs w:val="22"/>
           <w:rtl/>
         </w:rPr>
-        <w:t xml:space="preserve">راه الف (V18.3):</w:t>
-      </w:r>
-      <w:r>
-        <w:rPr>
-          <w:rFonts w:ascii="Tahoma" w:cs="Tahoma" w:hAnsi="Tahoma"/>
-          <w:sz w:val="22"/>
-          <w:szCs w:val="22"/>
-          <w:rtl/>
-        </w:rPr>
-        <w:t xml:space="preserve"> یکی از </w:t>
-      </w:r>
-      <w:r>
-        <w:rPr>
-          <w:rFonts w:ascii="Tahoma" w:cs="Tahoma" w:hAnsi="Tahoma"/>
-          <w:b/>
-          <w:bCs/>
-          <w:sz w:val="22"/>
-          <w:szCs w:val="22"/>
-          <w:rtl/>
-        </w:rPr>
-        <w:t xml:space="preserve">۶ الگوی پولبک واقعی</w:t>
-      </w:r>
-      <w:r>
-        <w:rPr>
-          <w:rFonts w:ascii="Tahoma" w:cs="Tahoma" w:hAnsi="Tahoma"/>
-          <w:sz w:val="22"/>
-          <w:szCs w:val="22"/>
-          <w:rtl/>
-        </w:rPr>
-        <w:t xml:space="preserve"> (سه شرط اصلی یا سه الگوی سه‌کندلی) کف فعلی را بشکند: شرط ۱ = Close هر دو کندل زیر کف؛ شرط ۲ و ۳ = Close C1 زیر کف؛ الگوهای سه‌کندلی = همان شرط خط بخش ۲-۲ (الف: Close C1 و C3 زیر کف؛ ب و ج: Close C3 زیر کف).</w:t>
+        <w:t xml:space="preserve">۲ کندل</w:t>
+      </w:r>
+      <w:r>
+        <w:rPr>
+          <w:rFonts w:ascii="Tahoma" w:cs="Tahoma" w:hAnsi="Tahoma"/>
+          <w:sz w:val="22"/>
+          <w:szCs w:val="22"/>
+          <w:rtl/>
+        </w:rPr>
+        <w:t xml:space="preserve"> باید از باکس رنج خارج شده باشند (Close هر دو بیرون از باکس).</w:t>
       </w:r>
     </w:p>
     <w:p>
@@ -4738,22 +4718,11 @@
       <w:r>
         <w:rPr>
           <w:rFonts w:ascii="Tahoma" w:cs="Tahoma" w:hAnsi="Tahoma"/>
-          <w:b/>
-          <w:bCs/>
-          <w:sz w:val="22"/>
-          <w:szCs w:val="22"/>
-          <w:rtl/>
-        </w:rPr>
-        <w:t xml:space="preserve">راه ب (V18.2)، هر سه با هم:</w:t>
-      </w:r>
-      <w:r>
-        <w:rPr>
-          <w:rFonts w:ascii="Tahoma" w:cs="Tahoma" w:hAnsi="Tahoma"/>
-          <w:sz w:val="22"/>
-          <w:szCs w:val="22"/>
-          <w:rtl/>
-        </w:rPr>
-        <w:t xml:space="preserve"> ۲ کندل از باکس خارج شده باشند (Close هر دو بیرون)؛ کندل اول </w:t>
+          <w:sz w:val="22"/>
+          <w:szCs w:val="22"/>
+          <w:rtl/>
+        </w:rPr>
+        <w:t xml:space="preserve">کندل اول </w:t>
       </w:r>
       <w:r>
         <w:rPr>
@@ -4784,56 +4753,16 @@
           <w:szCs w:val="22"/>
           <w:rtl/>
         </w:rPr>
-        <w:t xml:space="preserve">دست‌کم ۵۰٪ طولش</w:t>
-      </w:r>
-      <w:r>
-        <w:rPr>
-          <w:rFonts w:ascii="Tahoma" w:cs="Tahoma" w:hAnsi="Tahoma"/>
-          <w:sz w:val="22"/>
-          <w:szCs w:val="22"/>
-          <w:rtl/>
-        </w:rPr>
-        <w:t xml:space="preserve"> (High تا Low) بیرون از رنج باشد؛ کندل دوم </w:t>
-      </w:r>
-      <w:r>
-        <w:rPr>
-          <w:rFonts w:ascii="Tahoma" w:cs="Tahoma" w:hAnsi="Tahoma"/>
-          <w:b/>
-          <w:bCs/>
-          <w:sz w:val="22"/>
-          <w:szCs w:val="22"/>
-          <w:rtl/>
-        </w:rPr>
-        <w:t xml:space="preserve">هر کندلی</w:t>
-      </w:r>
-      <w:r>
-        <w:rPr>
-          <w:rFonts w:ascii="Tahoma" w:cs="Tahoma" w:hAnsi="Tahoma"/>
-          <w:sz w:val="22"/>
-          <w:szCs w:val="22"/>
-          <w:rtl/>
-        </w:rPr>
-        <w:t xml:space="preserve"> (دوجی، پین‌بار، نرمال یا ماروبوزو) ولی </w:t>
-      </w:r>
-      <w:r>
-        <w:rPr>
-          <w:rFonts w:ascii="Tahoma" w:cs="Tahoma" w:hAnsi="Tahoma"/>
-          <w:b/>
-          <w:bCs/>
-          <w:sz w:val="22"/>
-          <w:szCs w:val="22"/>
-          <w:rtl/>
-        </w:rPr>
-        <w:t xml:space="preserve">Close C2 پایین‌تر از Low C1</w:t>
-      </w:r>
-      <w:r>
-        <w:rPr>
-          <w:rFonts w:ascii="Tahoma" w:cs="Tahoma" w:hAnsi="Tahoma"/>
-          <w:sz w:val="22"/>
-          <w:szCs w:val="22"/>
-          <w:rtl/>
-        </w:rPr>
-        <w:t xml:space="preserve"> در روند صعودی، و برعکس در روند نزولی.</w:t>
+        <w:t xml:space="preserve">دست‌کم ۵۰٪ طول</w:t>
+      </w:r>
+      <w:r>
+        <w:rPr>
+          <w:rFonts w:ascii="Tahoma" w:cs="Tahoma" w:hAnsi="Tahoma"/>
+          <w:sz w:val="22"/>
+          <w:szCs w:val="22"/>
+          <w:rtl/>
+        </w:rPr>
+        <w:t xml:space="preserve"> این ماروبوزو (High تا Low) از محدوده‌ی رنج خارج شود.</w:t>
       </w:r>
     </w:p>
     <w:p>
@@ -4854,7 +4783,47 @@
           <w:szCs w:val="22"/>
           <w:rtl/>
         </w:rPr>
-        <w:t xml:space="preserve">این تنها راه بسته شدن رنج نوع ۱ تا ۳ در خلاف جهت است؛ شکست واقعی کف (بخش ۲) به‌تنهایی رنج را نمی‌بندد.</w:t>
+        <w:t xml:space="preserve">کندل دوم </w:t>
+      </w:r>
+      <w:r>
+        <w:rPr>
+          <w:rFonts w:ascii="Tahoma" w:cs="Tahoma" w:hAnsi="Tahoma"/>
+          <w:b/>
+          <w:bCs/>
+          <w:sz w:val="22"/>
+          <w:szCs w:val="22"/>
+          <w:rtl/>
+        </w:rPr>
+        <w:t xml:space="preserve">هر کندلی</w:t>
+      </w:r>
+      <w:r>
+        <w:rPr>
+          <w:rFonts w:ascii="Tahoma" w:cs="Tahoma" w:hAnsi="Tahoma"/>
+          <w:sz w:val="22"/>
+          <w:szCs w:val="22"/>
+          <w:rtl/>
+        </w:rPr>
+        <w:t xml:space="preserve"> می‌تواند باشد (دوجی، پین‌بار، نرمال یا ماروبوزو) ولی باید پایین‌تر از کندل ماروبوزو بسته شود: </w:t>
+      </w:r>
+      <w:r>
+        <w:rPr>
+          <w:rFonts w:ascii="Tahoma" w:cs="Tahoma" w:hAnsi="Tahoma"/>
+          <w:b/>
+          <w:bCs/>
+          <w:sz w:val="22"/>
+          <w:szCs w:val="22"/>
+          <w:rtl/>
+        </w:rPr>
+        <w:t xml:space="preserve">Close C2 پایین‌تر از Low C1</w:t>
+      </w:r>
+      <w:r>
+        <w:rPr>
+          <w:rFonts w:ascii="Tahoma" w:cs="Tahoma" w:hAnsi="Tahoma"/>
+          <w:sz w:val="22"/>
+          <w:szCs w:val="22"/>
+          <w:rtl/>
+        </w:rPr>
+        <w:t xml:space="preserve"> در روند صعودی، و برعکس در روند نزولی.</w:t>
       </w:r>
     </w:p>
     <w:p>
@@ -6272,7 +6241,7 @@
                 <w:szCs w:val="20"/>
                 <w:rtl/>
               </w:rPr>
-              <w:t xml:space="preserve">فقط پولبکی که کف فعلی رنج (بعد از همه‌ی گسترش‌ها) را بشکند (بخش ۳-۳، بند ۲): یکی از ۶ الگوی پولبک واقعی، یا ماروبوزوی دست‌کم ۵۰٪ بیرون + Close C2 زیر Low C1. شکست واقعی کف به‌تنهایی رنج را نمی‌بندد.</w:t>
+              <w:t xml:space="preserve">فقط پولبکِ شکست کف رنج (بخش ۳-۳، بند ۲): دو کندل بیرون از باکس، ماروبوزوی اول دست‌کم ۵۰٪ بیرون، Close C2 زیر Low C1. شکست واقعی کف به‌تنهایی رنج را نمی‌بندد.</w:t>
             </w:r>
           </w:p>
         </w:tc>

</xml_diff>

<commit_message>
V18.4: FBO box from the wave top, never closed on its CTS side (image 85)
- The type-4 (FBO) box is drawn from the wave top / bottom (H*) that
  became the CTS line, between the CTS line and the fake highs
- Price falling back below the CTS line (even far) no longer closes it;
  it ends only by a Real Breakout of its far side or a CTS / trend change
- Docs, Word file and simulator replica updated

Co-Authored-By: Claude Opus 5.5 <noreply@anthropic.com>
Claude-Session: https://claude.ai/code/session_012ax4L7tKx6fogZS3qmV3Ae
</commit_message>
<xml_diff>
--- a/Code_Rules_As_Implemented_FA.docx
+++ b/Code_Rules_As_Implemented_FA.docx
@@ -16,7 +16,7 @@
           <w:szCs w:val="24"/>
           <w:rtl/>
         </w:rPr>
-        <w:t xml:space="preserve">SMC Follow Trend [Rohi] — نسخه‌ی V18.2</w:t>
+        <w:t xml:space="preserve">SMC Follow Trend [Rohi] — نسخه‌ی V18.4</w:t>
       </w:r>
     </w:p>
     <w:p>
@@ -6557,33 +6557,23 @@
             <w:r>
               <w:rPr>
                 <w:rFonts w:ascii="Tahoma" w:cs="Tahoma" w:hAnsi="Tahoma"/>
-                <w:b w:val="false"/>
-                <w:sz w:val="20"/>
-                <w:szCs w:val="20"/>
-                <w:rtl/>
-              </w:rPr>
-              <w:t xml:space="preserve">فقط شکست واقعی </w:t>
-            </w:r>
-            <w:r>
-              <w:rPr>
-                <w:rFonts w:ascii="Tahoma" w:cs="Tahoma" w:hAnsi="Tahoma"/>
                 <w:b/>
                 <w:bCs/>
                 <w:sz w:val="20"/>
                 <w:szCs w:val="20"/>
                 <w:rtl/>
               </w:rPr>
-              <w:t xml:space="preserve">طرف دور</w:t>
-            </w:r>
-            <w:r>
-              <w:rPr>
-                <w:rFonts w:ascii="Tahoma" w:cs="Tahoma" w:hAnsi="Tahoma"/>
-                <w:b w:val="false"/>
-                <w:sz w:val="20"/>
-                <w:szCs w:val="20"/>
-                <w:rtl/>
-              </w:rPr>
-              <w:t xml:space="preserve"> (سقف فیک‌ها)، یا شکست واقعی </w:t>
+              <w:t xml:space="preserve">فقط</w:t>
+            </w:r>
+            <w:r>
+              <w:rPr>
+                <w:rFonts w:ascii="Tahoma" w:cs="Tahoma" w:hAnsi="Tahoma"/>
+                <w:b w:val="false"/>
+                <w:sz w:val="20"/>
+                <w:szCs w:val="20"/>
+                <w:rtl/>
+              </w:rPr>
+              <w:t xml:space="preserve"> شکست واقعی </w:t>
             </w:r>
             <w:r>
               <w:rPr>
@@ -6594,17 +6584,17 @@
                 <w:szCs w:val="20"/>
                 <w:rtl/>
               </w:rPr>
-              <w:t xml:space="preserve">خط CTS در جهت مخالف</w:t>
-            </w:r>
-            <w:r>
-              <w:rPr>
-                <w:rFonts w:ascii="Tahoma" w:cs="Tahoma" w:hAnsi="Tahoma"/>
-                <w:b w:val="false"/>
-                <w:sz w:val="20"/>
-                <w:szCs w:val="20"/>
-                <w:rtl/>
-              </w:rPr>
-              <w:t xml:space="preserve">.</w:t>
+              <w:t xml:space="preserve">طرف دور</w:t>
+            </w:r>
+            <w:r>
+              <w:rPr>
+                <w:rFonts w:ascii="Tahoma" w:cs="Tahoma" w:hAnsi="Tahoma"/>
+                <w:b w:val="false"/>
+                <w:sz w:val="20"/>
+                <w:szCs w:val="20"/>
+                <w:rtl/>
+              </w:rPr>
+              <w:t xml:space="preserve"> (سقف فیک‌ها)، یا CTS / تغییر روند. برگشت قیمت به زیر خط CTS، حتی خیلی پایین، باکس را نمی‌بندد (V18.4، تصویر ۸۵).</w:t>
             </w:r>
           </w:p>
         </w:tc>
@@ -7063,27 +7053,68 @@
           <w:szCs w:val="22"/>
           <w:rtl/>
         </w:rPr>
-        <w:t xml:space="preserve">از همان کندل شروع می‌شود؛ </w:t>
-      </w:r>
-      <w:r>
-        <w:rPr>
-          <w:rFonts w:ascii="Tahoma" w:cs="Tahoma" w:hAnsi="Tahoma"/>
-          <w:b/>
-          <w:bCs/>
-          <w:sz w:val="22"/>
-          <w:szCs w:val="22"/>
-          <w:rtl/>
-        </w:rPr>
-        <w:t xml:space="preserve">از خط CTS تا High همان کندل</w:t>
-      </w:r>
-      <w:r>
-        <w:rPr>
-          <w:rFonts w:ascii="Tahoma" w:cs="Tahoma" w:hAnsi="Tahoma"/>
-          <w:sz w:val="22"/>
-          <w:szCs w:val="22"/>
-          <w:rtl/>
-        </w:rPr>
-        <w:t xml:space="preserve">.</w:t>
+        <w:t xml:space="preserve">از **کندل سقف موج (H*)</w:t>
+      </w:r>
+      <w:r>
+        <w:rPr>
+          <w:rFonts w:ascii="Tahoma" w:cs="Tahoma" w:hAnsi="Tahoma"/>
+          <w:b/>
+          <w:bCs/>
+          <w:sz w:val="22"/>
+          <w:szCs w:val="22"/>
+          <w:rtl/>
+        </w:rPr>
+        <w:t xml:space="preserve"> که خط CTS از آن آمده شروع می‌شود (V18.4، تصویر ۸۵)؛ </w:t>
+      </w:r>
+      <w:r>
+        <w:rPr>
+          <w:rFonts w:ascii="Tahoma" w:cs="Tahoma" w:hAnsi="Tahoma"/>
+          <w:sz w:val="22"/>
+          <w:szCs w:val="22"/>
+          <w:rtl/>
+        </w:rPr>
+        <w:t xml:space="preserve">از خط CTS تا High کندل شروع FBO**.</w:t>
+      </w:r>
+    </w:p>
+    <w:p>
+      <w:pPr>
+        <w:pStyle w:val="ListParagraph"/>
+        <w:numPr>
+          <w:ilvl w:val="0"/>
+          <w:numId w:val="2"/>
+        </w:numPr>
+        <w:bidi/>
+        <w:spacing w:after="80" w:line="300"/>
+        <w:jc w:val="both"/>
+      </w:pPr>
+      <w:r>
+        <w:rPr>
+          <w:rFonts w:ascii="Tahoma" w:cs="Tahoma" w:hAnsi="Tahoma"/>
+          <w:sz w:val="22"/>
+          <w:szCs w:val="22"/>
+          <w:rtl/>
+        </w:rPr>
+        <w:t xml:space="preserve">وقتی قیمت به زیر خط CTS برمی‌گردد (حتی خیلی پایین)، باکس </w:t>
+      </w:r>
+      <w:r>
+        <w:rPr>
+          <w:rFonts w:ascii="Tahoma" w:cs="Tahoma" w:hAnsi="Tahoma"/>
+          <w:b/>
+          <w:bCs/>
+          <w:sz w:val="22"/>
+          <w:szCs w:val="22"/>
+          <w:rtl/>
+        </w:rPr>
+        <w:t xml:space="preserve">باز می‌ماند</w:t>
+      </w:r>
+      <w:r>
+        <w:rPr>
+          <w:rFonts w:ascii="Tahoma" w:cs="Tahoma" w:hAnsi="Tahoma"/>
+          <w:sz w:val="22"/>
+          <w:szCs w:val="22"/>
+          <w:rtl/>
+        </w:rPr>
+        <w:t xml:space="preserve"> و منتظر شکست واقعی سقف خود می‌ماند.</w:t>
       </w:r>
     </w:p>
     <w:p>

</xml_diff>

<commit_message>
V18.5: range start by a mother candle and 3 trapped closes (images 86-90)
- A range is confirmed no earlier than the 3rd candle: the closes of the
  next 3 candles (setting 3-5) stay inside the mother candle's High-Low
  and none of them completes a 2- or 3-candle Real Breakout / Real
  Pullback pattern (either direction)
- Mother candle = any candle; type 3 = impulse-candle rule (the last
  candle of the move, followed by a counter candle)
- Box from the mother candle, bounds = extremes of the 4 candles
- Docs, Word file, simulator replica and tests updated

Co-Authored-By: Claude Opus 5.5 <noreply@anthropic.com>
Claude-Session: https://claude.ai/code/session_012ax4L7tKx6fogZS3qmV3Ae
</commit_message>
<xml_diff>
--- a/Code_Rules_As_Implemented_FA.docx
+++ b/Code_Rules_As_Implemented_FA.docx
@@ -16,7 +16,7 @@
           <w:szCs w:val="24"/>
           <w:rtl/>
         </w:rPr>
-        <w:t xml:space="preserve">SMC Follow Trend [Rohi] — نسخه‌ی V18.4</w:t>
+        <w:t xml:space="preserve">SMC Follow Trend [Rohi] — نسخه‌ی V18.5</w:t>
       </w:r>
     </w:p>
     <w:p>
@@ -5207,27 +5207,7 @@
           <w:szCs w:val="26"/>
           <w:rtl/>
         </w:rPr>
-        <w:t xml:space="preserve">۴-۲) چهار نوع شروع رنج</w:t>
-      </w:r>
-    </w:p>
-    <w:p>
-      <w:pPr>
-        <w:pStyle w:val="Heading3"/>
-        <w:bidi/>
-        <w:spacing w:after="80" w:before="180"/>
-        <w:jc w:val="right"/>
-      </w:pPr>
-      <w:r>
-        <w:rPr>
-          <w:rFonts w:ascii="Tahoma" w:cs="Tahoma" w:hAnsi="Tahoma"/>
-          <w:b/>
-          <w:bCs/>
-          <w:color w:val="385723"/>
-          <w:sz w:val="23"/>
-          <w:szCs w:val="23"/>
-          <w:rtl/>
-        </w:rPr>
-        <w:t xml:space="preserve">نوع ۳ — پولبک نامعتبر (برچسب «3»)</w:t>
+        <w:t xml:space="preserve">۴-۲) شروع رنج (V18.5، تصاویر ۸۶ تا ۹۰)</w:t>
       </w:r>
     </w:p>
     <w:p>
@@ -5243,27 +5223,27 @@
           <w:szCs w:val="22"/>
           <w:rtl/>
         </w:rPr>
-        <w:t xml:space="preserve">وقتی آخرین حرکت صعودی است، رنج نوع ۳ شروع می‌شود اگر </w:t>
-      </w:r>
-      <w:r>
-        <w:rPr>
-          <w:rFonts w:ascii="Tahoma" w:cs="Tahoma" w:hAnsi="Tahoma"/>
-          <w:b/>
-          <w:bCs/>
-          <w:sz w:val="22"/>
-          <w:szCs w:val="22"/>
-          <w:rtl/>
-        </w:rPr>
-        <w:t xml:space="preserve">همه‌ی</w:t>
-      </w:r>
-      <w:r>
-        <w:rPr>
-          <w:rFonts w:ascii="Tahoma" w:cs="Tahoma" w:hAnsi="Tahoma"/>
-          <w:sz w:val="22"/>
-          <w:szCs w:val="22"/>
-          <w:rtl/>
-        </w:rPr>
-        <w:t xml:space="preserve"> این شرط‌ها برقرار باشد:</w:t>
+        <w:t xml:space="preserve">قاعده‌ی مشترک (تصویر ۸۷): «Close price is still running within a single candle after 2–5 candles». رنج فقط وقتی تأیید می‌شود که </w:t>
+      </w:r>
+      <w:r>
+        <w:rPr>
+          <w:rFonts w:ascii="Tahoma" w:cs="Tahoma" w:hAnsi="Tahoma"/>
+          <w:b/>
+          <w:bCs/>
+          <w:sz w:val="22"/>
+          <w:szCs w:val="22"/>
+          <w:rtl/>
+        </w:rPr>
+        <w:t xml:space="preserve">هر دو شرط</w:t>
+      </w:r>
+      <w:r>
+        <w:rPr>
+          <w:rFonts w:ascii="Tahoma" w:cs="Tahoma" w:hAnsi="Tahoma"/>
+          <w:sz w:val="22"/>
+          <w:szCs w:val="22"/>
+          <w:rtl/>
+        </w:rPr>
+        <w:t xml:space="preserve"> با هم برقرار باشند:</w:t>
       </w:r>
     </w:p>
     <w:p>
@@ -5280,31 +5260,82 @@
       <w:r>
         <w:rPr>
           <w:rFonts w:ascii="Tahoma" w:cs="Tahoma" w:hAnsi="Tahoma"/>
-          <w:sz w:val="22"/>
-          <w:szCs w:val="22"/>
-          <w:rtl/>
-        </w:rPr>
-        <w:t xml:space="preserve">کندل قبلی (C1) </w:t>
-      </w:r>
-      <w:r>
-        <w:rPr>
-          <w:rFonts w:ascii="Tahoma" w:cs="Tahoma" w:hAnsi="Tahoma"/>
-          <w:b/>
-          <w:bCs/>
-          <w:sz w:val="22"/>
-          <w:szCs w:val="22"/>
-          <w:rtl/>
-        </w:rPr>
-        <w:t xml:space="preserve">نزولی</w:t>
-      </w:r>
-      <w:r>
-        <w:rPr>
-          <w:rFonts w:ascii="Tahoma" w:cs="Tahoma" w:hAnsi="Tahoma"/>
-          <w:sz w:val="22"/>
-          <w:szCs w:val="22"/>
-          <w:rtl/>
-        </w:rPr>
-        <w:t xml:space="preserve"> باشد (کندل خلاف جهت حرکت).</w:t>
+          <w:b/>
+          <w:bCs/>
+          <w:sz w:val="22"/>
+          <w:szCs w:val="22"/>
+          <w:rtl/>
+        </w:rPr>
+        <w:t xml:space="preserve">کندل مادر</w:t>
+      </w:r>
+      <w:r>
+        <w:rPr>
+          <w:rFonts w:ascii="Tahoma" w:cs="Tahoma" w:hAnsi="Tahoma"/>
+          <w:sz w:val="22"/>
+          <w:szCs w:val="22"/>
+          <w:rtl/>
+        </w:rPr>
+        <w:t xml:space="preserve"> = </w:t>
+      </w:r>
+      <w:r>
+        <w:rPr>
+          <w:rFonts w:ascii="Tahoma" w:cs="Tahoma" w:hAnsi="Tahoma"/>
+          <w:b/>
+          <w:bCs/>
+          <w:sz w:val="22"/>
+          <w:szCs w:val="22"/>
+          <w:rtl/>
+        </w:rPr>
+        <w:t xml:space="preserve">هر کندلی</w:t>
+      </w:r>
+      <w:r>
+        <w:rPr>
+          <w:rFonts w:ascii="Tahoma" w:cs="Tahoma" w:hAnsi="Tahoma"/>
+          <w:sz w:val="22"/>
+          <w:szCs w:val="22"/>
+          <w:rtl/>
+        </w:rPr>
+        <w:t xml:space="preserve"> (هر نوع و هر اندازه، هم‌جهت یا خلاف جهت روند). رنج </w:t>
+      </w:r>
+      <w:r>
+        <w:rPr>
+          <w:rFonts w:ascii="Tahoma" w:cs="Tahoma" w:hAnsi="Tahoma"/>
+          <w:b/>
+          <w:bCs/>
+          <w:sz w:val="22"/>
+          <w:szCs w:val="22"/>
+          <w:rtl/>
+        </w:rPr>
+        <w:t xml:space="preserve">زودتر از کندل سوم تأیید نمی‌شود</w:t>
+      </w:r>
+      <w:r>
+        <w:rPr>
+          <w:rFonts w:ascii="Tahoma" w:cs="Tahoma" w:hAnsi="Tahoma"/>
+          <w:sz w:val="22"/>
+          <w:szCs w:val="22"/>
+          <w:rtl/>
+        </w:rPr>
+        <w:t xml:space="preserve">: Close </w:t>
+      </w:r>
+      <w:r>
+        <w:rPr>
+          <w:rFonts w:ascii="Tahoma" w:cs="Tahoma" w:hAnsi="Tahoma"/>
+          <w:b/>
+          <w:bCs/>
+          <w:sz w:val="22"/>
+          <w:szCs w:val="22"/>
+          <w:rtl/>
+        </w:rPr>
+        <w:t xml:space="preserve">۳ کندل بعدی</w:t>
+      </w:r>
+      <w:r>
+        <w:rPr>
+          <w:rFonts w:ascii="Tahoma" w:cs="Tahoma" w:hAnsi="Tahoma"/>
+          <w:sz w:val="22"/>
+          <w:szCs w:val="22"/>
+          <w:rtl/>
+        </w:rPr>
+        <w:t xml:space="preserve"> (تنظیم: ۳ تا ۵) همه داخل High و Low کندل مادر باشد؛ سایه می‌تواند بیرون برود.</w:t>
       </w:r>
     </w:p>
     <w:p>
@@ -5325,27 +5356,27 @@
           <w:szCs w:val="22"/>
           <w:rtl/>
         </w:rPr>
-        <w:t xml:space="preserve">کندل جاری (C2) </w:t>
-      </w:r>
-      <w:r>
-        <w:rPr>
-          <w:rFonts w:ascii="Tahoma" w:cs="Tahoma" w:hAnsi="Tahoma"/>
-          <w:b/>
-          <w:bCs/>
-          <w:sz w:val="22"/>
-          <w:szCs w:val="22"/>
-          <w:rtl/>
-        </w:rPr>
-        <w:t xml:space="preserve">بالاتر از سقف موج بسته نشود</w:t>
-      </w:r>
-      <w:r>
-        <w:rPr>
-          <w:rFonts w:ascii="Tahoma" w:cs="Tahoma" w:hAnsi="Tahoma"/>
-          <w:sz w:val="22"/>
-          <w:szCs w:val="22"/>
-          <w:rtl/>
-        </w:rPr>
-        <w:t xml:space="preserve">. سقف موج = بالاترین High موج فعلی، اگر سقف هنوز قفل نشده؛ اگر قفل شده باشد، همان High کندل C1.</w:t>
+        <w:t xml:space="preserve">روی هیچ‌کدام از این ۳ کندل </w:t>
+      </w:r>
+      <w:r>
+        <w:rPr>
+          <w:rFonts w:ascii="Tahoma" w:cs="Tahoma" w:hAnsi="Tahoma"/>
+          <w:b/>
+          <w:bCs/>
+          <w:sz w:val="22"/>
+          <w:szCs w:val="22"/>
+          <w:rtl/>
+        </w:rPr>
+        <w:t xml:space="preserve">هیچ الگوی دوکندلی یا سه‌کندلی شکست واقعی یا پولبک واقعی</w:t>
+      </w:r>
+      <w:r>
+        <w:rPr>
+          <w:rFonts w:ascii="Tahoma" w:cs="Tahoma" w:hAnsi="Tahoma"/>
+          <w:sz w:val="22"/>
+          <w:szCs w:val="22"/>
+          <w:rtl/>
+        </w:rPr>
+        <w:t xml:space="preserve"> (در هیچ جهتی) کامل نشده باشد. الگوهای شکست بدون شرط خط سنجیده می‌شوند (فقط شکل کندل‌ها).</w:t>
       </w:r>
     </w:p>
     <w:p>
@@ -5353,7 +5384,7 @@
         <w:pStyle w:val="ListParagraph"/>
         <w:numPr>
           <w:ilvl w:val="0"/>
-          <w:numId w:val="6"/>
+          <w:numId w:val="2"/>
         </w:numPr>
         <w:bidi/>
         <w:spacing w:after="80" w:line="300"/>
@@ -5366,27 +5397,7 @@
           <w:szCs w:val="22"/>
           <w:rtl/>
         </w:rPr>
-        <w:t xml:space="preserve">روی کندل جاری و کندل قبلی </w:t>
-      </w:r>
-      <w:r>
-        <w:rPr>
-          <w:rFonts w:ascii="Tahoma" w:cs="Tahoma" w:hAnsi="Tahoma"/>
-          <w:b/>
-          <w:bCs/>
-          <w:sz w:val="22"/>
-          <w:szCs w:val="22"/>
-          <w:rtl/>
-        </w:rPr>
-        <w:t xml:space="preserve">هیچ الگوی پولبک نزولی</w:t>
-      </w:r>
-      <w:r>
-        <w:rPr>
-          <w:rFonts w:ascii="Tahoma" w:cs="Tahoma" w:hAnsi="Tahoma"/>
-          <w:sz w:val="22"/>
-          <w:szCs w:val="22"/>
-          <w:rtl/>
-        </w:rPr>
-        <w:t xml:space="preserve"> کامل نشده باشد (اگر شده بود، این پولبک واقعی است، نه رنج).</w:t>
+        <w:t xml:space="preserve">کندل مادر باید بعد از کندلی باشد که رنج قبلی روی آن بسته شد.</w:t>
       </w:r>
     </w:p>
     <w:p>
@@ -5394,7 +5405,7 @@
         <w:pStyle w:val="ListParagraph"/>
         <w:numPr>
           <w:ilvl w:val="0"/>
-          <w:numId w:val="6"/>
+          <w:numId w:val="2"/>
         </w:numPr>
         <w:bidi/>
         <w:spacing w:after="80" w:line="300"/>
@@ -5403,22 +5414,6 @@
       <w:r>
         <w:rPr>
           <w:rFonts w:ascii="Tahoma" w:cs="Tahoma" w:hAnsi="Tahoma"/>
-          <w:sz w:val="22"/>
-          <w:szCs w:val="22"/>
-          <w:rtl/>
-        </w:rPr>
-        <w:t xml:space="preserve">C1 بعد از کندلی باشد که رنج قبلی روی آن بسته شد.</w:t>
-      </w:r>
-    </w:p>
-    <w:p>
-      <w:pPr>
-        <w:bidi/>
-        <w:spacing w:after="120" w:line="320"/>
-        <w:jc w:val="both"/>
-      </w:pPr>
-      <w:r>
-        <w:rPr>
-          <w:rFonts w:ascii="Tahoma" w:cs="Tahoma" w:hAnsi="Tahoma"/>
           <w:b/>
           <w:bCs/>
           <w:sz w:val="22"/>
@@ -5434,63 +5429,7 @@
           <w:szCs w:val="22"/>
           <w:rtl/>
         </w:rPr>
-        <w:t xml:space="preserve"> از کندل C1 شروع می‌شود؛ سقف = بالاترین High دو کندل C1 و C2، کف = پایین‌ترین Low آن دو.</w:t>
-      </w:r>
-    </w:p>
-    <w:p>
-      <w:pPr>
-        <w:pStyle w:val="Heading3"/>
-        <w:bidi/>
-        <w:spacing w:after="80" w:before="180"/>
-        <w:jc w:val="right"/>
-      </w:pPr>
-      <w:r>
-        <w:rPr>
-          <w:rFonts w:ascii="Tahoma" w:cs="Tahoma" w:hAnsi="Tahoma"/>
-          <w:b/>
-          <w:bCs/>
-          <w:color w:val="385723"/>
-          <w:sz w:val="23"/>
-          <w:szCs w:val="23"/>
-          <w:rtl/>
-        </w:rPr>
-        <w:t xml:space="preserve">نوع ۱ و ۲ — کندلِ گیرانداز (برچسب «1»)</w:t>
-      </w:r>
-    </w:p>
-    <w:p>
-      <w:pPr>
-        <w:bidi/>
-        <w:spacing w:after="120" w:line="320"/>
-        <w:jc w:val="both"/>
-      </w:pPr>
-      <w:r>
-        <w:rPr>
-          <w:rFonts w:ascii="Tahoma" w:cs="Tahoma" w:hAnsi="Tahoma"/>
-          <w:sz w:val="22"/>
-          <w:szCs w:val="22"/>
-          <w:rtl/>
-        </w:rPr>
-        <w:t xml:space="preserve">شروع می‌شود اگر </w:t>
-      </w:r>
-      <w:r>
-        <w:rPr>
-          <w:rFonts w:ascii="Tahoma" w:cs="Tahoma" w:hAnsi="Tahoma"/>
-          <w:b/>
-          <w:bCs/>
-          <w:sz w:val="22"/>
-          <w:szCs w:val="22"/>
-          <w:rtl/>
-        </w:rPr>
-        <w:t xml:space="preserve">همه‌ی</w:t>
-      </w:r>
-      <w:r>
-        <w:rPr>
-          <w:rFonts w:ascii="Tahoma" w:cs="Tahoma" w:hAnsi="Tahoma"/>
-          <w:sz w:val="22"/>
-          <w:szCs w:val="22"/>
-          <w:rtl/>
-        </w:rPr>
-        <w:t xml:space="preserve"> این شرط‌ها برقرار باشد:</w:t>
+        <w:t xml:space="preserve"> از کندل مادر شروع می‌شود؛ سقف و کف = بالاترین High و پایین‌ترین Low کندل مادر و ۳ کندل بعدی.</w:t>
       </w:r>
     </w:p>
     <w:p>
@@ -5498,7 +5437,7 @@
         <w:pStyle w:val="ListParagraph"/>
         <w:numPr>
           <w:ilvl w:val="0"/>
-          <w:numId w:val="7"/>
+          <w:numId w:val="2"/>
         </w:numPr>
         <w:bidi/>
         <w:spacing w:after="80" w:line="300"/>
@@ -5507,51 +5446,62 @@
       <w:r>
         <w:rPr>
           <w:rFonts w:ascii="Tahoma" w:cs="Tahoma" w:hAnsi="Tahoma"/>
-          <w:sz w:val="22"/>
-          <w:szCs w:val="22"/>
-          <w:rtl/>
-        </w:rPr>
-        <w:t xml:space="preserve">یک کندل مرجع </w:t>
-      </w:r>
-      <w:r>
-        <w:rPr>
-          <w:rFonts w:ascii="Tahoma" w:cs="Tahoma" w:hAnsi="Tahoma"/>
-          <w:b/>
-          <w:bCs/>
-          <w:sz w:val="22"/>
-          <w:szCs w:val="22"/>
-          <w:rtl/>
-        </w:rPr>
-        <w:t xml:space="preserve">از هر نوع و هر اندازه‌ای</w:t>
-      </w:r>
-      <w:r>
-        <w:rPr>
-          <w:rFonts w:ascii="Tahoma" w:cs="Tahoma" w:hAnsi="Tahoma"/>
-          <w:sz w:val="22"/>
-          <w:szCs w:val="22"/>
-          <w:rtl/>
-        </w:rPr>
-        <w:t xml:space="preserve"> (کد نوع کندل را بررسی نمی‌کند) که </w:t>
-      </w:r>
-      <w:r>
-        <w:rPr>
-          <w:rFonts w:ascii="Tahoma" w:cs="Tahoma" w:hAnsi="Tahoma"/>
-          <w:b/>
-          <w:bCs/>
-          <w:sz w:val="22"/>
-          <w:szCs w:val="22"/>
-          <w:rtl/>
-        </w:rPr>
-        <w:t xml:space="preserve">Close دو کندل بعدی‌اش</w:t>
-      </w:r>
-      <w:r>
-        <w:rPr>
-          <w:rFonts w:ascii="Tahoma" w:cs="Tahoma" w:hAnsi="Tahoma"/>
-          <w:sz w:val="22"/>
-          <w:szCs w:val="22"/>
-          <w:rtl/>
-        </w:rPr>
-        <w:t xml:space="preserve"> هر دو بین High و Low آن باشد.</w:t>
+          <w:b/>
+          <w:bCs/>
+          <w:sz w:val="22"/>
+          <w:szCs w:val="22"/>
+          <w:rtl/>
+        </w:rPr>
+        <w:t xml:space="preserve">نوع ۳ — قانون کندل ضربه (برچسب «3»):</w:t>
+      </w:r>
+      <w:r>
+        <w:rPr>
+          <w:rFonts w:ascii="Tahoma" w:cs="Tahoma" w:hAnsi="Tahoma"/>
+          <w:sz w:val="22"/>
+          <w:szCs w:val="22"/>
+          <w:rtl/>
+        </w:rPr>
+        <w:t xml:space="preserve"> کندل مادر </w:t>
+      </w:r>
+      <w:r>
+        <w:rPr>
+          <w:rFonts w:ascii="Tahoma" w:cs="Tahoma" w:hAnsi="Tahoma"/>
+          <w:b/>
+          <w:bCs/>
+          <w:sz w:val="22"/>
+          <w:szCs w:val="22"/>
+          <w:rtl/>
+        </w:rPr>
+        <w:t xml:space="preserve">آخرین کندل در جهت حرکت</w:t>
+      </w:r>
+      <w:r>
+        <w:rPr>
+          <w:rFonts w:ascii="Tahoma" w:cs="Tahoma" w:hAnsi="Tahoma"/>
+          <w:sz w:val="22"/>
+          <w:szCs w:val="22"/>
+          <w:rtl/>
+        </w:rPr>
+        <w:t xml:space="preserve"> است و کندل بعدی </w:t>
+      </w:r>
+      <w:r>
+        <w:rPr>
+          <w:rFonts w:ascii="Tahoma" w:cs="Tahoma" w:hAnsi="Tahoma"/>
+          <w:b/>
+          <w:bCs/>
+          <w:sz w:val="22"/>
+          <w:szCs w:val="22"/>
+          <w:rtl/>
+        </w:rPr>
+        <w:t xml:space="preserve">خلاف جهت</w:t>
+      </w:r>
+      <w:r>
+        <w:rPr>
+          <w:rFonts w:ascii="Tahoma" w:cs="Tahoma" w:hAnsi="Tahoma"/>
+          <w:sz w:val="22"/>
+          <w:szCs w:val="22"/>
+          <w:rtl/>
+        </w:rPr>
+        <w:t xml:space="preserve"> (شروع اصلاح). مثال تصویر ۹۰: ماروبوزوی قرمز بزرگ در روند نزولی و سه کندل سبز داخل آن.</w:t>
       </w:r>
     </w:p>
     <w:p>
@@ -5559,7 +5509,7 @@
         <w:pStyle w:val="ListParagraph"/>
         <w:numPr>
           <w:ilvl w:val="0"/>
-          <w:numId w:val="7"/>
+          <w:numId w:val="2"/>
         </w:numPr>
         <w:bidi/>
         <w:spacing w:after="80" w:line="300"/>
@@ -5568,31 +5518,22 @@
       <w:r>
         <w:rPr>
           <w:rFonts w:ascii="Tahoma" w:cs="Tahoma" w:hAnsi="Tahoma"/>
-          <w:sz w:val="22"/>
-          <w:szCs w:val="22"/>
-          <w:rtl/>
-        </w:rPr>
-        <w:t xml:space="preserve">روی دو کندل آخر (کندل جاری و قبلی) </w:t>
-      </w:r>
-      <w:r>
-        <w:rPr>
-          <w:rFonts w:ascii="Tahoma" w:cs="Tahoma" w:hAnsi="Tahoma"/>
-          <w:b/>
-          <w:bCs/>
-          <w:sz w:val="22"/>
-          <w:szCs w:val="22"/>
-          <w:rtl/>
-        </w:rPr>
-        <w:t xml:space="preserve">هیچ الگوی پولبکی در هیچ جهتی</w:t>
-      </w:r>
-      <w:r>
-        <w:rPr>
-          <w:rFonts w:ascii="Tahoma" w:cs="Tahoma" w:hAnsi="Tahoma"/>
-          <w:sz w:val="22"/>
-          <w:szCs w:val="22"/>
-          <w:rtl/>
-        </w:rPr>
-        <w:t xml:space="preserve"> کامل نشده باشد.</w:t>
+          <w:b/>
+          <w:bCs/>
+          <w:sz w:val="22"/>
+          <w:szCs w:val="22"/>
+          <w:rtl/>
+        </w:rPr>
+        <w:t xml:space="preserve">نوع ۱ و ۲ (برچسب «1»):</w:t>
+      </w:r>
+      <w:r>
+        <w:rPr>
+          <w:rFonts w:ascii="Tahoma" w:cs="Tahoma" w:hAnsi="Tahoma"/>
+          <w:sz w:val="22"/>
+          <w:szCs w:val="22"/>
+          <w:rtl/>
+        </w:rPr>
+        <w:t xml:space="preserve"> هر کندل مادر دیگر.</w:t>
       </w:r>
     </w:p>
     <w:p>
@@ -5600,7 +5541,7 @@
         <w:pStyle w:val="ListParagraph"/>
         <w:numPr>
           <w:ilvl w:val="0"/>
-          <w:numId w:val="7"/>
+          <w:numId w:val="2"/>
         </w:numPr>
         <w:bidi/>
         <w:spacing w:after="80" w:line="300"/>
@@ -5609,64 +5550,74 @@
       <w:r>
         <w:rPr>
           <w:rFonts w:ascii="Tahoma" w:cs="Tahoma" w:hAnsi="Tahoma"/>
-          <w:sz w:val="22"/>
-          <w:szCs w:val="22"/>
-          <w:rtl/>
-        </w:rPr>
-        <w:t xml:space="preserve">کندل مرجع بعد از کندلی باشد که رنج قبلی روی آن بسته شد.</w:t>
-      </w:r>
-    </w:p>
-    <w:p>
-      <w:pPr>
-        <w:bidi/>
-        <w:spacing w:after="120" w:line="320"/>
+          <w:b/>
+          <w:bCs/>
+          <w:sz w:val="22"/>
+          <w:szCs w:val="22"/>
+          <w:rtl/>
+        </w:rPr>
+        <w:t xml:space="preserve">نوع ۴ (FBO):</w:t>
+      </w:r>
+      <w:r>
+        <w:rPr>
+          <w:rFonts w:ascii="Tahoma" w:cs="Tahoma" w:hAnsi="Tahoma"/>
+          <w:sz w:val="22"/>
+          <w:szCs w:val="22"/>
+          <w:rtl/>
+        </w:rPr>
+        <w:t xml:space="preserve"> بخش ۵.</w:t>
+      </w:r>
+    </w:p>
+    <w:p>
+      <w:pPr>
+        <w:pStyle w:val="ListParagraph"/>
+        <w:numPr>
+          <w:ilvl w:val="0"/>
+          <w:numId w:val="2"/>
+        </w:numPr>
+        <w:bidi/>
+        <w:spacing w:after="80" w:line="300"/>
         <w:jc w:val="both"/>
       </w:pPr>
       <w:r>
         <w:rPr>
           <w:rFonts w:ascii="Tahoma" w:cs="Tahoma" w:hAnsi="Tahoma"/>
-          <w:b/>
-          <w:bCs/>
-          <w:sz w:val="22"/>
-          <w:szCs w:val="22"/>
-          <w:rtl/>
-        </w:rPr>
-        <w:t xml:space="preserve">باکس:</w:t>
-      </w:r>
-      <w:r>
-        <w:rPr>
-          <w:rFonts w:ascii="Tahoma" w:cs="Tahoma" w:hAnsi="Tahoma"/>
-          <w:sz w:val="22"/>
-          <w:szCs w:val="22"/>
-          <w:rtl/>
-        </w:rPr>
-        <w:t xml:space="preserve"> از کندل مرجع شروع می‌شود؛ سقف و کف = بالاترین High و پایین‌ترین Low هر سه کندل. جهت رنج = جهت آخرین حرکت (اگر نبود، رنگ کندل مرجع).</w:t>
-      </w:r>
-    </w:p>
-    <w:p>
-      <w:pPr>
-        <w:pStyle w:val="Heading3"/>
-        <w:bidi/>
-        <w:spacing w:after="80" w:before="180"/>
-        <w:jc w:val="right"/>
-      </w:pPr>
-      <w:r>
-        <w:rPr>
-          <w:rFonts w:ascii="Tahoma" w:cs="Tahoma" w:hAnsi="Tahoma"/>
-          <w:b/>
-          <w:bCs/>
-          <w:color w:val="385723"/>
-          <w:sz w:val="23"/>
-          <w:szCs w:val="23"/>
-          <w:rtl/>
-        </w:rPr>
-        <w:t xml:space="preserve">نوع ۴ — شکست کاذب (FBO)</w:t>
-      </w:r>
-    </w:p>
-    <w:p>
-      <w:pPr>
-        <w:bidi/>
-        <w:spacing w:after="120" w:line="320"/>
+          <w:sz w:val="22"/>
+          <w:szCs w:val="22"/>
+          <w:rtl/>
+        </w:rPr>
+        <w:t xml:space="preserve">کندل‌های خلاف جهت روند اصلی (برای پولبک و کندل مادر) می‌توانند </w:t>
+      </w:r>
+      <w:r>
+        <w:rPr>
+          <w:rFonts w:ascii="Tahoma" w:cs="Tahoma" w:hAnsi="Tahoma"/>
+          <w:b/>
+          <w:bCs/>
+          <w:sz w:val="22"/>
+          <w:szCs w:val="22"/>
+          <w:rtl/>
+        </w:rPr>
+        <w:t xml:space="preserve">هر نوع و هر اندازه‌ای</w:t>
+      </w:r>
+      <w:r>
+        <w:rPr>
+          <w:rFonts w:ascii="Tahoma" w:cs="Tahoma" w:hAnsi="Tahoma"/>
+          <w:sz w:val="22"/>
+          <w:szCs w:val="22"/>
+          <w:rtl/>
+        </w:rPr>
+        <w:t xml:space="preserve"> باشند؛ شرط‌های کندل‌های هم‌جهت روند تغییری نکرده.</w:t>
+      </w:r>
+    </w:p>
+    <w:p>
+      <w:pPr>
+        <w:pStyle w:val="ListParagraph"/>
+        <w:numPr>
+          <w:ilvl w:val="0"/>
+          <w:numId w:val="2"/>
+        </w:numPr>
+        <w:bidi/>
+        <w:spacing w:after="80" w:line="300"/>
         <w:jc w:val="both"/>
       </w:pPr>
       <w:r>
@@ -5676,7 +5627,27 @@
           <w:szCs w:val="22"/>
           <w:rtl/>
         </w:rPr>
-        <w:t xml:space="preserve">در بخش ۵ توضیح داده شده است.</w:t>
+        <w:t xml:space="preserve">همزمان فقط </w:t>
+      </w:r>
+      <w:r>
+        <w:rPr>
+          <w:rFonts w:ascii="Tahoma" w:cs="Tahoma" w:hAnsi="Tahoma"/>
+          <w:b/>
+          <w:bCs/>
+          <w:sz w:val="22"/>
+          <w:szCs w:val="22"/>
+          <w:rtl/>
+        </w:rPr>
+        <w:t xml:space="preserve">یک</w:t>
+      </w:r>
+      <w:r>
+        <w:rPr>
+          <w:rFonts w:ascii="Tahoma" w:cs="Tahoma" w:hAnsi="Tahoma"/>
+          <w:sz w:val="22"/>
+          <w:szCs w:val="22"/>
+          <w:rtl/>
+        </w:rPr>
+        <w:t xml:space="preserve"> رنج فعال است.</w:t>
       </w:r>
     </w:p>
     <w:p>
@@ -6751,7 +6722,7 @@
         <w:pStyle w:val="ListParagraph"/>
         <w:numPr>
           <w:ilvl w:val="0"/>
-          <w:numId w:val="8"/>
+          <w:numId w:val="7"/>
         </w:numPr>
         <w:bidi/>
         <w:spacing w:after="80" w:line="300"/>
@@ -6796,6 +6767,524 @@
           <w:rtl/>
         </w:rPr>
         <w:t xml:space="preserve"> پولبک قفل شده باشد (یعنی یک CTS در انتظار شکست داریم). در مرحله‌ی موج (قبل از پولبک) عبور از سقف FBO نیست؛ فقط سقف موج جلو می‌رود.</w:t>
+      </w:r>
+    </w:p>
+    <w:p>
+      <w:pPr>
+        <w:pStyle w:val="ListParagraph"/>
+        <w:numPr>
+          <w:ilvl w:val="0"/>
+          <w:numId w:val="7"/>
+        </w:numPr>
+        <w:bidi/>
+        <w:spacing w:after="80" w:line="300"/>
+        <w:jc w:val="both"/>
+      </w:pPr>
+      <w:r>
+        <w:rPr>
+          <w:rFonts w:ascii="Tahoma" w:cs="Tahoma" w:hAnsi="Tahoma"/>
+          <w:b/>
+          <w:bCs/>
+          <w:sz w:val="22"/>
+          <w:szCs w:val="22"/>
+          <w:rtl/>
+        </w:rPr>
+        <w:t xml:space="preserve">شروع:</w:t>
+      </w:r>
+      <w:r>
+        <w:rPr>
+          <w:rFonts w:ascii="Tahoma" w:cs="Tahoma" w:hAnsi="Tahoma"/>
+          <w:sz w:val="22"/>
+          <w:szCs w:val="22"/>
+          <w:rtl/>
+        </w:rPr>
+        <w:t xml:space="preserve"> اولین کندل بسته‌شده‌ای که </w:t>
+      </w:r>
+      <w:r>
+        <w:rPr>
+          <w:rFonts w:ascii="Tahoma" w:cs="Tahoma" w:hAnsi="Tahoma"/>
+          <w:b/>
+          <w:bCs/>
+          <w:sz w:val="22"/>
+          <w:szCs w:val="22"/>
+          <w:rtl/>
+        </w:rPr>
+        <w:t xml:space="preserve">High آن بالای CTS</w:t>
+      </w:r>
+      <w:r>
+        <w:rPr>
+          <w:rFonts w:ascii="Tahoma" w:cs="Tahoma" w:hAnsi="Tahoma"/>
+          <w:sz w:val="22"/>
+          <w:szCs w:val="22"/>
+          <w:rtl/>
+        </w:rPr>
+        <w:t xml:space="preserve"> برود، بدون اینکه روی همان کندل CTS یا تغییر روند ثبت شود. برچسب </w:t>
+      </w:r>
+      <w:r>
+        <w:rPr>
+          <w:rFonts w:ascii="Tahoma" w:cs="Tahoma" w:hAnsi="Tahoma"/>
+          <w:b/>
+          <w:bCs/>
+          <w:sz w:val="22"/>
+          <w:szCs w:val="22"/>
+          <w:rtl/>
+        </w:rPr>
+        <w:t xml:space="preserve">خاکستری «FBO»</w:t>
+      </w:r>
+      <w:r>
+        <w:rPr>
+          <w:rFonts w:ascii="Tahoma" w:cs="Tahoma" w:hAnsi="Tahoma"/>
+          <w:sz w:val="22"/>
+          <w:szCs w:val="22"/>
+          <w:rtl/>
+        </w:rPr>
+        <w:t xml:space="preserve"> گذاشته می‌شود. برای هر خط CTS </w:t>
+      </w:r>
+      <w:r>
+        <w:rPr>
+          <w:rFonts w:ascii="Tahoma" w:cs="Tahoma" w:hAnsi="Tahoma"/>
+          <w:b/>
+          <w:bCs/>
+          <w:sz w:val="22"/>
+          <w:szCs w:val="22"/>
+          <w:rtl/>
+        </w:rPr>
+        <w:t xml:space="preserve">فقط یک FBO</w:t>
+      </w:r>
+      <w:r>
+        <w:rPr>
+          <w:rFonts w:ascii="Tahoma" w:cs="Tahoma" w:hAnsi="Tahoma"/>
+          <w:sz w:val="22"/>
+          <w:szCs w:val="22"/>
+          <w:rtl/>
+        </w:rPr>
+        <w:t xml:space="preserve"> ثبت می‌شود.</w:t>
+      </w:r>
+    </w:p>
+    <w:p>
+      <w:pPr>
+        <w:pStyle w:val="ListParagraph"/>
+        <w:numPr>
+          <w:ilvl w:val="0"/>
+          <w:numId w:val="7"/>
+        </w:numPr>
+        <w:bidi/>
+        <w:spacing w:after="80" w:line="300"/>
+        <w:jc w:val="both"/>
+      </w:pPr>
+      <w:r>
+        <w:rPr>
+          <w:rFonts w:ascii="Tahoma" w:cs="Tahoma" w:hAnsi="Tahoma"/>
+          <w:b/>
+          <w:bCs/>
+          <w:sz w:val="22"/>
+          <w:szCs w:val="22"/>
+          <w:rtl/>
+        </w:rPr>
+        <w:t xml:space="preserve">قطعی شدن:</w:t>
+      </w:r>
+      <w:r>
+        <w:rPr>
+          <w:rFonts w:ascii="Tahoma" w:cs="Tahoma" w:hAnsi="Tahoma"/>
+          <w:sz w:val="22"/>
+          <w:szCs w:val="22"/>
+          <w:rtl/>
+        </w:rPr>
+        <w:t xml:space="preserve"> اولین کندلی که </w:t>
+      </w:r>
+      <w:r>
+        <w:rPr>
+          <w:rFonts w:ascii="Tahoma" w:cs="Tahoma" w:hAnsi="Tahoma"/>
+          <w:b/>
+          <w:bCs/>
+          <w:sz w:val="22"/>
+          <w:szCs w:val="22"/>
+          <w:rtl/>
+        </w:rPr>
+        <w:t xml:space="preserve">Close آن دوباره زیر CTS</w:t>
+      </w:r>
+      <w:r>
+        <w:rPr>
+          <w:rFonts w:ascii="Tahoma" w:cs="Tahoma" w:hAnsi="Tahoma"/>
+          <w:sz w:val="22"/>
+          <w:szCs w:val="22"/>
+          <w:rtl/>
+        </w:rPr>
+        <w:t xml:space="preserve"> باشد (ممکن است همان کندل شروع باشد). برچسب </w:t>
+      </w:r>
+      <w:r>
+        <w:rPr>
+          <w:rFonts w:ascii="Tahoma" w:cs="Tahoma" w:hAnsi="Tahoma"/>
+          <w:b/>
+          <w:bCs/>
+          <w:sz w:val="22"/>
+          <w:szCs w:val="22"/>
+          <w:rtl/>
+        </w:rPr>
+        <w:t xml:space="preserve">قرمز</w:t>
+      </w:r>
+      <w:r>
+        <w:rPr>
+          <w:rFonts w:ascii="Tahoma" w:cs="Tahoma" w:hAnsi="Tahoma"/>
+          <w:sz w:val="22"/>
+          <w:szCs w:val="22"/>
+          <w:rtl/>
+        </w:rPr>
+        <w:t xml:space="preserve"> می‌شود.</w:t>
+      </w:r>
+    </w:p>
+    <w:p>
+      <w:pPr>
+        <w:pStyle w:val="ListParagraph"/>
+        <w:numPr>
+          <w:ilvl w:val="0"/>
+          <w:numId w:val="7"/>
+        </w:numPr>
+        <w:bidi/>
+        <w:spacing w:after="80" w:line="300"/>
+        <w:jc w:val="both"/>
+      </w:pPr>
+      <w:r>
+        <w:rPr>
+          <w:rFonts w:ascii="Tahoma" w:cs="Tahoma" w:hAnsi="Tahoma"/>
+          <w:b/>
+          <w:bCs/>
+          <w:sz w:val="22"/>
+          <w:szCs w:val="22"/>
+          <w:rtl/>
+        </w:rPr>
+        <w:t xml:space="preserve">حذف:</w:t>
+      </w:r>
+      <w:r>
+        <w:rPr>
+          <w:rFonts w:ascii="Tahoma" w:cs="Tahoma" w:hAnsi="Tahoma"/>
+          <w:sz w:val="22"/>
+          <w:szCs w:val="22"/>
+          <w:rtl/>
+        </w:rPr>
+        <w:t xml:space="preserve"> اگر قبل از قطعی شدن، CTS ثبت شود یا روند عوض شود، برچسب خاکستری پاک می‌شود.</w:t>
+      </w:r>
+    </w:p>
+    <w:p>
+      <w:pPr>
+        <w:pStyle w:val="Heading2"/>
+        <w:bidi/>
+        <w:spacing w:after="120" w:before="240"/>
+        <w:jc w:val="right"/>
+      </w:pPr>
+      <w:r>
+        <w:rPr>
+          <w:rFonts w:ascii="Tahoma" w:cs="Tahoma" w:hAnsi="Tahoma"/>
+          <w:b/>
+          <w:bCs/>
+          <w:color w:val="2E5597"/>
+          <w:sz w:val="26"/>
+          <w:szCs w:val="26"/>
+          <w:rtl/>
+        </w:rPr>
+        <w:t xml:space="preserve">۵-۱) باکس FBO (رنج نوع ۴)</w:t>
+      </w:r>
+    </w:p>
+    <w:p>
+      <w:pPr>
+        <w:pStyle w:val="ListParagraph"/>
+        <w:numPr>
+          <w:ilvl w:val="0"/>
+          <w:numId w:val="2"/>
+        </w:numPr>
+        <w:bidi/>
+        <w:spacing w:after="80" w:line="300"/>
+        <w:jc w:val="both"/>
+      </w:pPr>
+      <w:r>
+        <w:rPr>
+          <w:rFonts w:ascii="Tahoma" w:cs="Tahoma" w:hAnsi="Tahoma"/>
+          <w:sz w:val="22"/>
+          <w:szCs w:val="22"/>
+          <w:rtl/>
+        </w:rPr>
+        <w:t xml:space="preserve">در همان کندل شروع FBO ساخته می‌شود. اگر رنج نوع ۱ تا ۳ فعال باشد، اول آن رنج بسته می‌شود.</w:t>
+      </w:r>
+    </w:p>
+    <w:p>
+      <w:pPr>
+        <w:pStyle w:val="ListParagraph"/>
+        <w:numPr>
+          <w:ilvl w:val="0"/>
+          <w:numId w:val="2"/>
+        </w:numPr>
+        <w:bidi/>
+        <w:spacing w:after="80" w:line="300"/>
+        <w:jc w:val="both"/>
+      </w:pPr>
+      <w:r>
+        <w:rPr>
+          <w:rFonts w:ascii="Tahoma" w:cs="Tahoma" w:hAnsi="Tahoma"/>
+          <w:sz w:val="22"/>
+          <w:szCs w:val="22"/>
+          <w:rtl/>
+        </w:rPr>
+        <w:t xml:space="preserve">از **کندل سقف موج (H*)</w:t>
+      </w:r>
+      <w:r>
+        <w:rPr>
+          <w:rFonts w:ascii="Tahoma" w:cs="Tahoma" w:hAnsi="Tahoma"/>
+          <w:b/>
+          <w:bCs/>
+          <w:sz w:val="22"/>
+          <w:szCs w:val="22"/>
+          <w:rtl/>
+        </w:rPr>
+        <w:t xml:space="preserve"> که خط CTS از آن آمده شروع می‌شود (V18.4، تصویر ۸۵)؛ </w:t>
+      </w:r>
+      <w:r>
+        <w:rPr>
+          <w:rFonts w:ascii="Tahoma" w:cs="Tahoma" w:hAnsi="Tahoma"/>
+          <w:sz w:val="22"/>
+          <w:szCs w:val="22"/>
+          <w:rtl/>
+        </w:rPr>
+        <w:t xml:space="preserve">از خط CTS تا High کندل شروع FBO**.</w:t>
+      </w:r>
+    </w:p>
+    <w:p>
+      <w:pPr>
+        <w:pStyle w:val="ListParagraph"/>
+        <w:numPr>
+          <w:ilvl w:val="0"/>
+          <w:numId w:val="2"/>
+        </w:numPr>
+        <w:bidi/>
+        <w:spacing w:after="80" w:line="300"/>
+        <w:jc w:val="both"/>
+      </w:pPr>
+      <w:r>
+        <w:rPr>
+          <w:rFonts w:ascii="Tahoma" w:cs="Tahoma" w:hAnsi="Tahoma"/>
+          <w:sz w:val="22"/>
+          <w:szCs w:val="22"/>
+          <w:rtl/>
+        </w:rPr>
+        <w:t xml:space="preserve">وقتی قیمت به زیر خط CTS برمی‌گردد (حتی خیلی پایین)، باکس </w:t>
+      </w:r>
+      <w:r>
+        <w:rPr>
+          <w:rFonts w:ascii="Tahoma" w:cs="Tahoma" w:hAnsi="Tahoma"/>
+          <w:b/>
+          <w:bCs/>
+          <w:sz w:val="22"/>
+          <w:szCs w:val="22"/>
+          <w:rtl/>
+        </w:rPr>
+        <w:t xml:space="preserve">باز می‌ماند</w:t>
+      </w:r>
+      <w:r>
+        <w:rPr>
+          <w:rFonts w:ascii="Tahoma" w:cs="Tahoma" w:hAnsi="Tahoma"/>
+          <w:sz w:val="22"/>
+          <w:szCs w:val="22"/>
+          <w:rtl/>
+        </w:rPr>
+        <w:t xml:space="preserve"> و منتظر شکست واقعی سقف خود می‌ماند.</w:t>
+      </w:r>
+    </w:p>
+    <w:p>
+      <w:pPr>
+        <w:pStyle w:val="ListParagraph"/>
+        <w:numPr>
+          <w:ilvl w:val="0"/>
+          <w:numId w:val="2"/>
+        </w:numPr>
+        <w:bidi/>
+        <w:spacing w:after="80" w:line="300"/>
+        <w:jc w:val="both"/>
+      </w:pPr>
+      <w:r>
+        <w:rPr>
+          <w:rFonts w:ascii="Tahoma" w:cs="Tahoma" w:hAnsi="Tahoma"/>
+          <w:sz w:val="22"/>
+          <w:szCs w:val="22"/>
+          <w:rtl/>
+        </w:rPr>
+        <w:t xml:space="preserve">طرف CTS ثابت است؛ طرف دیگر با فیک‌های بعدی گسترش پیدا می‌کند.</w:t>
+      </w:r>
+    </w:p>
+    <w:p>
+      <w:pPr>
+        <w:pStyle w:val="ListParagraph"/>
+        <w:numPr>
+          <w:ilvl w:val="0"/>
+          <w:numId w:val="2"/>
+        </w:numPr>
+        <w:bidi/>
+        <w:spacing w:after="80" w:line="300"/>
+        <w:jc w:val="both"/>
+      </w:pPr>
+      <w:r>
+        <w:rPr>
+          <w:rFonts w:ascii="Tahoma" w:cs="Tahoma" w:hAnsi="Tahoma"/>
+          <w:sz w:val="22"/>
+          <w:szCs w:val="22"/>
+          <w:rtl/>
+        </w:rPr>
+        <w:t xml:space="preserve">وقتی عمر باکس </w:t>
+      </w:r>
+      <w:r>
+        <w:rPr>
+          <w:rFonts w:ascii="Tahoma" w:cs="Tahoma" w:hAnsi="Tahoma"/>
+          <w:b/>
+          <w:bCs/>
+          <w:sz w:val="22"/>
+          <w:szCs w:val="22"/>
+          <w:rtl/>
+        </w:rPr>
+        <w:t xml:space="preserve">بیشتر از ۲ کندل</w:t>
+      </w:r>
+      <w:r>
+        <w:rPr>
+          <w:rFonts w:ascii="Tahoma" w:cs="Tahoma" w:hAnsi="Tahoma"/>
+          <w:sz w:val="22"/>
+          <w:szCs w:val="22"/>
+          <w:rtl/>
+        </w:rPr>
+        <w:t xml:space="preserve"> شد، CTS </w:t>
+      </w:r>
+      <w:r>
+        <w:rPr>
+          <w:rFonts w:ascii="Tahoma" w:cs="Tahoma" w:hAnsi="Tahoma"/>
+          <w:b/>
+          <w:bCs/>
+          <w:sz w:val="22"/>
+          <w:szCs w:val="22"/>
+          <w:rtl/>
+        </w:rPr>
+        <w:t xml:space="preserve">فقط با شکست واقعی سقف باکس</w:t>
+      </w:r>
+      <w:r>
+        <w:rPr>
+          <w:rFonts w:ascii="Tahoma" w:cs="Tahoma" w:hAnsi="Tahoma"/>
+          <w:sz w:val="22"/>
+          <w:szCs w:val="22"/>
+          <w:rtl/>
+        </w:rPr>
+        <w:t xml:space="preserve"> ثبت می‌شود (خود CTS روی خط اصلی رسم می‌شود).</w:t>
+      </w:r>
+    </w:p>
+    <w:p>
+      <w:pPr>
+        <w:pStyle w:val="ListParagraph"/>
+        <w:numPr>
+          <w:ilvl w:val="0"/>
+          <w:numId w:val="2"/>
+        </w:numPr>
+        <w:bidi/>
+        <w:spacing w:after="80" w:line="300"/>
+        <w:jc w:val="both"/>
+      </w:pPr>
+      <w:r>
+        <w:rPr>
+          <w:rFonts w:ascii="Tahoma" w:cs="Tahoma" w:hAnsi="Tahoma"/>
+          <w:sz w:val="22"/>
+          <w:szCs w:val="22"/>
+          <w:rtl/>
+        </w:rPr>
+        <w:t xml:space="preserve">اگر CTS یا تغییر روند در </w:t>
+      </w:r>
+      <w:r>
+        <w:rPr>
+          <w:rFonts w:ascii="Tahoma" w:cs="Tahoma" w:hAnsi="Tahoma"/>
+          <w:b/>
+          <w:bCs/>
+          <w:sz w:val="22"/>
+          <w:szCs w:val="22"/>
+          <w:rtl/>
+        </w:rPr>
+        <w:t xml:space="preserve">۲ کندل اول</w:t>
+      </w:r>
+      <w:r>
+        <w:rPr>
+          <w:rFonts w:ascii="Tahoma" w:cs="Tahoma" w:hAnsi="Tahoma"/>
+          <w:sz w:val="22"/>
+          <w:szCs w:val="22"/>
+          <w:rtl/>
+        </w:rPr>
+        <w:t xml:space="preserve"> رخ دهد، باکس </w:t>
+      </w:r>
+      <w:r>
+        <w:rPr>
+          <w:rFonts w:ascii="Tahoma" w:cs="Tahoma" w:hAnsi="Tahoma"/>
+          <w:b/>
+          <w:bCs/>
+          <w:sz w:val="22"/>
+          <w:szCs w:val="22"/>
+          <w:rtl/>
+        </w:rPr>
+        <w:t xml:space="preserve">حذف</w:t>
+      </w:r>
+      <w:r>
+        <w:rPr>
+          <w:rFonts w:ascii="Tahoma" w:cs="Tahoma" w:hAnsi="Tahoma"/>
+          <w:sz w:val="22"/>
+          <w:szCs w:val="22"/>
+          <w:rtl/>
+        </w:rPr>
+        <w:t xml:space="preserve"> می‌شود (یعنی حرکت فیک نبوده). بعد از آن، با ثبت CTS یا تغییر روند باکس </w:t>
+      </w:r>
+      <w:r>
+        <w:rPr>
+          <w:rFonts w:ascii="Tahoma" w:cs="Tahoma" w:hAnsi="Tahoma"/>
+          <w:b/>
+          <w:bCs/>
+          <w:sz w:val="22"/>
+          <w:szCs w:val="22"/>
+          <w:rtl/>
+        </w:rPr>
+        <w:t xml:space="preserve">بسته</w:t>
+      </w:r>
+      <w:r>
+        <w:rPr>
+          <w:rFonts w:ascii="Tahoma" w:cs="Tahoma" w:hAnsi="Tahoma"/>
+          <w:sz w:val="22"/>
+          <w:szCs w:val="22"/>
+          <w:rtl/>
+        </w:rPr>
+        <w:t xml:space="preserve"> می‌شود.</w:t>
+      </w:r>
+    </w:p>
+    <w:p>
+      <w:pPr>
+        <w:pStyle w:val="Heading1"/>
+        <w:bidi/>
+        <w:spacing w:after="160" w:before="360"/>
+        <w:jc w:val="right"/>
+      </w:pPr>
+      <w:r>
+        <w:rPr>
+          <w:rFonts w:ascii="Tahoma" w:cs="Tahoma" w:hAnsi="Tahoma"/>
+          <w:b/>
+          <w:bCs/>
+          <w:color w:val="1F3864"/>
+          <w:sz w:val="32"/>
+          <w:szCs w:val="32"/>
+          <w:rtl/>
+        </w:rPr>
+        <w:t xml:space="preserve">۶) ساختار بازار (CTS و BOS)</w:t>
+      </w:r>
+    </w:p>
+    <w:p>
+      <w:pPr>
+        <w:bidi/>
+        <w:spacing w:after="120" w:line="320"/>
+        <w:jc w:val="both"/>
+      </w:pPr>
+      <w:r>
+        <w:rPr>
+          <w:rFonts w:ascii="Tahoma" w:cs="Tahoma" w:hAnsi="Tahoma"/>
+          <w:sz w:val="22"/>
+          <w:szCs w:val="22"/>
+          <w:rtl/>
+        </w:rPr>
+        <w:t xml:space="preserve">این بخش خلاصه است، چون پولبک و شکست واقعی مستقیم به آن وصل‌اند. ساختار فقط روی کندل بسته‌شده محاسبه می‌شود.</w:t>
       </w:r>
     </w:p>
     <w:p>
@@ -6818,76 +7307,16 @@
           <w:szCs w:val="22"/>
           <w:rtl/>
         </w:rPr>
-        <w:t xml:space="preserve">شروع:</w:t>
-      </w:r>
-      <w:r>
-        <w:rPr>
-          <w:rFonts w:ascii="Tahoma" w:cs="Tahoma" w:hAnsi="Tahoma"/>
-          <w:sz w:val="22"/>
-          <w:szCs w:val="22"/>
-          <w:rtl/>
-        </w:rPr>
-        <w:t xml:space="preserve"> اولین کندل بسته‌شده‌ای که </w:t>
-      </w:r>
-      <w:r>
-        <w:rPr>
-          <w:rFonts w:ascii="Tahoma" w:cs="Tahoma" w:hAnsi="Tahoma"/>
-          <w:b/>
-          <w:bCs/>
-          <w:sz w:val="22"/>
-          <w:szCs w:val="22"/>
-          <w:rtl/>
-        </w:rPr>
-        <w:t xml:space="preserve">High آن بالای CTS</w:t>
-      </w:r>
-      <w:r>
-        <w:rPr>
-          <w:rFonts w:ascii="Tahoma" w:cs="Tahoma" w:hAnsi="Tahoma"/>
-          <w:sz w:val="22"/>
-          <w:szCs w:val="22"/>
-          <w:rtl/>
-        </w:rPr>
-        <w:t xml:space="preserve"> برود، بدون اینکه روی همان کندل CTS یا تغییر روند ثبت شود. برچسب </w:t>
-      </w:r>
-      <w:r>
-        <w:rPr>
-          <w:rFonts w:ascii="Tahoma" w:cs="Tahoma" w:hAnsi="Tahoma"/>
-          <w:b/>
-          <w:bCs/>
-          <w:sz w:val="22"/>
-          <w:szCs w:val="22"/>
-          <w:rtl/>
-        </w:rPr>
-        <w:t xml:space="preserve">خاکستری «FBO»</w:t>
-      </w:r>
-      <w:r>
-        <w:rPr>
-          <w:rFonts w:ascii="Tahoma" w:cs="Tahoma" w:hAnsi="Tahoma"/>
-          <w:sz w:val="22"/>
-          <w:szCs w:val="22"/>
-          <w:rtl/>
-        </w:rPr>
-        <w:t xml:space="preserve"> گذاشته می‌شود. برای هر خط CTS </w:t>
-      </w:r>
-      <w:r>
-        <w:rPr>
-          <w:rFonts w:ascii="Tahoma" w:cs="Tahoma" w:hAnsi="Tahoma"/>
-          <w:b/>
-          <w:bCs/>
-          <w:sz w:val="22"/>
-          <w:szCs w:val="22"/>
-          <w:rtl/>
-        </w:rPr>
-        <w:t xml:space="preserve">فقط یک FBO</w:t>
-      </w:r>
-      <w:r>
-        <w:rPr>
-          <w:rFonts w:ascii="Tahoma" w:cs="Tahoma" w:hAnsi="Tahoma"/>
-          <w:sz w:val="22"/>
-          <w:szCs w:val="22"/>
-          <w:rtl/>
-        </w:rPr>
-        <w:t xml:space="preserve"> ثبت می‌شود.</w:t>
+        <w:t xml:space="preserve">مرحله‌ی الف — موج:</w:t>
+      </w:r>
+      <w:r>
+        <w:rPr>
+          <w:rFonts w:ascii="Tahoma" w:cs="Tahoma" w:hAnsi="Tahoma"/>
+          <w:sz w:val="22"/>
+          <w:szCs w:val="22"/>
+          <w:rtl/>
+        </w:rPr>
+        <w:t xml:space="preserve"> بالاترین High = سقف موج (H*). هر بار سقف جدید ثبت شود، کف پولبک از نو شروع می‌شود.</w:t>
       </w:r>
     </w:p>
     <w:p>
@@ -6910,56 +7339,36 @@
           <w:szCs w:val="22"/>
           <w:rtl/>
         </w:rPr>
-        <w:t xml:space="preserve">قطعی شدن:</w:t>
-      </w:r>
-      <w:r>
-        <w:rPr>
-          <w:rFonts w:ascii="Tahoma" w:cs="Tahoma" w:hAnsi="Tahoma"/>
-          <w:sz w:val="22"/>
-          <w:szCs w:val="22"/>
-          <w:rtl/>
-        </w:rPr>
-        <w:t xml:space="preserve"> اولین کندلی که </w:t>
-      </w:r>
-      <w:r>
-        <w:rPr>
-          <w:rFonts w:ascii="Tahoma" w:cs="Tahoma" w:hAnsi="Tahoma"/>
-          <w:b/>
-          <w:bCs/>
-          <w:sz w:val="22"/>
-          <w:szCs w:val="22"/>
-          <w:rtl/>
-        </w:rPr>
-        <w:t xml:space="preserve">Close آن دوباره زیر CTS</w:t>
-      </w:r>
-      <w:r>
-        <w:rPr>
-          <w:rFonts w:ascii="Tahoma" w:cs="Tahoma" w:hAnsi="Tahoma"/>
-          <w:sz w:val="22"/>
-          <w:szCs w:val="22"/>
-          <w:rtl/>
-        </w:rPr>
-        <w:t xml:space="preserve"> باشد (ممکن است همان کندل شروع باشد). برچسب </w:t>
-      </w:r>
-      <w:r>
-        <w:rPr>
-          <w:rFonts w:ascii="Tahoma" w:cs="Tahoma" w:hAnsi="Tahoma"/>
-          <w:b/>
-          <w:bCs/>
-          <w:sz w:val="22"/>
-          <w:szCs w:val="22"/>
-          <w:rtl/>
-        </w:rPr>
-        <w:t xml:space="preserve">قرمز</w:t>
-      </w:r>
-      <w:r>
-        <w:rPr>
-          <w:rFonts w:ascii="Tahoma" w:cs="Tahoma" w:hAnsi="Tahoma"/>
-          <w:sz w:val="22"/>
-          <w:szCs w:val="22"/>
-          <w:rtl/>
-        </w:rPr>
-        <w:t xml:space="preserve"> می‌شود.</w:t>
+        <w:t xml:space="preserve">مرحله‌ی ب — قفل:</w:t>
+      </w:r>
+      <w:r>
+        <w:rPr>
+          <w:rFonts w:ascii="Tahoma" w:cs="Tahoma" w:hAnsi="Tahoma"/>
+          <w:sz w:val="22"/>
+          <w:szCs w:val="22"/>
+          <w:rtl/>
+        </w:rPr>
+        <w:t xml:space="preserve"> یک پولبک حساب‌شده (بخش ۳-۳) سقف H* را قفل می‌کند. از این به بعد کد </w:t>
+      </w:r>
+      <w:r>
+        <w:rPr>
+          <w:rFonts w:ascii="Tahoma" w:cs="Tahoma" w:hAnsi="Tahoma"/>
+          <w:b/>
+          <w:bCs/>
+          <w:sz w:val="22"/>
+          <w:szCs w:val="22"/>
+          <w:rtl/>
+        </w:rPr>
+        <w:t xml:space="preserve">پایین‌ترین Low اصلاح</w:t>
+      </w:r>
+      <w:r>
+        <w:rPr>
+          <w:rFonts w:ascii="Tahoma" w:cs="Tahoma" w:hAnsi="Tahoma"/>
+          <w:sz w:val="22"/>
+          <w:szCs w:val="22"/>
+          <w:rtl/>
+        </w:rPr>
+        <w:t xml:space="preserve"> را دنبال می‌کند (این همان BOS آینده است).</w:t>
       </w:r>
     </w:p>
     <w:p>
@@ -6982,36 +7391,56 @@
           <w:szCs w:val="22"/>
           <w:rtl/>
         </w:rPr>
-        <w:t xml:space="preserve">حذف:</w:t>
-      </w:r>
-      <w:r>
-        <w:rPr>
-          <w:rFonts w:ascii="Tahoma" w:cs="Tahoma" w:hAnsi="Tahoma"/>
-          <w:sz w:val="22"/>
-          <w:szCs w:val="22"/>
-          <w:rtl/>
-        </w:rPr>
-        <w:t xml:space="preserve"> اگر قبل از قطعی شدن، CTS ثبت شود یا روند عوض شود، برچسب خاکستری پاک می‌شود.</w:t>
-      </w:r>
-    </w:p>
-    <w:p>
-      <w:pPr>
-        <w:pStyle w:val="Heading2"/>
-        <w:bidi/>
-        <w:spacing w:after="120" w:before="240"/>
-        <w:jc w:val="right"/>
-      </w:pPr>
-      <w:r>
-        <w:rPr>
-          <w:rFonts w:ascii="Tahoma" w:cs="Tahoma" w:hAnsi="Tahoma"/>
-          <w:b/>
-          <w:bCs/>
-          <w:color w:val="2E5597"/>
-          <w:sz w:val="26"/>
-          <w:szCs w:val="26"/>
-          <w:rtl/>
-        </w:rPr>
-        <w:t xml:space="preserve">۵-۱) باکس FBO (رنج نوع ۴)</w:t>
+        <w:t xml:space="preserve">حالت ۱ — تأیید:</w:t>
+      </w:r>
+      <w:r>
+        <w:rPr>
+          <w:rFonts w:ascii="Tahoma" w:cs="Tahoma" w:hAnsi="Tahoma"/>
+          <w:sz w:val="22"/>
+          <w:szCs w:val="22"/>
+          <w:rtl/>
+        </w:rPr>
+        <w:t xml:space="preserve"> شکست واقعی H* (یا سقف باکس FBO، اگر بیشتر از ۲ کندل عمر دارد) ← </w:t>
+      </w:r>
+      <w:r>
+        <w:rPr>
+          <w:rFonts w:ascii="Tahoma" w:cs="Tahoma" w:hAnsi="Tahoma"/>
+          <w:b/>
+          <w:bCs/>
+          <w:sz w:val="22"/>
+          <w:szCs w:val="22"/>
+          <w:rtl/>
+        </w:rPr>
+        <w:t xml:space="preserve">CTS = H</w:t>
+      </w:r>
+      <w:r>
+        <w:rPr>
+          <w:rFonts w:ascii="Tahoma" w:cs="Tahoma" w:hAnsi="Tahoma"/>
+          <w:sz w:val="22"/>
+          <w:szCs w:val="22"/>
+          <w:rtl/>
+        </w:rPr>
+        <w:t xml:space="preserve">*، </w:t>
+      </w:r>
+      <w:r>
+        <w:rPr>
+          <w:rFonts w:ascii="Tahoma" w:cs="Tahoma" w:hAnsi="Tahoma"/>
+          <w:b/>
+          <w:bCs/>
+          <w:sz w:val="22"/>
+          <w:szCs w:val="22"/>
+          <w:rtl/>
+        </w:rPr>
+        <w:t xml:space="preserve">BOS = پایین‌ترین Low اصلاح</w:t>
+      </w:r>
+      <w:r>
+        <w:rPr>
+          <w:rFonts w:ascii="Tahoma" w:cs="Tahoma" w:hAnsi="Tahoma"/>
+          <w:sz w:val="22"/>
+          <w:szCs w:val="22"/>
+          <w:rtl/>
+        </w:rPr>
+        <w:t xml:space="preserve">، برچسب و هشدار پولبک روی چارت می‌آید، و موج جدید از همین کندل شروع می‌شود.</w:t>
       </w:r>
     </w:p>
     <w:p>
@@ -7019,7 +7448,7 @@
         <w:pStyle w:val="ListParagraph"/>
         <w:numPr>
           <w:ilvl w:val="0"/>
-          <w:numId w:val="2"/>
+          <w:numId w:val="8"/>
         </w:numPr>
         <w:bidi/>
         <w:spacing w:after="80" w:line="300"/>
@@ -7028,11 +7457,62 @@
       <w:r>
         <w:rPr>
           <w:rFonts w:ascii="Tahoma" w:cs="Tahoma" w:hAnsi="Tahoma"/>
-          <w:sz w:val="22"/>
-          <w:szCs w:val="22"/>
-          <w:rtl/>
-        </w:rPr>
-        <w:t xml:space="preserve">در همان کندل شروع FBO ساخته می‌شود. اگر رنج نوع ۱ تا ۳ فعال باشد، اول آن رنج بسته می‌شود.</w:t>
+          <w:b/>
+          <w:bCs/>
+          <w:sz w:val="22"/>
+          <w:szCs w:val="22"/>
+          <w:rtl/>
+        </w:rPr>
+        <w:t xml:space="preserve">حالت ۲ — اصلاح جدید (V17.9):</w:t>
+      </w:r>
+      <w:r>
+        <w:rPr>
+          <w:rFonts w:ascii="Tahoma" w:cs="Tahoma" w:hAnsi="Tahoma"/>
+          <w:sz w:val="22"/>
+          <w:szCs w:val="22"/>
+          <w:rtl/>
+        </w:rPr>
+        <w:t xml:space="preserve"> اگر در مرحله‌ی ب قیمت </w:t>
+      </w:r>
+      <w:r>
+        <w:rPr>
+          <w:rFonts w:ascii="Tahoma" w:cs="Tahoma" w:hAnsi="Tahoma"/>
+          <w:b/>
+          <w:bCs/>
+          <w:sz w:val="22"/>
+          <w:szCs w:val="22"/>
+          <w:rtl/>
+        </w:rPr>
+        <w:t xml:space="preserve">بدون شکست واقعی</w:t>
+      </w:r>
+      <w:r>
+        <w:rPr>
+          <w:rFonts w:ascii="Tahoma" w:cs="Tahoma" w:hAnsi="Tahoma"/>
+          <w:sz w:val="22"/>
+          <w:szCs w:val="22"/>
+          <w:rtl/>
+        </w:rPr>
+        <w:t xml:space="preserve"> بالای H* برود (بالاترین فیک یادداشت می‌شود) و بعد یک کندل </w:t>
+      </w:r>
+      <w:r>
+        <w:rPr>
+          <w:rFonts w:ascii="Tahoma" w:cs="Tahoma" w:hAnsi="Tahoma"/>
+          <w:b/>
+          <w:bCs/>
+          <w:sz w:val="22"/>
+          <w:szCs w:val="22"/>
+          <w:rtl/>
+        </w:rPr>
+        <w:t xml:space="preserve">Low زیر کف پولبک قبلی</w:t>
+      </w:r>
+      <w:r>
+        <w:rPr>
+          <w:rFonts w:ascii="Tahoma" w:cs="Tahoma" w:hAnsi="Tahoma"/>
+          <w:sz w:val="22"/>
+          <w:szCs w:val="22"/>
+          <w:rtl/>
+        </w:rPr>
+        <w:t xml:space="preserve"> بزند ← **H* = بالاترین فیک** و کف پولبک = Low همان کندل. قفل باقی می‌ماند و منتظر شکست واقعی H* جدید می‌مانیم.</w:t>
       </w:r>
     </w:p>
     <w:p>
@@ -7040,7 +7520,7 @@
         <w:pStyle w:val="ListParagraph"/>
         <w:numPr>
           <w:ilvl w:val="0"/>
-          <w:numId w:val="2"/>
+          <w:numId w:val="8"/>
         </w:numPr>
         <w:bidi/>
         <w:spacing w:after="80" w:line="300"/>
@@ -7049,31 +7529,42 @@
       <w:r>
         <w:rPr>
           <w:rFonts w:ascii="Tahoma" w:cs="Tahoma" w:hAnsi="Tahoma"/>
-          <w:sz w:val="22"/>
-          <w:szCs w:val="22"/>
-          <w:rtl/>
-        </w:rPr>
-        <w:t xml:space="preserve">از **کندل سقف موج (H*)</w:t>
-      </w:r>
-      <w:r>
-        <w:rPr>
-          <w:rFonts w:ascii="Tahoma" w:cs="Tahoma" w:hAnsi="Tahoma"/>
-          <w:b/>
-          <w:bCs/>
-          <w:sz w:val="22"/>
-          <w:szCs w:val="22"/>
-          <w:rtl/>
-        </w:rPr>
-        <w:t xml:space="preserve"> که خط CTS از آن آمده شروع می‌شود (V18.4، تصویر ۸۵)؛ </w:t>
-      </w:r>
-      <w:r>
-        <w:rPr>
-          <w:rFonts w:ascii="Tahoma" w:cs="Tahoma" w:hAnsi="Tahoma"/>
-          <w:sz w:val="22"/>
-          <w:szCs w:val="22"/>
-          <w:rtl/>
-        </w:rPr>
-        <w:t xml:space="preserve">از خط CTS تا High کندل شروع FBO**.</w:t>
+          <w:b/>
+          <w:bCs/>
+          <w:sz w:val="22"/>
+          <w:szCs w:val="22"/>
+          <w:rtl/>
+        </w:rPr>
+        <w:t xml:space="preserve">تغییر روند:</w:t>
+      </w:r>
+      <w:r>
+        <w:rPr>
+          <w:rFonts w:ascii="Tahoma" w:cs="Tahoma" w:hAnsi="Tahoma"/>
+          <w:sz w:val="22"/>
+          <w:szCs w:val="22"/>
+          <w:rtl/>
+        </w:rPr>
+        <w:t xml:space="preserve"> شکست واقعی </w:t>
+      </w:r>
+      <w:r>
+        <w:rPr>
+          <w:rFonts w:ascii="Tahoma" w:cs="Tahoma" w:hAnsi="Tahoma"/>
+          <w:b/>
+          <w:bCs/>
+          <w:sz w:val="22"/>
+          <w:szCs w:val="22"/>
+          <w:rtl/>
+        </w:rPr>
+        <w:t xml:space="preserve">آخرین BOS</w:t>
+      </w:r>
+      <w:r>
+        <w:rPr>
+          <w:rFonts w:ascii="Tahoma" w:cs="Tahoma" w:hAnsi="Tahoma"/>
+          <w:sz w:val="22"/>
+          <w:szCs w:val="22"/>
+          <w:rtl/>
+        </w:rPr>
+        <w:t xml:space="preserve"> در جهت مخالف.</w:t>
       </w:r>
     </w:p>
     <w:p>
@@ -7081,7 +7572,7 @@
         <w:pStyle w:val="ListParagraph"/>
         <w:numPr>
           <w:ilvl w:val="0"/>
-          <w:numId w:val="2"/>
+          <w:numId w:val="8"/>
         </w:numPr>
         <w:bidi/>
         <w:spacing w:after="80" w:line="300"/>
@@ -7090,31 +7581,22 @@
       <w:r>
         <w:rPr>
           <w:rFonts w:ascii="Tahoma" w:cs="Tahoma" w:hAnsi="Tahoma"/>
-          <w:sz w:val="22"/>
-          <w:szCs w:val="22"/>
-          <w:rtl/>
-        </w:rPr>
-        <w:t xml:space="preserve">وقتی قیمت به زیر خط CTS برمی‌گردد (حتی خیلی پایین)، باکس </w:t>
-      </w:r>
-      <w:r>
-        <w:rPr>
-          <w:rFonts w:ascii="Tahoma" w:cs="Tahoma" w:hAnsi="Tahoma"/>
-          <w:b/>
-          <w:bCs/>
-          <w:sz w:val="22"/>
-          <w:szCs w:val="22"/>
-          <w:rtl/>
-        </w:rPr>
-        <w:t xml:space="preserve">باز می‌ماند</w:t>
-      </w:r>
-      <w:r>
-        <w:rPr>
-          <w:rFonts w:ascii="Tahoma" w:cs="Tahoma" w:hAnsi="Tahoma"/>
-          <w:sz w:val="22"/>
-          <w:szCs w:val="22"/>
-          <w:rtl/>
-        </w:rPr>
-        <w:t xml:space="preserve"> و منتظر شکست واقعی سقف خود می‌ماند.</w:t>
+          <w:b/>
+          <w:bCs/>
+          <w:sz w:val="22"/>
+          <w:szCs w:val="22"/>
+          <w:rtl/>
+        </w:rPr>
+        <w:t xml:space="preserve">شروع چارت:</w:t>
+      </w:r>
+      <w:r>
+        <w:rPr>
+          <w:rFonts w:ascii="Tahoma" w:cs="Tahoma" w:hAnsi="Tahoma"/>
+          <w:sz w:val="22"/>
+          <w:szCs w:val="22"/>
+          <w:rtl/>
+        </w:rPr>
+        <w:t xml:space="preserve"> روند نامعلوم است؛ هر دو جهت دنبال می‌شوند و اولین چرخه‌ی کامل، روند را تعیین می‌کند.</w:t>
       </w:r>
     </w:p>
     <w:p>
@@ -7122,7 +7604,7 @@
         <w:pStyle w:val="ListParagraph"/>
         <w:numPr>
           <w:ilvl w:val="0"/>
-          <w:numId w:val="2"/>
+          <w:numId w:val="8"/>
         </w:numPr>
         <w:bidi/>
         <w:spacing w:after="80" w:line="300"/>
@@ -7131,153 +7613,22 @@
       <w:r>
         <w:rPr>
           <w:rFonts w:ascii="Tahoma" w:cs="Tahoma" w:hAnsi="Tahoma"/>
-          <w:sz w:val="22"/>
-          <w:szCs w:val="22"/>
-          <w:rtl/>
-        </w:rPr>
-        <w:t xml:space="preserve">طرف CTS ثابت است؛ طرف دیگر با فیک‌های بعدی گسترش پیدا می‌کند.</w:t>
-      </w:r>
-    </w:p>
-    <w:p>
-      <w:pPr>
-        <w:pStyle w:val="ListParagraph"/>
-        <w:numPr>
-          <w:ilvl w:val="0"/>
-          <w:numId w:val="2"/>
-        </w:numPr>
-        <w:bidi/>
-        <w:spacing w:after="80" w:line="300"/>
-        <w:jc w:val="both"/>
-      </w:pPr>
-      <w:r>
-        <w:rPr>
-          <w:rFonts w:ascii="Tahoma" w:cs="Tahoma" w:hAnsi="Tahoma"/>
-          <w:sz w:val="22"/>
-          <w:szCs w:val="22"/>
-          <w:rtl/>
-        </w:rPr>
-        <w:t xml:space="preserve">وقتی عمر باکس </w:t>
-      </w:r>
-      <w:r>
-        <w:rPr>
-          <w:rFonts w:ascii="Tahoma" w:cs="Tahoma" w:hAnsi="Tahoma"/>
-          <w:b/>
-          <w:bCs/>
-          <w:sz w:val="22"/>
-          <w:szCs w:val="22"/>
-          <w:rtl/>
-        </w:rPr>
-        <w:t xml:space="preserve">بیشتر از ۲ کندل</w:t>
-      </w:r>
-      <w:r>
-        <w:rPr>
-          <w:rFonts w:ascii="Tahoma" w:cs="Tahoma" w:hAnsi="Tahoma"/>
-          <w:sz w:val="22"/>
-          <w:szCs w:val="22"/>
-          <w:rtl/>
-        </w:rPr>
-        <w:t xml:space="preserve"> شد، CTS </w:t>
-      </w:r>
-      <w:r>
-        <w:rPr>
-          <w:rFonts w:ascii="Tahoma" w:cs="Tahoma" w:hAnsi="Tahoma"/>
-          <w:b/>
-          <w:bCs/>
-          <w:sz w:val="22"/>
-          <w:szCs w:val="22"/>
-          <w:rtl/>
-        </w:rPr>
-        <w:t xml:space="preserve">فقط با شکست واقعی سقف باکس</w:t>
-      </w:r>
-      <w:r>
-        <w:rPr>
-          <w:rFonts w:ascii="Tahoma" w:cs="Tahoma" w:hAnsi="Tahoma"/>
-          <w:sz w:val="22"/>
-          <w:szCs w:val="22"/>
-          <w:rtl/>
-        </w:rPr>
-        <w:t xml:space="preserve"> ثبت می‌شود (خود CTS روی خط اصلی رسم می‌شود).</w:t>
-      </w:r>
-    </w:p>
-    <w:p>
-      <w:pPr>
-        <w:pStyle w:val="ListParagraph"/>
-        <w:numPr>
-          <w:ilvl w:val="0"/>
-          <w:numId w:val="2"/>
-        </w:numPr>
-        <w:bidi/>
-        <w:spacing w:after="80" w:line="300"/>
-        <w:jc w:val="both"/>
-      </w:pPr>
-      <w:r>
-        <w:rPr>
-          <w:rFonts w:ascii="Tahoma" w:cs="Tahoma" w:hAnsi="Tahoma"/>
-          <w:sz w:val="22"/>
-          <w:szCs w:val="22"/>
-          <w:rtl/>
-        </w:rPr>
-        <w:t xml:space="preserve">اگر CTS یا تغییر روند در </w:t>
-      </w:r>
-      <w:r>
-        <w:rPr>
-          <w:rFonts w:ascii="Tahoma" w:cs="Tahoma" w:hAnsi="Tahoma"/>
-          <w:b/>
-          <w:bCs/>
-          <w:sz w:val="22"/>
-          <w:szCs w:val="22"/>
-          <w:rtl/>
-        </w:rPr>
-        <w:t xml:space="preserve">۲ کندل اول</w:t>
-      </w:r>
-      <w:r>
-        <w:rPr>
-          <w:rFonts w:ascii="Tahoma" w:cs="Tahoma" w:hAnsi="Tahoma"/>
-          <w:sz w:val="22"/>
-          <w:szCs w:val="22"/>
-          <w:rtl/>
-        </w:rPr>
-        <w:t xml:space="preserve"> رخ دهد، باکس </w:t>
-      </w:r>
-      <w:r>
-        <w:rPr>
-          <w:rFonts w:ascii="Tahoma" w:cs="Tahoma" w:hAnsi="Tahoma"/>
-          <w:b/>
-          <w:bCs/>
-          <w:sz w:val="22"/>
-          <w:szCs w:val="22"/>
-          <w:rtl/>
-        </w:rPr>
-        <w:t xml:space="preserve">حذف</w:t>
-      </w:r>
-      <w:r>
-        <w:rPr>
-          <w:rFonts w:ascii="Tahoma" w:cs="Tahoma" w:hAnsi="Tahoma"/>
-          <w:sz w:val="22"/>
-          <w:szCs w:val="22"/>
-          <w:rtl/>
-        </w:rPr>
-        <w:t xml:space="preserve"> می‌شود (یعنی حرکت فیک نبوده). بعد از آن، با ثبت CTS یا تغییر روند باکس </w:t>
-      </w:r>
-      <w:r>
-        <w:rPr>
-          <w:rFonts w:ascii="Tahoma" w:cs="Tahoma" w:hAnsi="Tahoma"/>
-          <w:b/>
-          <w:bCs/>
-          <w:sz w:val="22"/>
-          <w:szCs w:val="22"/>
-          <w:rtl/>
-        </w:rPr>
-        <w:t xml:space="preserve">بسته</w:t>
-      </w:r>
-      <w:r>
-        <w:rPr>
-          <w:rFonts w:ascii="Tahoma" w:cs="Tahoma" w:hAnsi="Tahoma"/>
-          <w:sz w:val="22"/>
-          <w:szCs w:val="22"/>
-          <w:rtl/>
-        </w:rPr>
-        <w:t xml:space="preserve"> می‌شود.</w:t>
+          <w:b/>
+          <w:bCs/>
+          <w:sz w:val="22"/>
+          <w:szCs w:val="22"/>
+          <w:rtl/>
+        </w:rPr>
+        <w:t xml:space="preserve">خط آبی موج جاری:</w:t>
+      </w:r>
+      <w:r>
+        <w:rPr>
+          <w:rFonts w:ascii="Tahoma" w:cs="Tahoma" w:hAnsi="Tahoma"/>
+          <w:sz w:val="22"/>
+          <w:szCs w:val="22"/>
+          <w:rtl/>
+        </w:rPr>
+        <w:t xml:space="preserve"> از آخرین BOS تا H* فعلی کشیده می‌شود (فقط برای نمایش).</w:t>
       </w:r>
     </w:p>
     <w:p>
@@ -7297,7 +7648,7 @@
           <w:szCs w:val="32"/>
           <w:rtl/>
         </w:rPr>
-        <w:t xml:space="preserve">۶) ساختار بازار (CTS و BOS)</w:t>
+        <w:t xml:space="preserve">۷) جاهایی که کد با پرامپت‌ها فرق دارد</w:t>
       </w:r>
     </w:p>
     <w:p>
@@ -7313,7 +7664,7 @@
           <w:szCs w:val="22"/>
           <w:rtl/>
         </w:rPr>
-        <w:t xml:space="preserve">این بخش خلاصه است، چون پولبک و شکست واقعی مستقیم به آن وصل‌اند. ساختار فقط روی کندل بسته‌شده محاسبه می‌شود.</w:t>
+        <w:t xml:space="preserve">این موارد را عمداً جدا آورده‌ام چون احتمال اشتباه این‌جا بیشتر است. برای هر کدام بگویید «درست است» یا «باید این‌طور شود».</w:t>
       </w:r>
     </w:p>
     <w:p>
@@ -7336,16 +7687,36 @@
           <w:szCs w:val="22"/>
           <w:rtl/>
         </w:rPr>
-        <w:t xml:space="preserve">مرحله‌ی الف — موج:</w:t>
-      </w:r>
-      <w:r>
-        <w:rPr>
-          <w:rFonts w:ascii="Tahoma" w:cs="Tahoma" w:hAnsi="Tahoma"/>
-          <w:sz w:val="22"/>
-          <w:szCs w:val="22"/>
-          <w:rtl/>
-        </w:rPr>
-        <w:t xml:space="preserve"> بالاترین High = سقف موج (H*). هر بار سقف جدید ثبت شود، کف پولبک از نو شروع می‌شود.</w:t>
+        <w:t xml:space="preserve">نوع ۱ و ۲ رنج:</w:t>
+      </w:r>
+      <w:r>
+        <w:rPr>
+          <w:rFonts w:ascii="Tahoma" w:cs="Tahoma" w:hAnsi="Tahoma"/>
+          <w:sz w:val="22"/>
+          <w:szCs w:val="22"/>
+          <w:rtl/>
+        </w:rPr>
+        <w:t xml:space="preserve"> کد نوع کندل مرجع را </w:t>
+      </w:r>
+      <w:r>
+        <w:rPr>
+          <w:rFonts w:ascii="Tahoma" w:cs="Tahoma" w:hAnsi="Tahoma"/>
+          <w:b/>
+          <w:bCs/>
+          <w:sz w:val="22"/>
+          <w:szCs w:val="22"/>
+          <w:rtl/>
+        </w:rPr>
+        <w:t xml:space="preserve">اصلاً بررسی نمی‌کند</w:t>
+      </w:r>
+      <w:r>
+        <w:rPr>
+          <w:rFonts w:ascii="Tahoma" w:cs="Tahoma" w:hAnsi="Tahoma"/>
+          <w:sz w:val="22"/>
+          <w:szCs w:val="22"/>
+          <w:rtl/>
+        </w:rPr>
+        <w:t xml:space="preserve"> (نه ماروبوزوی ۶۰٪ به بالا، نه پین‌بار با بدنه‌ی کمتر از ۵۰٪). هر کندلی که Close دو کندل بعدی داخلش بماند، مرجع است.</w:t>
       </w:r>
     </w:p>
     <w:p>
@@ -7368,36 +7739,16 @@
           <w:szCs w:val="22"/>
           <w:rtl/>
         </w:rPr>
-        <w:t xml:space="preserve">مرحله‌ی ب — قفل:</w:t>
-      </w:r>
-      <w:r>
-        <w:rPr>
-          <w:rFonts w:ascii="Tahoma" w:cs="Tahoma" w:hAnsi="Tahoma"/>
-          <w:sz w:val="22"/>
-          <w:szCs w:val="22"/>
-          <w:rtl/>
-        </w:rPr>
-        <w:t xml:space="preserve"> یک پولبک حساب‌شده (بخش ۳-۳) سقف H* را قفل می‌کند. از این به بعد کد </w:t>
-      </w:r>
-      <w:r>
-        <w:rPr>
-          <w:rFonts w:ascii="Tahoma" w:cs="Tahoma" w:hAnsi="Tahoma"/>
-          <w:b/>
-          <w:bCs/>
-          <w:sz w:val="22"/>
-          <w:szCs w:val="22"/>
-          <w:rtl/>
-        </w:rPr>
-        <w:t xml:space="preserve">پایین‌ترین Low اصلاح</w:t>
-      </w:r>
-      <w:r>
-        <w:rPr>
-          <w:rFonts w:ascii="Tahoma" w:cs="Tahoma" w:hAnsi="Tahoma"/>
-          <w:sz w:val="22"/>
-          <w:szCs w:val="22"/>
-          <w:rtl/>
-        </w:rPr>
-        <w:t xml:space="preserve"> را دنبال می‌کند (این همان BOS آینده است).</w:t>
+        <w:t xml:space="preserve">پین‌بار:</w:t>
+      </w:r>
+      <w:r>
+        <w:rPr>
+          <w:rFonts w:ascii="Tahoma" w:cs="Tahoma" w:hAnsi="Tahoma"/>
+          <w:sz w:val="22"/>
+          <w:szCs w:val="22"/>
+          <w:rtl/>
+        </w:rPr>
+        <w:t xml:space="preserve"> از V18.0 یک تعریف واحد دارد (بخش ۱). تعریف «بدنه کمتر از ۵۰٪» در پرامپت رنج، در کد استفاده نمی‌شود.</w:t>
       </w:r>
     </w:p>
     <w:p>
@@ -7420,56 +7771,36 @@
           <w:szCs w:val="22"/>
           <w:rtl/>
         </w:rPr>
-        <w:t xml:space="preserve">حالت ۱ — تأیید:</w:t>
-      </w:r>
-      <w:r>
-        <w:rPr>
-          <w:rFonts w:ascii="Tahoma" w:cs="Tahoma" w:hAnsi="Tahoma"/>
-          <w:sz w:val="22"/>
-          <w:szCs w:val="22"/>
-          <w:rtl/>
-        </w:rPr>
-        <w:t xml:space="preserve"> شکست واقعی H* (یا سقف باکس FBO، اگر بیشتر از ۲ کندل عمر دارد) ← </w:t>
-      </w:r>
-      <w:r>
-        <w:rPr>
-          <w:rFonts w:ascii="Tahoma" w:cs="Tahoma" w:hAnsi="Tahoma"/>
-          <w:b/>
-          <w:bCs/>
-          <w:sz w:val="22"/>
-          <w:szCs w:val="22"/>
-          <w:rtl/>
-        </w:rPr>
-        <w:t xml:space="preserve">CTS = H</w:t>
-      </w:r>
-      <w:r>
-        <w:rPr>
-          <w:rFonts w:ascii="Tahoma" w:cs="Tahoma" w:hAnsi="Tahoma"/>
-          <w:sz w:val="22"/>
-          <w:szCs w:val="22"/>
-          <w:rtl/>
-        </w:rPr>
-        <w:t xml:space="preserve">*، </w:t>
-      </w:r>
-      <w:r>
-        <w:rPr>
-          <w:rFonts w:ascii="Tahoma" w:cs="Tahoma" w:hAnsi="Tahoma"/>
-          <w:b/>
-          <w:bCs/>
-          <w:sz w:val="22"/>
-          <w:szCs w:val="22"/>
-          <w:rtl/>
-        </w:rPr>
-        <w:t xml:space="preserve">BOS = پایین‌ترین Low اصلاح</w:t>
-      </w:r>
-      <w:r>
-        <w:rPr>
-          <w:rFonts w:ascii="Tahoma" w:cs="Tahoma" w:hAnsi="Tahoma"/>
-          <w:sz w:val="22"/>
-          <w:szCs w:val="22"/>
-          <w:rtl/>
-        </w:rPr>
-        <w:t xml:space="preserve">، برچسب و هشدار پولبک روی چارت می‌آید، و موج جدید از همین کندل شروع می‌شود.</w:t>
+        <w:t xml:space="preserve">نوع ۳:</w:t>
+      </w:r>
+      <w:r>
+        <w:rPr>
+          <w:rFonts w:ascii="Tahoma" w:cs="Tahoma" w:hAnsi="Tahoma"/>
+          <w:sz w:val="22"/>
+          <w:szCs w:val="22"/>
+          <w:rtl/>
+        </w:rPr>
+        <w:t xml:space="preserve"> «کندل خلاف جهت» نسبت به </w:t>
+      </w:r>
+      <w:r>
+        <w:rPr>
+          <w:rFonts w:ascii="Tahoma" w:cs="Tahoma" w:hAnsi="Tahoma"/>
+          <w:b/>
+          <w:bCs/>
+          <w:sz w:val="22"/>
+          <w:szCs w:val="22"/>
+          <w:rtl/>
+        </w:rPr>
+        <w:t xml:space="preserve">آخرین حرکت واقعی</w:t>
+      </w:r>
+      <w:r>
+        <w:rPr>
+          <w:rFonts w:ascii="Tahoma" w:cs="Tahoma" w:hAnsi="Tahoma"/>
+          <w:sz w:val="22"/>
+          <w:szCs w:val="22"/>
+          <w:rtl/>
+        </w:rPr>
+        <w:t xml:space="preserve"> (شکست رنج، CTS یا تغییر روند) سنجیده می‌شود، نه همیشه نسبت به روند اصلی.</w:t>
       </w:r>
     </w:p>
     <w:p>
@@ -7492,56 +7823,16 @@
           <w:szCs w:val="22"/>
           <w:rtl/>
         </w:rPr>
-        <w:t xml:space="preserve">حالت ۲ — اصلاح جدید (V17.9):</w:t>
-      </w:r>
-      <w:r>
-        <w:rPr>
-          <w:rFonts w:ascii="Tahoma" w:cs="Tahoma" w:hAnsi="Tahoma"/>
-          <w:sz w:val="22"/>
-          <w:szCs w:val="22"/>
-          <w:rtl/>
-        </w:rPr>
-        <w:t xml:space="preserve"> اگر در مرحله‌ی ب قیمت </w:t>
-      </w:r>
-      <w:r>
-        <w:rPr>
-          <w:rFonts w:ascii="Tahoma" w:cs="Tahoma" w:hAnsi="Tahoma"/>
-          <w:b/>
-          <w:bCs/>
-          <w:sz w:val="22"/>
-          <w:szCs w:val="22"/>
-          <w:rtl/>
-        </w:rPr>
-        <w:t xml:space="preserve">بدون شکست واقعی</w:t>
-      </w:r>
-      <w:r>
-        <w:rPr>
-          <w:rFonts w:ascii="Tahoma" w:cs="Tahoma" w:hAnsi="Tahoma"/>
-          <w:sz w:val="22"/>
-          <w:szCs w:val="22"/>
-          <w:rtl/>
-        </w:rPr>
-        <w:t xml:space="preserve"> بالای H* برود (بالاترین فیک یادداشت می‌شود) و بعد یک کندل </w:t>
-      </w:r>
-      <w:r>
-        <w:rPr>
-          <w:rFonts w:ascii="Tahoma" w:cs="Tahoma" w:hAnsi="Tahoma"/>
-          <w:b/>
-          <w:bCs/>
-          <w:sz w:val="22"/>
-          <w:szCs w:val="22"/>
-          <w:rtl/>
-        </w:rPr>
-        <w:t xml:space="preserve">Low زیر کف پولبک قبلی</w:t>
-      </w:r>
-      <w:r>
-        <w:rPr>
-          <w:rFonts w:ascii="Tahoma" w:cs="Tahoma" w:hAnsi="Tahoma"/>
-          <w:sz w:val="22"/>
-          <w:szCs w:val="22"/>
-          <w:rtl/>
-        </w:rPr>
-        <w:t xml:space="preserve"> بزند ← **H* = بالاترین فیک** و کف پولبک = Low همان کندل. قفل باقی می‌ماند و منتظر شکست واقعی H* جدید می‌مانیم.</w:t>
+        <w:t xml:space="preserve">سقف موج در نوع ۳</w:t>
+      </w:r>
+      <w:r>
+        <w:rPr>
+          <w:rFonts w:ascii="Tahoma" w:cs="Tahoma" w:hAnsi="Tahoma"/>
+          <w:sz w:val="22"/>
+          <w:szCs w:val="22"/>
+          <w:rtl/>
+        </w:rPr>
+        <w:t xml:space="preserve"> فقط برای این تصمیم است که «آیا کندل بعدی بالای سقف موج بسته شد یا نه». مرزهای باکس فقط از دو کندل خود باکس گرفته می‌شود.</w:t>
       </w:r>
     </w:p>
     <w:p>
@@ -7564,36 +7855,16 @@
           <w:szCs w:val="22"/>
           <w:rtl/>
         </w:rPr>
-        <w:t xml:space="preserve">تغییر روند:</w:t>
-      </w:r>
-      <w:r>
-        <w:rPr>
-          <w:rFonts w:ascii="Tahoma" w:cs="Tahoma" w:hAnsi="Tahoma"/>
-          <w:sz w:val="22"/>
-          <w:szCs w:val="22"/>
-          <w:rtl/>
-        </w:rPr>
-        <w:t xml:space="preserve"> شکست واقعی </w:t>
-      </w:r>
-      <w:r>
-        <w:rPr>
-          <w:rFonts w:ascii="Tahoma" w:cs="Tahoma" w:hAnsi="Tahoma"/>
-          <w:b/>
-          <w:bCs/>
-          <w:sz w:val="22"/>
-          <w:szCs w:val="22"/>
-          <w:rtl/>
-        </w:rPr>
-        <w:t xml:space="preserve">آخرین BOS</w:t>
-      </w:r>
-      <w:r>
-        <w:rPr>
-          <w:rFonts w:ascii="Tahoma" w:cs="Tahoma" w:hAnsi="Tahoma"/>
-          <w:sz w:val="22"/>
-          <w:szCs w:val="22"/>
-          <w:rtl/>
-        </w:rPr>
-        <w:t xml:space="preserve"> در جهت مخالف.</w:t>
+        <w:t xml:space="preserve">FBO</w:t>
+      </w:r>
+      <w:r>
+        <w:rPr>
+          <w:rFonts w:ascii="Tahoma" w:cs="Tahoma" w:hAnsi="Tahoma"/>
+          <w:sz w:val="22"/>
+          <w:szCs w:val="22"/>
+          <w:rtl/>
+        </w:rPr>
+        <w:t xml:space="preserve"> فقط بعد از پولبکِ قفل‌شده و در روند مشخص بررسی می‌شود. عبور از سقف در مرحله‌ی موج FBO نیست.</w:t>
       </w:r>
     </w:p>
     <w:p>
@@ -7616,16 +7887,16 @@
           <w:szCs w:val="22"/>
           <w:rtl/>
         </w:rPr>
-        <w:t xml:space="preserve">شروع چارت:</w:t>
-      </w:r>
-      <w:r>
-        <w:rPr>
-          <w:rFonts w:ascii="Tahoma" w:cs="Tahoma" w:hAnsi="Tahoma"/>
-          <w:sz w:val="22"/>
-          <w:szCs w:val="22"/>
-          <w:rtl/>
-        </w:rPr>
-        <w:t xml:space="preserve"> روند نامعلوم است؛ هر دو جهت دنبال می‌شوند و اولین چرخه‌ی کامل، روند را تعیین می‌کند.</w:t>
+        <w:t xml:space="preserve">زمان محاسبه:</w:t>
+      </w:r>
+      <w:r>
+        <w:rPr>
+          <w:rFonts w:ascii="Tahoma" w:cs="Tahoma" w:hAnsi="Tahoma"/>
+          <w:sz w:val="22"/>
+          <w:szCs w:val="22"/>
+          <w:rtl/>
+        </w:rPr>
+        <w:t xml:space="preserve"> ساختار (پولبک، CTS، BOS، FBO) فقط روی کندل بسته‌شده محاسبه می‌شود؛ رنج باکس روی هر کندل.</w:t>
       </w:r>
     </w:p>
     <w:p>
@@ -7648,52 +7919,36 @@
           <w:szCs w:val="22"/>
           <w:rtl/>
         </w:rPr>
-        <w:t xml:space="preserve">خط آبی موج جاری:</w:t>
-      </w:r>
-      <w:r>
-        <w:rPr>
-          <w:rFonts w:ascii="Tahoma" w:cs="Tahoma" w:hAnsi="Tahoma"/>
-          <w:sz w:val="22"/>
-          <w:szCs w:val="22"/>
-          <w:rtl/>
-        </w:rPr>
-        <w:t xml:space="preserve"> از آخرین BOS تا H* فعلی کشیده می‌شود (فقط برای نمایش).</w:t>
-      </w:r>
-    </w:p>
-    <w:p>
-      <w:pPr>
-        <w:pStyle w:val="Heading1"/>
-        <w:bidi/>
-        <w:spacing w:after="160" w:before="360"/>
-        <w:jc w:val="right"/>
-      </w:pPr>
-      <w:r>
-        <w:rPr>
-          <w:rFonts w:ascii="Tahoma" w:cs="Tahoma" w:hAnsi="Tahoma"/>
-          <w:b/>
-          <w:bCs/>
-          <w:color w:val="1F3864"/>
-          <w:sz w:val="32"/>
-          <w:szCs w:val="32"/>
-          <w:rtl/>
-        </w:rPr>
-        <w:t xml:space="preserve">۷) جاهایی که کد با پرامپت‌ها فرق دارد</w:t>
-      </w:r>
-    </w:p>
-    <w:p>
-      <w:pPr>
-        <w:bidi/>
-        <w:spacing w:after="120" w:line="320"/>
-        <w:jc w:val="both"/>
-      </w:pPr>
-      <w:r>
-        <w:rPr>
-          <w:rFonts w:ascii="Tahoma" w:cs="Tahoma" w:hAnsi="Tahoma"/>
-          <w:sz w:val="22"/>
-          <w:szCs w:val="22"/>
-          <w:rtl/>
-        </w:rPr>
-        <w:t xml:space="preserve">این موارد را عمداً جدا آورده‌ام چون احتمال اشتباه این‌جا بیشتر است. برای هر کدام بگویید «درست است» یا «باید این‌طور شود».</w:t>
+        <w:t xml:space="preserve">فهرست رنج‌های بسته‌شده:</w:t>
+      </w:r>
+      <w:r>
+        <w:rPr>
+          <w:rFonts w:ascii="Tahoma" w:cs="Tahoma" w:hAnsi="Tahoma"/>
+          <w:sz w:val="22"/>
+          <w:szCs w:val="22"/>
+          <w:rtl/>
+        </w:rPr>
+        <w:t xml:space="preserve"> در کد ثبت می‌شود ولی </w:t>
+      </w:r>
+      <w:r>
+        <w:rPr>
+          <w:rFonts w:ascii="Tahoma" w:cs="Tahoma" w:hAnsi="Tahoma"/>
+          <w:b/>
+          <w:bCs/>
+          <w:sz w:val="22"/>
+          <w:szCs w:val="22"/>
+          <w:rtl/>
+        </w:rPr>
+        <w:t xml:space="preserve">هیچ جا استفاده نمی‌شود</w:t>
+      </w:r>
+      <w:r>
+        <w:rPr>
+          <w:rFonts w:ascii="Tahoma" w:cs="Tahoma" w:hAnsi="Tahoma"/>
+          <w:sz w:val="22"/>
+          <w:szCs w:val="22"/>
+          <w:rtl/>
+        </w:rPr>
+        <w:t xml:space="preserve">. یعنی سطحی که داخل یک رنج بسته‌شده افتاده، از CTS یا BOS شدن منع نمی‌شود.</w:t>
       </w:r>
     </w:p>
     <w:p>
@@ -7701,291 +7956,7 @@
         <w:pStyle w:val="ListParagraph"/>
         <w:numPr>
           <w:ilvl w:val="0"/>
-          <w:numId w:val="10"/>
-        </w:numPr>
-        <w:bidi/>
-        <w:spacing w:after="80" w:line="300"/>
-        <w:jc w:val="both"/>
-      </w:pPr>
-      <w:r>
-        <w:rPr>
-          <w:rFonts w:ascii="Tahoma" w:cs="Tahoma" w:hAnsi="Tahoma"/>
-          <w:b/>
-          <w:bCs/>
-          <w:sz w:val="22"/>
-          <w:szCs w:val="22"/>
-          <w:rtl/>
-        </w:rPr>
-        <w:t xml:space="preserve">نوع ۱ و ۲ رنج:</w:t>
-      </w:r>
-      <w:r>
-        <w:rPr>
-          <w:rFonts w:ascii="Tahoma" w:cs="Tahoma" w:hAnsi="Tahoma"/>
-          <w:sz w:val="22"/>
-          <w:szCs w:val="22"/>
-          <w:rtl/>
-        </w:rPr>
-        <w:t xml:space="preserve"> کد نوع کندل مرجع را </w:t>
-      </w:r>
-      <w:r>
-        <w:rPr>
-          <w:rFonts w:ascii="Tahoma" w:cs="Tahoma" w:hAnsi="Tahoma"/>
-          <w:b/>
-          <w:bCs/>
-          <w:sz w:val="22"/>
-          <w:szCs w:val="22"/>
-          <w:rtl/>
-        </w:rPr>
-        <w:t xml:space="preserve">اصلاً بررسی نمی‌کند</w:t>
-      </w:r>
-      <w:r>
-        <w:rPr>
-          <w:rFonts w:ascii="Tahoma" w:cs="Tahoma" w:hAnsi="Tahoma"/>
-          <w:sz w:val="22"/>
-          <w:szCs w:val="22"/>
-          <w:rtl/>
-        </w:rPr>
-        <w:t xml:space="preserve"> (نه ماروبوزوی ۶۰٪ به بالا، نه پین‌بار با بدنه‌ی کمتر از ۵۰٪). هر کندلی که Close دو کندل بعدی داخلش بماند، مرجع است.</w:t>
-      </w:r>
-    </w:p>
-    <w:p>
-      <w:pPr>
-        <w:pStyle w:val="ListParagraph"/>
-        <w:numPr>
-          <w:ilvl w:val="0"/>
-          <w:numId w:val="10"/>
-        </w:numPr>
-        <w:bidi/>
-        <w:spacing w:after="80" w:line="300"/>
-        <w:jc w:val="both"/>
-      </w:pPr>
-      <w:r>
-        <w:rPr>
-          <w:rFonts w:ascii="Tahoma" w:cs="Tahoma" w:hAnsi="Tahoma"/>
-          <w:b/>
-          <w:bCs/>
-          <w:sz w:val="22"/>
-          <w:szCs w:val="22"/>
-          <w:rtl/>
-        </w:rPr>
-        <w:t xml:space="preserve">پین‌بار:</w:t>
-      </w:r>
-      <w:r>
-        <w:rPr>
-          <w:rFonts w:ascii="Tahoma" w:cs="Tahoma" w:hAnsi="Tahoma"/>
-          <w:sz w:val="22"/>
-          <w:szCs w:val="22"/>
-          <w:rtl/>
-        </w:rPr>
-        <w:t xml:space="preserve"> از V18.0 یک تعریف واحد دارد (بخش ۱). تعریف «بدنه کمتر از ۵۰٪» در پرامپت رنج، در کد استفاده نمی‌شود.</w:t>
-      </w:r>
-    </w:p>
-    <w:p>
-      <w:pPr>
-        <w:pStyle w:val="ListParagraph"/>
-        <w:numPr>
-          <w:ilvl w:val="0"/>
-          <w:numId w:val="10"/>
-        </w:numPr>
-        <w:bidi/>
-        <w:spacing w:after="80" w:line="300"/>
-        <w:jc w:val="both"/>
-      </w:pPr>
-      <w:r>
-        <w:rPr>
-          <w:rFonts w:ascii="Tahoma" w:cs="Tahoma" w:hAnsi="Tahoma"/>
-          <w:b/>
-          <w:bCs/>
-          <w:sz w:val="22"/>
-          <w:szCs w:val="22"/>
-          <w:rtl/>
-        </w:rPr>
-        <w:t xml:space="preserve">نوع ۳:</w:t>
-      </w:r>
-      <w:r>
-        <w:rPr>
-          <w:rFonts w:ascii="Tahoma" w:cs="Tahoma" w:hAnsi="Tahoma"/>
-          <w:sz w:val="22"/>
-          <w:szCs w:val="22"/>
-          <w:rtl/>
-        </w:rPr>
-        <w:t xml:space="preserve"> «کندل خلاف جهت» نسبت به </w:t>
-      </w:r>
-      <w:r>
-        <w:rPr>
-          <w:rFonts w:ascii="Tahoma" w:cs="Tahoma" w:hAnsi="Tahoma"/>
-          <w:b/>
-          <w:bCs/>
-          <w:sz w:val="22"/>
-          <w:szCs w:val="22"/>
-          <w:rtl/>
-        </w:rPr>
-        <w:t xml:space="preserve">آخرین حرکت واقعی</w:t>
-      </w:r>
-      <w:r>
-        <w:rPr>
-          <w:rFonts w:ascii="Tahoma" w:cs="Tahoma" w:hAnsi="Tahoma"/>
-          <w:sz w:val="22"/>
-          <w:szCs w:val="22"/>
-          <w:rtl/>
-        </w:rPr>
-        <w:t xml:space="preserve"> (شکست رنج، CTS یا تغییر روند) سنجیده می‌شود، نه همیشه نسبت به روند اصلی.</w:t>
-      </w:r>
-    </w:p>
-    <w:p>
-      <w:pPr>
-        <w:pStyle w:val="ListParagraph"/>
-        <w:numPr>
-          <w:ilvl w:val="0"/>
-          <w:numId w:val="10"/>
-        </w:numPr>
-        <w:bidi/>
-        <w:spacing w:after="80" w:line="300"/>
-        <w:jc w:val="both"/>
-      </w:pPr>
-      <w:r>
-        <w:rPr>
-          <w:rFonts w:ascii="Tahoma" w:cs="Tahoma" w:hAnsi="Tahoma"/>
-          <w:b/>
-          <w:bCs/>
-          <w:sz w:val="22"/>
-          <w:szCs w:val="22"/>
-          <w:rtl/>
-        </w:rPr>
-        <w:t xml:space="preserve">سقف موج در نوع ۳</w:t>
-      </w:r>
-      <w:r>
-        <w:rPr>
-          <w:rFonts w:ascii="Tahoma" w:cs="Tahoma" w:hAnsi="Tahoma"/>
-          <w:sz w:val="22"/>
-          <w:szCs w:val="22"/>
-          <w:rtl/>
-        </w:rPr>
-        <w:t xml:space="preserve"> فقط برای این تصمیم است که «آیا کندل بعدی بالای سقف موج بسته شد یا نه». مرزهای باکس فقط از دو کندل خود باکس گرفته می‌شود.</w:t>
-      </w:r>
-    </w:p>
-    <w:p>
-      <w:pPr>
-        <w:pStyle w:val="ListParagraph"/>
-        <w:numPr>
-          <w:ilvl w:val="0"/>
-          <w:numId w:val="10"/>
-        </w:numPr>
-        <w:bidi/>
-        <w:spacing w:after="80" w:line="300"/>
-        <w:jc w:val="both"/>
-      </w:pPr>
-      <w:r>
-        <w:rPr>
-          <w:rFonts w:ascii="Tahoma" w:cs="Tahoma" w:hAnsi="Tahoma"/>
-          <w:b/>
-          <w:bCs/>
-          <w:sz w:val="22"/>
-          <w:szCs w:val="22"/>
-          <w:rtl/>
-        </w:rPr>
-        <w:t xml:space="preserve">FBO</w:t>
-      </w:r>
-      <w:r>
-        <w:rPr>
-          <w:rFonts w:ascii="Tahoma" w:cs="Tahoma" w:hAnsi="Tahoma"/>
-          <w:sz w:val="22"/>
-          <w:szCs w:val="22"/>
-          <w:rtl/>
-        </w:rPr>
-        <w:t xml:space="preserve"> فقط بعد از پولبکِ قفل‌شده و در روند مشخص بررسی می‌شود. عبور از سقف در مرحله‌ی موج FBO نیست.</w:t>
-      </w:r>
-    </w:p>
-    <w:p>
-      <w:pPr>
-        <w:pStyle w:val="ListParagraph"/>
-        <w:numPr>
-          <w:ilvl w:val="0"/>
-          <w:numId w:val="10"/>
-        </w:numPr>
-        <w:bidi/>
-        <w:spacing w:after="80" w:line="300"/>
-        <w:jc w:val="both"/>
-      </w:pPr>
-      <w:r>
-        <w:rPr>
-          <w:rFonts w:ascii="Tahoma" w:cs="Tahoma" w:hAnsi="Tahoma"/>
-          <w:b/>
-          <w:bCs/>
-          <w:sz w:val="22"/>
-          <w:szCs w:val="22"/>
-          <w:rtl/>
-        </w:rPr>
-        <w:t xml:space="preserve">زمان محاسبه:</w:t>
-      </w:r>
-      <w:r>
-        <w:rPr>
-          <w:rFonts w:ascii="Tahoma" w:cs="Tahoma" w:hAnsi="Tahoma"/>
-          <w:sz w:val="22"/>
-          <w:szCs w:val="22"/>
-          <w:rtl/>
-        </w:rPr>
-        <w:t xml:space="preserve"> ساختار (پولبک، CTS، BOS، FBO) فقط روی کندل بسته‌شده محاسبه می‌شود؛ رنج باکس روی هر کندل.</w:t>
-      </w:r>
-    </w:p>
-    <w:p>
-      <w:pPr>
-        <w:pStyle w:val="ListParagraph"/>
-        <w:numPr>
-          <w:ilvl w:val="0"/>
-          <w:numId w:val="10"/>
-        </w:numPr>
-        <w:bidi/>
-        <w:spacing w:after="80" w:line="300"/>
-        <w:jc w:val="both"/>
-      </w:pPr>
-      <w:r>
-        <w:rPr>
-          <w:rFonts w:ascii="Tahoma" w:cs="Tahoma" w:hAnsi="Tahoma"/>
-          <w:b/>
-          <w:bCs/>
-          <w:sz w:val="22"/>
-          <w:szCs w:val="22"/>
-          <w:rtl/>
-        </w:rPr>
-        <w:t xml:space="preserve">فهرست رنج‌های بسته‌شده:</w:t>
-      </w:r>
-      <w:r>
-        <w:rPr>
-          <w:rFonts w:ascii="Tahoma" w:cs="Tahoma" w:hAnsi="Tahoma"/>
-          <w:sz w:val="22"/>
-          <w:szCs w:val="22"/>
-          <w:rtl/>
-        </w:rPr>
-        <w:t xml:space="preserve"> در کد ثبت می‌شود ولی </w:t>
-      </w:r>
-      <w:r>
-        <w:rPr>
-          <w:rFonts w:ascii="Tahoma" w:cs="Tahoma" w:hAnsi="Tahoma"/>
-          <w:b/>
-          <w:bCs/>
-          <w:sz w:val="22"/>
-          <w:szCs w:val="22"/>
-          <w:rtl/>
-        </w:rPr>
-        <w:t xml:space="preserve">هیچ جا استفاده نمی‌شود</w:t>
-      </w:r>
-      <w:r>
-        <w:rPr>
-          <w:rFonts w:ascii="Tahoma" w:cs="Tahoma" w:hAnsi="Tahoma"/>
-          <w:sz w:val="22"/>
-          <w:szCs w:val="22"/>
-          <w:rtl/>
-        </w:rPr>
-        <w:t xml:space="preserve">. یعنی سطحی که داخل یک رنج بسته‌شده افتاده، از CTS یا BOS شدن منع نمی‌شود.</w:t>
-      </w:r>
-    </w:p>
-    <w:p>
-      <w:pPr>
-        <w:pStyle w:val="ListParagraph"/>
-        <w:numPr>
-          <w:ilvl w:val="0"/>
-          <w:numId w:val="10"/>
+          <w:numId w:val="9"/>
         </w:numPr>
         <w:bidi/>
         <w:spacing w:after="80" w:line="300"/>
@@ -8286,12 +8257,6 @@
     </w:lvlOverride>
   </w:num>
   <w:num w:numId="9">
-    <w:abstractNumId w:val="3"/>
-    <w:lvlOverride w:ilvl="0">
-      <w:startOverride w:val="1"/>
-    </w:lvlOverride>
-  </w:num>
-  <w:num w:numId="10">
     <w:abstractNumId w:val="3"/>
     <w:lvlOverride w:ilvl="0">
       <w:startOverride w:val="1"/>

</xml_diff>